<commit_message>
Completed DAO w/ Trino
</commit_message>
<xml_diff>
--- a/doc/development/HPCDATAMGM-2088 - External Archive Auto-Tiering.docx
+++ b/doc/development/HPCDATAMGM-2088 - External Archive Auto-Tiering.docx
@@ -3381,13 +3381,6 @@
     <w:p>
       <w:pPr>
         <w:ind w:left="576"/>
-        <w:rPr>
-          <w:rFonts w:ascii="Courier New" w:hAnsi="Courier New" w:cs="Courier New"/>
-          <w:color w:val="3B2322"/>
-          <w:kern w:val="0"/>
-          <w:sz w:val="24"/>
-          <w:szCs w:val="24"/>
-        </w:rPr>
       </w:pPr>
       <w:r>
         <w:rPr>
@@ -3411,6 +3404,28 @@
         </w:rPr>
         <w:t xml:space="preserve"> </w:t>
       </w:r>
+      <w:r>
+        <w:rPr>
+          <w:rFonts w:ascii="Courier-Bold" w:hAnsi="Courier-Bold" w:cs="Courier-Bold"/>
+          <w:b/>
+          <w:bCs/>
+          <w:color w:val="802A19"/>
+          <w:kern w:val="0"/>
+          <w:sz w:val="24"/>
+          <w:szCs w:val="24"/>
+        </w:rPr>
+        <w:t>replace</w:t>
+      </w:r>
+      <w:r>
+        <w:rPr>
+          <w:rFonts w:ascii="Courier New" w:hAnsi="Courier New" w:cs="Courier New"/>
+          <w:color w:val="3B2322"/>
+          <w:kern w:val="0"/>
+          <w:sz w:val="24"/>
+          <w:szCs w:val="24"/>
+        </w:rPr>
+        <w:t>(</w:t>
+      </w:r>
       <w:proofErr w:type="spellStart"/>
       <w:r>
         <w:rPr>
@@ -3431,7 +3446,47 @@
           <w:sz w:val="24"/>
           <w:szCs w:val="24"/>
         </w:rPr>
-        <w:t xml:space="preserve"> || name </w:t>
+        <w:t xml:space="preserve">, </w:t>
+      </w:r>
+      <w:r>
+        <w:rPr>
+          <w:rFonts w:ascii="Courier New" w:hAnsi="Courier New" w:cs="Courier New"/>
+          <w:color w:val="149802"/>
+          <w:kern w:val="0"/>
+          <w:sz w:val="24"/>
+          <w:szCs w:val="24"/>
+        </w:rPr>
+        <w:t>'/CBIIT/DMAP/DMEDataStage2/AUTO-TIERING'</w:t>
+      </w:r>
+      <w:r>
+        <w:rPr>
+          <w:rFonts w:ascii="Courier New" w:hAnsi="Courier New" w:cs="Courier New"/>
+          <w:color w:val="3B2322"/>
+          <w:kern w:val="0"/>
+          <w:sz w:val="24"/>
+          <w:szCs w:val="24"/>
+        </w:rPr>
+        <w:t xml:space="preserve">, </w:t>
+      </w:r>
+      <w:r>
+        <w:rPr>
+          <w:rFonts w:ascii="Courier New" w:hAnsi="Courier New" w:cs="Courier New"/>
+          <w:color w:val="149802"/>
+          <w:kern w:val="0"/>
+          <w:sz w:val="24"/>
+          <w:szCs w:val="24"/>
+        </w:rPr>
+        <w:t>''</w:t>
+      </w:r>
+      <w:r>
+        <w:rPr>
+          <w:rFonts w:ascii="Courier New" w:hAnsi="Courier New" w:cs="Courier New"/>
+          <w:color w:val="3B2322"/>
+          <w:kern w:val="0"/>
+          <w:sz w:val="24"/>
+          <w:szCs w:val="24"/>
+        </w:rPr>
+        <w:t xml:space="preserve">) || name </w:t>
       </w:r>
       <w:r>
         <w:rPr>
@@ -3475,200 +3530,6 @@
           <w:sz w:val="24"/>
           <w:szCs w:val="24"/>
         </w:rPr>
-        <w:t xml:space="preserve">, </w:t>
-      </w:r>
-      <w:proofErr w:type="spellStart"/>
-      <w:r>
-        <w:rPr>
-          <w:rFonts w:ascii="Courier New" w:hAnsi="Courier New" w:cs="Courier New"/>
-          <w:color w:val="3B2322"/>
-          <w:kern w:val="0"/>
-          <w:sz w:val="24"/>
-          <w:szCs w:val="24"/>
-        </w:rPr>
-        <w:t>at_timezone</w:t>
-      </w:r>
-      <w:proofErr w:type="spellEnd"/>
-      <w:r>
-        <w:rPr>
-          <w:rFonts w:ascii="Courier New" w:hAnsi="Courier New" w:cs="Courier New"/>
-          <w:color w:val="3B2322"/>
-          <w:kern w:val="0"/>
-          <w:sz w:val="24"/>
-          <w:szCs w:val="24"/>
-        </w:rPr>
-        <w:t>(</w:t>
-      </w:r>
-      <w:proofErr w:type="spellStart"/>
-      <w:r>
-        <w:rPr>
-          <w:rFonts w:ascii="Courier New" w:hAnsi="Courier New" w:cs="Courier New"/>
-          <w:color w:val="3B2322"/>
-          <w:kern w:val="0"/>
-          <w:sz w:val="24"/>
-          <w:szCs w:val="24"/>
-        </w:rPr>
-        <w:t>with_timezone</w:t>
-      </w:r>
-      <w:proofErr w:type="spellEnd"/>
-      <w:r>
-        <w:rPr>
-          <w:rFonts w:ascii="Courier New" w:hAnsi="Courier New" w:cs="Courier New"/>
-          <w:color w:val="3B2322"/>
-          <w:kern w:val="0"/>
-          <w:sz w:val="24"/>
-          <w:szCs w:val="24"/>
-        </w:rPr>
-        <w:t>(</w:t>
-      </w:r>
-      <w:proofErr w:type="spellStart"/>
-      <w:r>
-        <w:rPr>
-          <w:rFonts w:ascii="Courier New" w:hAnsi="Courier New" w:cs="Courier New"/>
-          <w:color w:val="3B2322"/>
-          <w:kern w:val="0"/>
-          <w:sz w:val="24"/>
-          <w:szCs w:val="24"/>
-        </w:rPr>
-        <w:t>atime</w:t>
-      </w:r>
-      <w:proofErr w:type="spellEnd"/>
-      <w:r>
-        <w:rPr>
-          <w:rFonts w:ascii="Courier New" w:hAnsi="Courier New" w:cs="Courier New"/>
-          <w:color w:val="3B2322"/>
-          <w:kern w:val="0"/>
-          <w:sz w:val="24"/>
-          <w:szCs w:val="24"/>
-        </w:rPr>
-        <w:t xml:space="preserve">, </w:t>
-      </w:r>
-      <w:r>
-        <w:rPr>
-          <w:rFonts w:ascii="Courier New" w:hAnsi="Courier New" w:cs="Courier New"/>
-          <w:color w:val="149802"/>
-          <w:kern w:val="0"/>
-          <w:sz w:val="24"/>
-          <w:szCs w:val="24"/>
-        </w:rPr>
-        <w:t>'UTC'</w:t>
-      </w:r>
-      <w:r>
-        <w:rPr>
-          <w:rFonts w:ascii="Courier New" w:hAnsi="Courier New" w:cs="Courier New"/>
-          <w:color w:val="3B2322"/>
-          <w:kern w:val="0"/>
-          <w:sz w:val="24"/>
-          <w:szCs w:val="24"/>
-        </w:rPr>
-        <w:t xml:space="preserve">), </w:t>
-      </w:r>
-      <w:r>
-        <w:rPr>
-          <w:rFonts w:ascii="Courier New" w:hAnsi="Courier New" w:cs="Courier New"/>
-          <w:color w:val="149802"/>
-          <w:kern w:val="0"/>
-          <w:sz w:val="24"/>
-          <w:szCs w:val="24"/>
-        </w:rPr>
-        <w:t>'America/</w:t>
-      </w:r>
-      <w:proofErr w:type="spellStart"/>
-      <w:r>
-        <w:rPr>
-          <w:rFonts w:ascii="Courier New" w:hAnsi="Courier New" w:cs="Courier New"/>
-          <w:color w:val="149802"/>
-          <w:kern w:val="0"/>
-          <w:sz w:val="24"/>
-          <w:szCs w:val="24"/>
-        </w:rPr>
-        <w:t>New_York</w:t>
-      </w:r>
-      <w:proofErr w:type="spellEnd"/>
-      <w:r>
-        <w:rPr>
-          <w:rFonts w:ascii="Courier New" w:hAnsi="Courier New" w:cs="Courier New"/>
-          <w:color w:val="149802"/>
-          <w:kern w:val="0"/>
-          <w:sz w:val="24"/>
-          <w:szCs w:val="24"/>
-        </w:rPr>
-        <w:t>'</w:t>
-      </w:r>
-      <w:r>
-        <w:rPr>
-          <w:rFonts w:ascii="Courier New" w:hAnsi="Courier New" w:cs="Courier New"/>
-          <w:color w:val="3B2322"/>
-          <w:kern w:val="0"/>
-          <w:sz w:val="24"/>
-          <w:szCs w:val="24"/>
-        </w:rPr>
-        <w:t xml:space="preserve">) </w:t>
-      </w:r>
-      <w:r>
-        <w:rPr>
-          <w:rFonts w:ascii="Courier-Bold" w:hAnsi="Courier-Bold" w:cs="Courier-Bold"/>
-          <w:b/>
-          <w:bCs/>
-          <w:color w:val="802A19"/>
-          <w:kern w:val="0"/>
-          <w:sz w:val="24"/>
-          <w:szCs w:val="24"/>
-        </w:rPr>
-        <w:t>as</w:t>
-      </w:r>
-      <w:r>
-        <w:rPr>
-          <w:rFonts w:ascii="Courier New" w:hAnsi="Courier New" w:cs="Courier New"/>
-          <w:color w:val="3B2322"/>
-          <w:kern w:val="0"/>
-          <w:sz w:val="24"/>
-          <w:szCs w:val="24"/>
-        </w:rPr>
-        <w:t xml:space="preserve"> </w:t>
-      </w:r>
-      <w:proofErr w:type="spellStart"/>
-      <w:r>
-        <w:rPr>
-          <w:rFonts w:ascii="Courier New" w:hAnsi="Courier New" w:cs="Courier New"/>
-          <w:color w:val="3B2322"/>
-          <w:kern w:val="0"/>
-          <w:sz w:val="24"/>
-          <w:szCs w:val="24"/>
-        </w:rPr>
-        <w:t>atime_est</w:t>
-      </w:r>
-      <w:proofErr w:type="spellEnd"/>
-      <w:r>
-        <w:rPr>
-          <w:rFonts w:ascii="Courier New" w:hAnsi="Courier New" w:cs="Courier New"/>
-          <w:color w:val="3B2322"/>
-          <w:kern w:val="0"/>
-          <w:sz w:val="24"/>
-          <w:szCs w:val="24"/>
-        </w:rPr>
-        <w:t xml:space="preserve">, </w:t>
-      </w:r>
-      <w:proofErr w:type="spellStart"/>
-      <w:r>
-        <w:rPr>
-          <w:rFonts w:ascii="Courier New" w:hAnsi="Courier New" w:cs="Courier New"/>
-          <w:color w:val="3B2322"/>
-          <w:kern w:val="0"/>
-          <w:sz w:val="24"/>
-          <w:szCs w:val="24"/>
-        </w:rPr>
-        <w:t>element_type</w:t>
-      </w:r>
-      <w:proofErr w:type="spellEnd"/>
-      <w:r>
-        <w:rPr>
-          <w:rFonts w:ascii="Courier New" w:hAnsi="Courier New" w:cs="Courier New"/>
-          <w:color w:val="3B2322"/>
-          <w:kern w:val="0"/>
-          <w:sz w:val="24"/>
-          <w:szCs w:val="24"/>
-        </w:rPr>
         <w:t xml:space="preserve"> </w:t>
       </w:r>
       <w:r>
@@ -3724,6 +3585,222 @@
           <w:sz w:val="24"/>
           <w:szCs w:val="24"/>
         </w:rPr>
+        <w:t>element_type</w:t>
+      </w:r>
+      <w:proofErr w:type="spellEnd"/>
+      <w:r>
+        <w:rPr>
+          <w:rFonts w:ascii="Courier New" w:hAnsi="Courier New" w:cs="Courier New"/>
+          <w:color w:val="3B2322"/>
+          <w:kern w:val="0"/>
+          <w:sz w:val="24"/>
+          <w:szCs w:val="24"/>
+        </w:rPr>
+        <w:t xml:space="preserve"> = </w:t>
+      </w:r>
+      <w:r>
+        <w:rPr>
+          <w:rFonts w:ascii="Courier New" w:hAnsi="Courier New" w:cs="Courier New"/>
+          <w:color w:val="149802"/>
+          <w:kern w:val="0"/>
+          <w:sz w:val="24"/>
+          <w:szCs w:val="24"/>
+        </w:rPr>
+        <w:t>'FILE'</w:t>
+      </w:r>
+      <w:r>
+        <w:rPr>
+          <w:rFonts w:ascii="Courier New" w:hAnsi="Courier New" w:cs="Courier New"/>
+          <w:color w:val="3B2322"/>
+          <w:kern w:val="0"/>
+          <w:sz w:val="24"/>
+          <w:szCs w:val="24"/>
+        </w:rPr>
+        <w:t xml:space="preserve"> </w:t>
+      </w:r>
+      <w:r>
+        <w:rPr>
+          <w:rFonts w:ascii="Courier-Bold" w:hAnsi="Courier-Bold" w:cs="Courier-Bold"/>
+          <w:b/>
+          <w:bCs/>
+          <w:color w:val="802A19"/>
+          <w:kern w:val="0"/>
+          <w:sz w:val="24"/>
+          <w:szCs w:val="24"/>
+        </w:rPr>
+        <w:t>and</w:t>
+      </w:r>
+      <w:r>
+        <w:rPr>
+          <w:rFonts w:ascii="Courier New" w:hAnsi="Courier New" w:cs="Courier New"/>
+          <w:color w:val="3B2322"/>
+          <w:kern w:val="0"/>
+          <w:sz w:val="24"/>
+          <w:szCs w:val="24"/>
+        </w:rPr>
+        <w:t xml:space="preserve"> </w:t>
+      </w:r>
+      <w:proofErr w:type="spellStart"/>
+      <w:r>
+        <w:rPr>
+          <w:rFonts w:ascii="Courier New" w:hAnsi="Courier New" w:cs="Courier New"/>
+          <w:color w:val="3B2322"/>
+          <w:kern w:val="0"/>
+          <w:sz w:val="24"/>
+          <w:szCs w:val="24"/>
+        </w:rPr>
+        <w:t>atime</w:t>
+      </w:r>
+      <w:proofErr w:type="spellEnd"/>
+      <w:r>
+        <w:rPr>
+          <w:rFonts w:ascii="Courier New" w:hAnsi="Courier New" w:cs="Courier New"/>
+          <w:color w:val="3B2322"/>
+          <w:kern w:val="0"/>
+          <w:sz w:val="24"/>
+          <w:szCs w:val="24"/>
+        </w:rPr>
+        <w:t xml:space="preserve"> &lt; </w:t>
+      </w:r>
+      <w:proofErr w:type="spellStart"/>
+      <w:r>
+        <w:rPr>
+          <w:rFonts w:ascii="Courier-Bold" w:hAnsi="Courier-Bold" w:cs="Courier-Bold"/>
+          <w:b/>
+          <w:bCs/>
+          <w:color w:val="802A19"/>
+          <w:kern w:val="0"/>
+          <w:sz w:val="24"/>
+          <w:szCs w:val="24"/>
+        </w:rPr>
+        <w:t>current_timestamp</w:t>
+      </w:r>
+      <w:proofErr w:type="spellEnd"/>
+      <w:r>
+        <w:rPr>
+          <w:rFonts w:ascii="Courier New" w:hAnsi="Courier New" w:cs="Courier New"/>
+          <w:color w:val="3B2322"/>
+          <w:kern w:val="0"/>
+          <w:sz w:val="24"/>
+          <w:szCs w:val="24"/>
+        </w:rPr>
+        <w:t xml:space="preserve"> - </w:t>
+      </w:r>
+      <w:r>
+        <w:rPr>
+          <w:rFonts w:ascii="Courier-Bold" w:hAnsi="Courier-Bold" w:cs="Courier-Bold"/>
+          <w:b/>
+          <w:bCs/>
+          <w:color w:val="802A19"/>
+          <w:kern w:val="0"/>
+          <w:sz w:val="24"/>
+          <w:szCs w:val="24"/>
+        </w:rPr>
+        <w:t>INTERVAL</w:t>
+      </w:r>
+      <w:r>
+        <w:rPr>
+          <w:rFonts w:ascii="Courier New" w:hAnsi="Courier New" w:cs="Courier New"/>
+          <w:color w:val="3B2322"/>
+          <w:kern w:val="0"/>
+          <w:sz w:val="24"/>
+          <w:szCs w:val="24"/>
+        </w:rPr>
+        <w:t xml:space="preserve"> </w:t>
+      </w:r>
+      <w:r>
+        <w:rPr>
+          <w:rFonts w:ascii="Courier New" w:hAnsi="Courier New" w:cs="Courier New"/>
+          <w:color w:val="149802"/>
+          <w:kern w:val="0"/>
+          <w:sz w:val="24"/>
+          <w:szCs w:val="24"/>
+        </w:rPr>
+        <w:t>'</w:t>
+      </w:r>
+      <w:r>
+        <w:rPr>
+          <w:rFonts w:ascii="Courier New" w:hAnsi="Courier New" w:cs="Courier New"/>
+          <w:color w:val="149802"/>
+          <w:kern w:val="0"/>
+          <w:sz w:val="24"/>
+          <w:szCs w:val="24"/>
+        </w:rPr>
+        <w:t>6</w:t>
+      </w:r>
+      <w:r>
+        <w:rPr>
+          <w:rFonts w:ascii="Courier New" w:hAnsi="Courier New" w:cs="Courier New"/>
+          <w:color w:val="149802"/>
+          <w:kern w:val="0"/>
+          <w:sz w:val="24"/>
+          <w:szCs w:val="24"/>
+        </w:rPr>
+        <w:t>'</w:t>
+      </w:r>
+      <w:r>
+        <w:rPr>
+          <w:rFonts w:ascii="Courier New" w:hAnsi="Courier New" w:cs="Courier New"/>
+          <w:color w:val="3B2322"/>
+          <w:kern w:val="0"/>
+          <w:sz w:val="24"/>
+          <w:szCs w:val="24"/>
+        </w:rPr>
+        <w:t xml:space="preserve"> </w:t>
+      </w:r>
+      <w:r>
+        <w:rPr>
+          <w:rFonts w:ascii="Courier-Bold" w:hAnsi="Courier-Bold" w:cs="Courier-Bold"/>
+          <w:b/>
+          <w:bCs/>
+          <w:color w:val="802A19"/>
+          <w:kern w:val="0"/>
+          <w:sz w:val="24"/>
+          <w:szCs w:val="24"/>
+        </w:rPr>
+        <w:t>MONTH</w:t>
+      </w:r>
+      <w:r>
+        <w:rPr>
+          <w:rFonts w:ascii="Courier New" w:hAnsi="Courier New" w:cs="Courier New"/>
+          <w:color w:val="3B2322"/>
+          <w:kern w:val="0"/>
+          <w:sz w:val="24"/>
+          <w:szCs w:val="24"/>
+        </w:rPr>
+        <w:t xml:space="preserve"> </w:t>
+      </w:r>
+      <w:r>
+        <w:rPr>
+          <w:rFonts w:ascii="Courier-Bold" w:hAnsi="Courier-Bold" w:cs="Courier-Bold"/>
+          <w:b/>
+          <w:bCs/>
+          <w:color w:val="802A19"/>
+          <w:kern w:val="0"/>
+          <w:sz w:val="24"/>
+          <w:szCs w:val="24"/>
+        </w:rPr>
+        <w:t>and</w:t>
+      </w:r>
+      <w:r>
+        <w:rPr>
+          <w:rFonts w:ascii="Courier New" w:hAnsi="Courier New" w:cs="Courier New"/>
+          <w:color w:val="3B2322"/>
+          <w:kern w:val="0"/>
+          <w:sz w:val="24"/>
+          <w:szCs w:val="24"/>
+        </w:rPr>
+        <w:t xml:space="preserve"> </w:t>
+      </w:r>
+      <w:proofErr w:type="spellStart"/>
+      <w:r>
+        <w:rPr>
+          <w:rFonts w:ascii="Courier New" w:hAnsi="Courier New" w:cs="Courier New"/>
+          <w:color w:val="3B2322"/>
+          <w:kern w:val="0"/>
+          <w:sz w:val="24"/>
+          <w:szCs w:val="24"/>
+        </w:rPr>
         <w:t>search_path</w:t>
       </w:r>
       <w:proofErr w:type="spellEnd"/>
@@ -3767,7 +3844,7 @@
           <w:sz w:val="24"/>
           <w:szCs w:val="24"/>
         </w:rPr>
-        <w:t>'&lt;external-search-path&gt;'</w:t>
+        <w:t>'/CBIIT/DMAP/DMEDataStage2/AUTO-TIERING'</w:t>
       </w:r>
       <w:r>
         <w:rPr>
@@ -3799,49 +3876,7 @@
           <w:sz w:val="24"/>
           <w:szCs w:val="24"/>
         </w:rPr>
-        <w:t xml:space="preserve"> </w:t>
-      </w:r>
-      <w:proofErr w:type="spellStart"/>
-      <w:r>
-        <w:rPr>
-          <w:rFonts w:ascii="Courier New" w:hAnsi="Courier New" w:cs="Courier New"/>
-          <w:color w:val="3B2322"/>
-          <w:kern w:val="0"/>
-          <w:sz w:val="24"/>
-          <w:szCs w:val="24"/>
-        </w:rPr>
-        <w:t>element_type</w:t>
-      </w:r>
-      <w:proofErr w:type="spellEnd"/>
-      <w:r>
-        <w:rPr>
-          <w:rFonts w:ascii="Courier New" w:hAnsi="Courier New" w:cs="Courier New"/>
-          <w:color w:val="3B2322"/>
-          <w:kern w:val="0"/>
-          <w:sz w:val="24"/>
-          <w:szCs w:val="24"/>
-        </w:rPr>
-        <w:t xml:space="preserve"> = </w:t>
-      </w:r>
-      <w:r>
-        <w:rPr>
-          <w:rFonts w:ascii="Courier New" w:hAnsi="Courier New" w:cs="Courier New"/>
-          <w:color w:val="149802"/>
-          <w:kern w:val="0"/>
-          <w:sz w:val="24"/>
-          <w:szCs w:val="24"/>
-        </w:rPr>
-        <w:t>'FILE'</w:t>
-      </w:r>
-      <w:r>
-        <w:rPr>
-          <w:rFonts w:ascii="Courier New" w:hAnsi="Courier New" w:cs="Courier New"/>
-          <w:color w:val="3B2322"/>
-          <w:kern w:val="0"/>
-          <w:sz w:val="24"/>
-          <w:szCs w:val="24"/>
-        </w:rPr>
-        <w:t xml:space="preserve"> </w:t>
+        <w:t xml:space="preserve"> name </w:t>
       </w:r>
       <w:r>
         <w:rPr>
@@ -3853,7 +3888,7 @@
           <w:sz w:val="24"/>
           <w:szCs w:val="24"/>
         </w:rPr>
-        <w:t>and</w:t>
+        <w:t>NOT</w:t>
       </w:r>
       <w:r>
         <w:rPr>
@@ -3865,29 +3900,6 @@
         </w:rPr>
         <w:t xml:space="preserve"> </w:t>
       </w:r>
-      <w:proofErr w:type="spellStart"/>
-      <w:r>
-        <w:rPr>
-          <w:rFonts w:ascii="Courier New" w:hAnsi="Courier New" w:cs="Courier New"/>
-          <w:color w:val="3B2322"/>
-          <w:kern w:val="0"/>
-          <w:sz w:val="24"/>
-          <w:szCs w:val="24"/>
-        </w:rPr>
-        <w:t>atime</w:t>
-      </w:r>
-      <w:proofErr w:type="spellEnd"/>
-      <w:r>
-        <w:rPr>
-          <w:rFonts w:ascii="Courier New" w:hAnsi="Courier New" w:cs="Courier New"/>
-          <w:color w:val="3B2322"/>
-          <w:kern w:val="0"/>
-          <w:sz w:val="24"/>
-          <w:szCs w:val="24"/>
-        </w:rPr>
-        <w:t xml:space="preserve"> &lt; </w:t>
-      </w:r>
-      <w:proofErr w:type="spellStart"/>
       <w:r>
         <w:rPr>
           <w:rFonts w:ascii="Courier-Bold" w:hAnsi="Courier-Bold" w:cs="Courier-Bold"/>
@@ -3898,30 +3910,7 @@
           <w:sz w:val="24"/>
           <w:szCs w:val="24"/>
         </w:rPr>
-        <w:t>current_timestamp</w:t>
-      </w:r>
-      <w:proofErr w:type="spellEnd"/>
-      <w:r>
-        <w:rPr>
-          <w:rFonts w:ascii="Courier New" w:hAnsi="Courier New" w:cs="Courier New"/>
-          <w:color w:val="3B2322"/>
-          <w:kern w:val="0"/>
-          <w:sz w:val="24"/>
-          <w:szCs w:val="24"/>
-        </w:rPr>
-        <w:t xml:space="preserve"> - </w:t>
-      </w:r>
-      <w:r>
-        <w:rPr>
-          <w:rFonts w:ascii="Courier-Bold" w:hAnsi="Courier-Bold" w:cs="Courier-Bold"/>
-          <w:b/>
-          <w:bCs/>
-          <w:color w:val="802A19"/>
-          <w:kern w:val="0"/>
-          <w:sz w:val="24"/>
-          <w:szCs w:val="24"/>
-        </w:rPr>
-        <w:t>INTERVAL</w:t>
+        <w:t>LIKE</w:t>
       </w:r>
       <w:r>
         <w:rPr>
@@ -3941,45 +3930,8 @@
           <w:sz w:val="24"/>
           <w:szCs w:val="24"/>
         </w:rPr>
-        <w:t>'6'</w:t>
-      </w:r>
-      <w:r>
-        <w:rPr>
-          <w:rFonts w:ascii="Courier New" w:hAnsi="Courier New" w:cs="Courier New"/>
-          <w:color w:val="3B2322"/>
-          <w:kern w:val="0"/>
-          <w:sz w:val="24"/>
-          <w:szCs w:val="24"/>
-        </w:rPr>
-        <w:t xml:space="preserve"> </w:t>
-      </w:r>
-      <w:r>
-        <w:rPr>
-          <w:rFonts w:ascii="Courier-Bold" w:hAnsi="Courier-Bold" w:cs="Courier-Bold"/>
-          <w:b/>
-          <w:bCs/>
-          <w:color w:val="802A19"/>
-          <w:kern w:val="0"/>
-          <w:sz w:val="24"/>
-          <w:szCs w:val="24"/>
-        </w:rPr>
-        <w:t>MONTH</w:t>
-      </w:r>
-      <w:r>
-        <w:rPr>
-          <w:rFonts w:ascii="Courier New" w:hAnsi="Courier New" w:cs="Courier New"/>
-          <w:color w:val="3B2322"/>
-          <w:kern w:val="0"/>
-          <w:sz w:val="24"/>
-          <w:szCs w:val="24"/>
-        </w:rPr>
-        <w:t>;</w:t>
-      </w:r>
-    </w:p>
-    <w:p>
-      <w:pPr>
-        <w:ind w:left="576"/>
-      </w:pPr>
+        <w:t>'%/'</w:t>
+      </w:r>
     </w:p>
     <w:p>
       <w:pPr>
@@ -4443,7 +4395,7 @@
             </wp:anchor>
           </w:drawing>
         </mc:Choice>
-        <mc:Fallback xmlns:a="http://schemas.openxmlformats.org/drawingml/2006/main" xmlns:arto="http://schemas.microsoft.com/office/word/2006/arto">
+        <mc:Fallback xmlns:arto="http://schemas.microsoft.com/office/word/2006/arto" xmlns:a="http://schemas.openxmlformats.org/drawingml/2006/main">
           <w:pict>
             <v:rect id="Rectangle 72" style="position:absolute;margin-left:0;margin-top:0;width:580.8pt;height:752.4pt;z-index:251661312;visibility:visible;mso-wrap-style:square;mso-width-percent:950;mso-height-percent:950;mso-wrap-distance-left:9pt;mso-wrap-distance-top:0;mso-wrap-distance-right:9pt;mso-wrap-distance-bottom:0;mso-position-horizontal:center;mso-position-horizontal-relative:page;mso-position-vertical:center;mso-position-vertical-relative:page;mso-width-percent:950;mso-height-percent:950;mso-width-relative:page;mso-height-relative:page;v-text-anchor:middle" o:spid="_x0000_s1026" filled="f" strokecolor="#938953 [1614]" strokeweight="1.25pt" w14:anchorId="5C3517D5" o:gfxdata="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">
               <w10:wrap anchorx="page" anchory="page"/>
@@ -11275,6 +11227,7 @@
     <w:rsid w:val="00826915"/>
     <w:rsid w:val="00843A26"/>
     <w:rsid w:val="008A4BF2"/>
+    <w:rsid w:val="008B3007"/>
     <w:rsid w:val="0091242C"/>
     <w:rsid w:val="009E669E"/>
     <w:rsid w:val="00B74EBA"/>
@@ -11283,6 +11236,7 @@
     <w:rsid w:val="00D75F52"/>
     <w:rsid w:val="00D835DE"/>
     <w:rsid w:val="00DA010E"/>
+    <w:rsid w:val="00E43475"/>
     <w:rsid w:val="00F0585F"/>
     <w:rsid w:val="00F24313"/>
     <w:rsid w:val="00FD41EC"/>

</xml_diff>

<commit_message>
Updated script and documentation for using the user tag created
</commit_message>
<xml_diff>
--- a/doc/development/HPCDATAMGM-2088 - External Archive Auto-Tiering.docx
+++ b/doc/development/HPCDATAMGM-2088 - External Archive Auto-Tiering.docx
@@ -3410,23 +3410,6 @@
     </w:p>
     <w:p>
       <w:pPr>
-        <w:ind w:left="720"/>
-      </w:pPr>
-      <w:r>
-        <w:rPr>
-          <w:rFonts w:ascii="Courier-Bold" w:hAnsi="Courier-Bold" w:cs="Courier-Bold"/>
-          <w:b/>
-          <w:bCs/>
-          <w:color w:val="3200CA"/>
-          <w:kern w:val="0"/>
-          <w:sz w:val="24"/>
-          <w:szCs w:val="24"/>
-        </w:rPr>
-        <w:t>usage:</w:t>
-      </w:r>
-    </w:p>
-    <w:p>
-      <w:pPr>
         <w:tabs>
           <w:tab w:val="left" w:pos="560"/>
           <w:tab w:val="left" w:pos="1120"/>
@@ -3447,333 +3430,15 @@
         <w:spacing w:after="0" w:line="240" w:lineRule="auto"/>
         <w:ind w:left="720"/>
         <w:rPr>
-          <w:rFonts w:ascii="Courier New" w:hAnsi="Courier New" w:cs="Courier New"/>
-          <w:color w:val="3B2322"/>
-          <w:kern w:val="0"/>
-          <w:sz w:val="24"/>
-          <w:szCs w:val="24"/>
-        </w:rPr>
-      </w:pPr>
-      <w:r>
-        <w:rPr>
           <w:rFonts w:ascii="Courier-Bold" w:hAnsi="Courier-Bold" w:cs="Courier-Bold"/>
           <w:b/>
           <w:bCs/>
-          <w:color w:val="B000B2"/>
-          <w:kern w:val="0"/>
-          <w:sz w:val="24"/>
-          <w:szCs w:val="24"/>
-        </w:rPr>
-        <w:t>trueatimesearch.py</w:t>
-      </w:r>
-      <w:r>
-        <w:rPr>
-          <w:rFonts w:ascii="Courier New" w:hAnsi="Courier New" w:cs="Courier New"/>
-          <w:color w:val="3B2322"/>
-          <w:kern w:val="0"/>
-          <w:sz w:val="24"/>
-          <w:szCs w:val="24"/>
-        </w:rPr>
-        <w:t xml:space="preserve"> [</w:t>
-      </w:r>
-      <w:r>
-        <w:rPr>
-          <w:rFonts w:ascii="Courier New" w:hAnsi="Courier New" w:cs="Courier New"/>
-          <w:color w:val="149802"/>
-          <w:kern w:val="0"/>
-          <w:sz w:val="24"/>
-          <w:szCs w:val="24"/>
-        </w:rPr>
-        <w:t>-h</w:t>
-      </w:r>
-      <w:r>
-        <w:rPr>
-          <w:rFonts w:ascii="Courier New" w:hAnsi="Courier New" w:cs="Courier New"/>
-          <w:color w:val="3B2322"/>
-          <w:kern w:val="0"/>
-          <w:sz w:val="24"/>
-          <w:szCs w:val="24"/>
-        </w:rPr>
-        <w:t xml:space="preserve">] </w:t>
-      </w:r>
-      <w:r>
-        <w:rPr>
-          <w:rFonts w:ascii="Courier New" w:hAnsi="Courier New" w:cs="Courier New"/>
-          <w:color w:val="13939F"/>
-          <w:kern w:val="0"/>
-          <w:sz w:val="24"/>
-          <w:szCs w:val="24"/>
-        </w:rPr>
-        <w:t xml:space="preserve">--since </w:t>
-      </w:r>
-      <w:proofErr w:type="spellStart"/>
-      <w:r>
-        <w:rPr>
-          <w:rFonts w:ascii="Courier New" w:hAnsi="Courier New" w:cs="Courier New"/>
-          <w:color w:val="848604"/>
-          <w:kern w:val="0"/>
-          <w:sz w:val="24"/>
-          <w:szCs w:val="24"/>
-        </w:rPr>
-        <w:t>SINCE</w:t>
-      </w:r>
-      <w:proofErr w:type="spellEnd"/>
-      <w:r>
-        <w:rPr>
-          <w:rFonts w:ascii="Courier New" w:hAnsi="Courier New" w:cs="Courier New"/>
-          <w:color w:val="3B2322"/>
-          <w:kern w:val="0"/>
-          <w:sz w:val="24"/>
-          <w:szCs w:val="24"/>
-        </w:rPr>
-        <w:t xml:space="preserve"> </w:t>
-      </w:r>
-      <w:r>
-        <w:rPr>
-          <w:rFonts w:ascii="Courier New" w:hAnsi="Courier New" w:cs="Courier New"/>
-          <w:color w:val="13939F"/>
-          <w:kern w:val="0"/>
-          <w:sz w:val="24"/>
-          <w:szCs w:val="24"/>
-        </w:rPr>
-        <w:t xml:space="preserve">--host </w:t>
-      </w:r>
-      <w:proofErr w:type="spellStart"/>
-      <w:r>
-        <w:rPr>
-          <w:rFonts w:ascii="Courier New" w:hAnsi="Courier New" w:cs="Courier New"/>
-          <w:color w:val="848604"/>
-          <w:kern w:val="0"/>
-          <w:sz w:val="24"/>
-          <w:szCs w:val="24"/>
-        </w:rPr>
-        <w:t>HOST</w:t>
-      </w:r>
-      <w:proofErr w:type="spellEnd"/>
-      <w:r>
-        <w:rPr>
-          <w:rFonts w:ascii="Courier New" w:hAnsi="Courier New" w:cs="Courier New"/>
-          <w:color w:val="3B2322"/>
-          <w:kern w:val="0"/>
-          <w:sz w:val="24"/>
-          <w:szCs w:val="24"/>
-        </w:rPr>
-        <w:t xml:space="preserve"> [</w:t>
-      </w:r>
-      <w:r>
-        <w:rPr>
-          <w:rFonts w:ascii="Courier New" w:hAnsi="Courier New" w:cs="Courier New"/>
-          <w:color w:val="13939F"/>
-          <w:kern w:val="0"/>
-          <w:sz w:val="24"/>
-          <w:szCs w:val="24"/>
-        </w:rPr>
-        <w:t xml:space="preserve">--port </w:t>
-      </w:r>
-      <w:r>
-        <w:rPr>
-          <w:rFonts w:ascii="Courier New" w:hAnsi="Courier New" w:cs="Courier New"/>
-          <w:color w:val="848604"/>
-          <w:kern w:val="0"/>
-          <w:sz w:val="24"/>
-          <w:szCs w:val="24"/>
-        </w:rPr>
-        <w:t>PORT</w:t>
-      </w:r>
-      <w:r>
-        <w:rPr>
-          <w:rFonts w:ascii="Courier New" w:hAnsi="Courier New" w:cs="Courier New"/>
-          <w:color w:val="3B2322"/>
-          <w:kern w:val="0"/>
-          <w:sz w:val="24"/>
-          <w:szCs w:val="24"/>
-        </w:rPr>
-        <w:t xml:space="preserve">] </w:t>
-      </w:r>
-      <w:r>
-        <w:rPr>
-          <w:rFonts w:ascii="Courier New" w:hAnsi="Courier New" w:cs="Courier New"/>
-          <w:color w:val="13939F"/>
-          <w:kern w:val="0"/>
-          <w:sz w:val="24"/>
-          <w:szCs w:val="24"/>
-        </w:rPr>
-        <w:t xml:space="preserve">--user </w:t>
-      </w:r>
-      <w:proofErr w:type="spellStart"/>
-      <w:r>
-        <w:rPr>
-          <w:rFonts w:ascii="Courier New" w:hAnsi="Courier New" w:cs="Courier New"/>
-          <w:color w:val="848604"/>
-          <w:kern w:val="0"/>
-          <w:sz w:val="24"/>
-          <w:szCs w:val="24"/>
-        </w:rPr>
-        <w:t>USER</w:t>
-      </w:r>
-      <w:proofErr w:type="spellEnd"/>
-      <w:r>
-        <w:rPr>
-          <w:rFonts w:ascii="Courier New" w:hAnsi="Courier New" w:cs="Courier New"/>
-          <w:color w:val="3B2322"/>
-          <w:kern w:val="0"/>
-          <w:sz w:val="24"/>
-          <w:szCs w:val="24"/>
-        </w:rPr>
-        <w:t xml:space="preserve"> [</w:t>
-      </w:r>
-      <w:r>
-        <w:rPr>
-          <w:rFonts w:ascii="Courier New" w:hAnsi="Courier New" w:cs="Courier New"/>
-          <w:color w:val="13939F"/>
-          <w:kern w:val="0"/>
-          <w:sz w:val="24"/>
-          <w:szCs w:val="24"/>
-        </w:rPr>
-        <w:t xml:space="preserve">--password </w:t>
-      </w:r>
-      <w:r>
-        <w:rPr>
-          <w:rFonts w:ascii="Courier New" w:hAnsi="Courier New" w:cs="Courier New"/>
-          <w:color w:val="848604"/>
-          <w:kern w:val="0"/>
-          <w:sz w:val="24"/>
-          <w:szCs w:val="24"/>
-        </w:rPr>
-        <w:t>PASSWORD</w:t>
-      </w:r>
-      <w:r>
-        <w:rPr>
-          <w:rFonts w:ascii="Courier New" w:hAnsi="Courier New" w:cs="Courier New"/>
-          <w:color w:val="3B2322"/>
-          <w:kern w:val="0"/>
-          <w:sz w:val="24"/>
-          <w:szCs w:val="24"/>
-        </w:rPr>
-        <w:t xml:space="preserve">] </w:t>
-      </w:r>
-      <w:r>
-        <w:rPr>
-          <w:rFonts w:ascii="Courier New" w:hAnsi="Courier New" w:cs="Courier New"/>
-          <w:color w:val="13939F"/>
-          <w:kern w:val="0"/>
-          <w:sz w:val="24"/>
-          <w:szCs w:val="24"/>
-        </w:rPr>
-        <w:t xml:space="preserve">--view-path </w:t>
-      </w:r>
-      <w:r>
-        <w:rPr>
-          <w:rFonts w:ascii="Courier New" w:hAnsi="Courier New" w:cs="Courier New"/>
-          <w:color w:val="848604"/>
-          <w:kern w:val="0"/>
-          <w:sz w:val="24"/>
-          <w:szCs w:val="24"/>
-        </w:rPr>
-        <w:t>VIEW_PATH</w:t>
-      </w:r>
-      <w:r>
-        <w:rPr>
-          <w:rFonts w:ascii="Courier New" w:hAnsi="Courier New" w:cs="Courier New"/>
-          <w:color w:val="3B2322"/>
-          <w:kern w:val="0"/>
-          <w:sz w:val="24"/>
-          <w:szCs w:val="24"/>
-        </w:rPr>
-        <w:t xml:space="preserve"> </w:t>
-      </w:r>
-      <w:r>
-        <w:rPr>
-          <w:rFonts w:ascii="Courier New" w:hAnsi="Courier New" w:cs="Courier New"/>
-          <w:color w:val="13939F"/>
-          <w:kern w:val="0"/>
-          <w:sz w:val="24"/>
-          <w:szCs w:val="24"/>
-        </w:rPr>
-        <w:t xml:space="preserve">--bucket </w:t>
-      </w:r>
-      <w:proofErr w:type="spellStart"/>
-      <w:r>
-        <w:rPr>
-          <w:rFonts w:ascii="Courier New" w:hAnsi="Courier New" w:cs="Courier New"/>
-          <w:color w:val="848604"/>
-          <w:kern w:val="0"/>
-          <w:sz w:val="24"/>
-          <w:szCs w:val="24"/>
-        </w:rPr>
-        <w:t>BUCKET</w:t>
-      </w:r>
-      <w:proofErr w:type="spellEnd"/>
-      <w:r>
-        <w:rPr>
-          <w:rFonts w:ascii="Courier New" w:hAnsi="Courier New" w:cs="Courier New"/>
-          <w:color w:val="848604"/>
-          <w:kern w:val="0"/>
-          <w:sz w:val="24"/>
-          <w:szCs w:val="24"/>
-        </w:rPr>
-        <w:t xml:space="preserve"> -</w:t>
-      </w:r>
-      <w:r>
-        <w:rPr>
-          <w:rFonts w:ascii="Courier New" w:hAnsi="Courier New" w:cs="Courier New"/>
-          <w:color w:val="13939F"/>
-          <w:kern w:val="0"/>
-          <w:sz w:val="24"/>
-          <w:szCs w:val="24"/>
-        </w:rPr>
-        <w:t xml:space="preserve">-s3-endpoint </w:t>
-      </w:r>
-      <w:r>
-        <w:rPr>
-          <w:rFonts w:ascii="Courier New" w:hAnsi="Courier New" w:cs="Courier New"/>
-          <w:color w:val="848604"/>
-          <w:kern w:val="0"/>
-          <w:sz w:val="24"/>
-          <w:szCs w:val="24"/>
-        </w:rPr>
-        <w:t>S3_ENDPOINT</w:t>
-      </w:r>
-      <w:r>
-        <w:rPr>
-          <w:rFonts w:ascii="Courier New" w:hAnsi="Courier New" w:cs="Courier New"/>
-          <w:color w:val="3B2322"/>
-          <w:kern w:val="0"/>
-          <w:sz w:val="24"/>
-          <w:szCs w:val="24"/>
-        </w:rPr>
-        <w:t xml:space="preserve"> </w:t>
-      </w:r>
-      <w:r>
-        <w:rPr>
-          <w:rFonts w:ascii="Courier New" w:hAnsi="Courier New" w:cs="Courier New"/>
-          <w:color w:val="13939F"/>
-          <w:kern w:val="0"/>
-          <w:sz w:val="24"/>
-          <w:szCs w:val="24"/>
-        </w:rPr>
-        <w:t xml:space="preserve">--access-key </w:t>
-      </w:r>
-      <w:r>
-        <w:rPr>
-          <w:rFonts w:ascii="Courier New" w:hAnsi="Courier New" w:cs="Courier New"/>
-          <w:color w:val="848604"/>
-          <w:kern w:val="0"/>
-          <w:sz w:val="24"/>
-          <w:szCs w:val="24"/>
-        </w:rPr>
-        <w:t>ACCESS_KEY</w:t>
-      </w:r>
-      <w:r>
-        <w:rPr>
-          <w:rFonts w:ascii="Courier New" w:hAnsi="Courier New" w:cs="Courier New"/>
-          <w:color w:val="3B2322"/>
-          <w:kern w:val="0"/>
-          <w:sz w:val="24"/>
-          <w:szCs w:val="24"/>
-        </w:rPr>
-        <w:t xml:space="preserve"> </w:t>
-      </w:r>
+          <w:color w:val="3200CA"/>
+          <w:kern w:val="0"/>
+          <w:sz w:val="24"/>
+          <w:szCs w:val="24"/>
+        </w:rPr>
+      </w:pPr>
     </w:p>
     <w:p>
       <w:pPr>
@@ -3798,12 +3463,78 @@
         <w:ind w:left="720"/>
         <w:rPr>
           <w:rFonts w:ascii="Courier New" w:hAnsi="Courier New" w:cs="Courier New"/>
+          <w:color w:val="13939F"/>
+          <w:kern w:val="0"/>
+          <w:sz w:val="24"/>
+          <w:szCs w:val="24"/>
+        </w:rPr>
+      </w:pPr>
+      <w:r>
+        <w:rPr>
+          <w:rFonts w:ascii="Courier-Bold" w:hAnsi="Courier-Bold" w:cs="Courier-Bold"/>
+          <w:b/>
+          <w:bCs/>
+          <w:color w:val="3200CA"/>
+          <w:kern w:val="0"/>
+          <w:sz w:val="24"/>
+          <w:szCs w:val="24"/>
+        </w:rPr>
+        <w:t xml:space="preserve">usage: </w:t>
+      </w:r>
+      <w:r>
+        <w:rPr>
+          <w:rFonts w:ascii="Courier-Bold" w:hAnsi="Courier-Bold" w:cs="Courier-Bold"/>
+          <w:b/>
+          <w:bCs/>
+          <w:color w:val="B000B2"/>
+          <w:kern w:val="0"/>
+          <w:sz w:val="24"/>
+          <w:szCs w:val="24"/>
+        </w:rPr>
+        <w:t>dme_access_time</w:t>
+      </w:r>
+      <w:r>
+        <w:rPr>
+          <w:rFonts w:ascii="Courier-Bold" w:hAnsi="Courier-Bold" w:cs="Courier-Bold"/>
+          <w:b/>
+          <w:bCs/>
+          <w:color w:val="B000B2"/>
+          <w:kern w:val="0"/>
+          <w:sz w:val="24"/>
+          <w:szCs w:val="24"/>
+        </w:rPr>
+        <w:t>.py</w:t>
+      </w:r>
+      <w:r>
+        <w:rPr>
+          <w:rFonts w:ascii="Courier New" w:hAnsi="Courier New" w:cs="Courier New"/>
           <w:color w:val="3B2322"/>
           <w:kern w:val="0"/>
           <w:sz w:val="24"/>
           <w:szCs w:val="24"/>
         </w:rPr>
-      </w:pPr>
+        <w:t xml:space="preserve"> [</w:t>
+      </w:r>
+      <w:r>
+        <w:rPr>
+          <w:rFonts w:ascii="Courier New" w:hAnsi="Courier New" w:cs="Courier New"/>
+          <w:color w:val="149802"/>
+          <w:kern w:val="0"/>
+          <w:sz w:val="24"/>
+          <w:szCs w:val="24"/>
+        </w:rPr>
+        <w:t>-h</w:t>
+      </w:r>
+      <w:r>
+        <w:rPr>
+          <w:rFonts w:ascii="Courier New" w:hAnsi="Courier New" w:cs="Courier New"/>
+          <w:color w:val="3B2322"/>
+          <w:kern w:val="0"/>
+          <w:sz w:val="24"/>
+          <w:szCs w:val="24"/>
+        </w:rPr>
+        <w:t xml:space="preserve">] </w:t>
+      </w:r>
       <w:r>
         <w:rPr>
           <w:rFonts w:ascii="Courier New" w:hAnsi="Courier New" w:cs="Courier New"/>
@@ -3812,6 +3543,314 @@
           <w:sz w:val="24"/>
           <w:szCs w:val="24"/>
         </w:rPr>
+        <w:t xml:space="preserve">--since </w:t>
+      </w:r>
+      <w:proofErr w:type="spellStart"/>
+      <w:r>
+        <w:rPr>
+          <w:rFonts w:ascii="Courier New" w:hAnsi="Courier New" w:cs="Courier New"/>
+          <w:color w:val="848604"/>
+          <w:kern w:val="0"/>
+          <w:sz w:val="24"/>
+          <w:szCs w:val="24"/>
+        </w:rPr>
+        <w:t>SINCE</w:t>
+      </w:r>
+      <w:proofErr w:type="spellEnd"/>
+      <w:r>
+        <w:rPr>
+          <w:rFonts w:ascii="Courier New" w:hAnsi="Courier New" w:cs="Courier New"/>
+          <w:color w:val="3B2322"/>
+          <w:kern w:val="0"/>
+          <w:sz w:val="24"/>
+          <w:szCs w:val="24"/>
+        </w:rPr>
+        <w:t xml:space="preserve"> </w:t>
+      </w:r>
+      <w:r>
+        <w:rPr>
+          <w:rFonts w:ascii="Courier New" w:hAnsi="Courier New" w:cs="Courier New"/>
+          <w:color w:val="13939F"/>
+          <w:kern w:val="0"/>
+          <w:sz w:val="24"/>
+          <w:szCs w:val="24"/>
+        </w:rPr>
+        <w:t xml:space="preserve">--host </w:t>
+      </w:r>
+      <w:proofErr w:type="spellStart"/>
+      <w:r>
+        <w:rPr>
+          <w:rFonts w:ascii="Courier New" w:hAnsi="Courier New" w:cs="Courier New"/>
+          <w:color w:val="848604"/>
+          <w:kern w:val="0"/>
+          <w:sz w:val="24"/>
+          <w:szCs w:val="24"/>
+        </w:rPr>
+        <w:t>HOST</w:t>
+      </w:r>
+      <w:proofErr w:type="spellEnd"/>
+      <w:r>
+        <w:rPr>
+          <w:rFonts w:ascii="Courier New" w:hAnsi="Courier New" w:cs="Courier New"/>
+          <w:color w:val="3B2322"/>
+          <w:kern w:val="0"/>
+          <w:sz w:val="24"/>
+          <w:szCs w:val="24"/>
+        </w:rPr>
+        <w:t xml:space="preserve"> [</w:t>
+      </w:r>
+      <w:r>
+        <w:rPr>
+          <w:rFonts w:ascii="Courier New" w:hAnsi="Courier New" w:cs="Courier New"/>
+          <w:color w:val="13939F"/>
+          <w:kern w:val="0"/>
+          <w:sz w:val="24"/>
+          <w:szCs w:val="24"/>
+        </w:rPr>
+        <w:t xml:space="preserve">--port </w:t>
+      </w:r>
+      <w:r>
+        <w:rPr>
+          <w:rFonts w:ascii="Courier New" w:hAnsi="Courier New" w:cs="Courier New"/>
+          <w:color w:val="848604"/>
+          <w:kern w:val="0"/>
+          <w:sz w:val="24"/>
+          <w:szCs w:val="24"/>
+        </w:rPr>
+        <w:t>PORT</w:t>
+      </w:r>
+      <w:r>
+        <w:rPr>
+          <w:rFonts w:ascii="Courier New" w:hAnsi="Courier New" w:cs="Courier New"/>
+          <w:color w:val="3B2322"/>
+          <w:kern w:val="0"/>
+          <w:sz w:val="24"/>
+          <w:szCs w:val="24"/>
+        </w:rPr>
+        <w:t xml:space="preserve">] </w:t>
+      </w:r>
+      <w:r>
+        <w:rPr>
+          <w:rFonts w:ascii="Courier New" w:hAnsi="Courier New" w:cs="Courier New"/>
+          <w:color w:val="13939F"/>
+          <w:kern w:val="0"/>
+          <w:sz w:val="24"/>
+          <w:szCs w:val="24"/>
+        </w:rPr>
+        <w:t xml:space="preserve">--user </w:t>
+      </w:r>
+      <w:proofErr w:type="spellStart"/>
+      <w:r>
+        <w:rPr>
+          <w:rFonts w:ascii="Courier New" w:hAnsi="Courier New" w:cs="Courier New"/>
+          <w:color w:val="848604"/>
+          <w:kern w:val="0"/>
+          <w:sz w:val="24"/>
+          <w:szCs w:val="24"/>
+        </w:rPr>
+        <w:t>USER</w:t>
+      </w:r>
+      <w:proofErr w:type="spellEnd"/>
+      <w:r>
+        <w:rPr>
+          <w:rFonts w:ascii="Courier New" w:hAnsi="Courier New" w:cs="Courier New"/>
+          <w:color w:val="3B2322"/>
+          <w:kern w:val="0"/>
+          <w:sz w:val="24"/>
+          <w:szCs w:val="24"/>
+        </w:rPr>
+        <w:t xml:space="preserve"> [</w:t>
+      </w:r>
+      <w:r>
+        <w:rPr>
+          <w:rFonts w:ascii="Courier New" w:hAnsi="Courier New" w:cs="Courier New"/>
+          <w:color w:val="13939F"/>
+          <w:kern w:val="0"/>
+          <w:sz w:val="24"/>
+          <w:szCs w:val="24"/>
+        </w:rPr>
+        <w:t xml:space="preserve">--password </w:t>
+      </w:r>
+      <w:r>
+        <w:rPr>
+          <w:rFonts w:ascii="Courier New" w:hAnsi="Courier New" w:cs="Courier New"/>
+          <w:color w:val="848604"/>
+          <w:kern w:val="0"/>
+          <w:sz w:val="24"/>
+          <w:szCs w:val="24"/>
+        </w:rPr>
+        <w:t>PASSWORD</w:t>
+      </w:r>
+      <w:r>
+        <w:rPr>
+          <w:rFonts w:ascii="Courier New" w:hAnsi="Courier New" w:cs="Courier New"/>
+          <w:color w:val="3B2322"/>
+          <w:kern w:val="0"/>
+          <w:sz w:val="24"/>
+          <w:szCs w:val="24"/>
+        </w:rPr>
+        <w:t xml:space="preserve">] </w:t>
+      </w:r>
+      <w:r>
+        <w:rPr>
+          <w:rFonts w:ascii="Courier New" w:hAnsi="Courier New" w:cs="Courier New"/>
+          <w:color w:val="13939F"/>
+          <w:kern w:val="0"/>
+          <w:sz w:val="24"/>
+          <w:szCs w:val="24"/>
+        </w:rPr>
+        <w:t xml:space="preserve">--view-path </w:t>
+      </w:r>
+      <w:r>
+        <w:rPr>
+          <w:rFonts w:ascii="Courier New" w:hAnsi="Courier New" w:cs="Courier New"/>
+          <w:color w:val="848604"/>
+          <w:kern w:val="0"/>
+          <w:sz w:val="24"/>
+          <w:szCs w:val="24"/>
+        </w:rPr>
+        <w:t>VIEW_PATH</w:t>
+      </w:r>
+      <w:r>
+        <w:rPr>
+          <w:rFonts w:ascii="Courier New" w:hAnsi="Courier New" w:cs="Courier New"/>
+          <w:color w:val="3B2322"/>
+          <w:kern w:val="0"/>
+          <w:sz w:val="24"/>
+          <w:szCs w:val="24"/>
+        </w:rPr>
+        <w:t xml:space="preserve"> </w:t>
+      </w:r>
+      <w:r>
+        <w:rPr>
+          <w:rFonts w:ascii="Courier New" w:hAnsi="Courier New" w:cs="Courier New"/>
+          <w:color w:val="13939F"/>
+          <w:kern w:val="0"/>
+          <w:sz w:val="24"/>
+          <w:szCs w:val="24"/>
+        </w:rPr>
+        <w:t xml:space="preserve">--bucket </w:t>
+      </w:r>
+      <w:proofErr w:type="spellStart"/>
+      <w:r>
+        <w:rPr>
+          <w:rFonts w:ascii="Courier New" w:hAnsi="Courier New" w:cs="Courier New"/>
+          <w:color w:val="848604"/>
+          <w:kern w:val="0"/>
+          <w:sz w:val="24"/>
+          <w:szCs w:val="24"/>
+        </w:rPr>
+        <w:t>BUCKET</w:t>
+      </w:r>
+      <w:proofErr w:type="spellEnd"/>
+      <w:r>
+        <w:rPr>
+          <w:rFonts w:ascii="Courier New" w:hAnsi="Courier New" w:cs="Courier New"/>
+          <w:color w:val="848604"/>
+          <w:kern w:val="0"/>
+          <w:sz w:val="24"/>
+          <w:szCs w:val="24"/>
+        </w:rPr>
+        <w:t xml:space="preserve"> </w:t>
+      </w:r>
+      <w:r>
+        <w:rPr>
+          <w:rFonts w:ascii="Courier New" w:hAnsi="Courier New" w:cs="Courier New"/>
+          <w:color w:val="13939F"/>
+          <w:kern w:val="0"/>
+          <w:sz w:val="24"/>
+          <w:szCs w:val="24"/>
+        </w:rPr>
+        <w:t xml:space="preserve">--object-id </w:t>
+      </w:r>
+      <w:r>
+        <w:rPr>
+          <w:rFonts w:ascii="Courier New" w:hAnsi="Courier New" w:cs="Courier New"/>
+          <w:color w:val="848604"/>
+          <w:kern w:val="0"/>
+          <w:sz w:val="24"/>
+          <w:szCs w:val="24"/>
+        </w:rPr>
+        <w:t>OBJECT_ID</w:t>
+      </w:r>
+      <w:r>
+        <w:rPr>
+          <w:rFonts w:ascii="Courier New" w:hAnsi="Courier New" w:cs="Courier New"/>
+          <w:color w:val="3B2322"/>
+          <w:kern w:val="0"/>
+          <w:sz w:val="24"/>
+          <w:szCs w:val="24"/>
+        </w:rPr>
+        <w:t xml:space="preserve"> </w:t>
+      </w:r>
+      <w:r>
+        <w:rPr>
+          <w:rFonts w:ascii="Courier New" w:hAnsi="Courier New" w:cs="Courier New"/>
+          <w:color w:val="13939F"/>
+          <w:kern w:val="0"/>
+          <w:sz w:val="24"/>
+          <w:szCs w:val="24"/>
+        </w:rPr>
+        <w:t xml:space="preserve">--s3-endpoint </w:t>
+      </w:r>
+      <w:r>
+        <w:rPr>
+          <w:rFonts w:ascii="Courier New" w:hAnsi="Courier New" w:cs="Courier New"/>
+          <w:color w:val="848604"/>
+          <w:kern w:val="0"/>
+          <w:sz w:val="24"/>
+          <w:szCs w:val="24"/>
+        </w:rPr>
+        <w:t>S3_ENDPOINT</w:t>
+      </w:r>
+      <w:r>
+        <w:rPr>
+          <w:rFonts w:ascii="Courier New" w:hAnsi="Courier New" w:cs="Courier New"/>
+          <w:color w:val="3B2322"/>
+          <w:kern w:val="0"/>
+          <w:sz w:val="24"/>
+          <w:szCs w:val="24"/>
+        </w:rPr>
+        <w:t xml:space="preserve"> </w:t>
+      </w:r>
+      <w:r>
+        <w:rPr>
+          <w:rFonts w:ascii="Courier New" w:hAnsi="Courier New" w:cs="Courier New"/>
+          <w:color w:val="13939F"/>
+          <w:kern w:val="0"/>
+          <w:sz w:val="24"/>
+          <w:szCs w:val="24"/>
+        </w:rPr>
+        <w:t xml:space="preserve">--access-key </w:t>
+      </w:r>
+      <w:r>
+        <w:rPr>
+          <w:rFonts w:ascii="Courier New" w:hAnsi="Courier New" w:cs="Courier New"/>
+          <w:color w:val="848604"/>
+          <w:kern w:val="0"/>
+          <w:sz w:val="24"/>
+          <w:szCs w:val="24"/>
+        </w:rPr>
+        <w:t>ACCESS_KEY</w:t>
+      </w:r>
+      <w:r>
+        <w:rPr>
+          <w:rFonts w:ascii="Courier New" w:hAnsi="Courier New" w:cs="Courier New"/>
+          <w:color w:val="3B2322"/>
+          <w:kern w:val="0"/>
+          <w:sz w:val="24"/>
+          <w:szCs w:val="24"/>
+        </w:rPr>
+        <w:t xml:space="preserve"> </w:t>
+      </w:r>
+      <w:r>
+        <w:rPr>
+          <w:rFonts w:ascii="Courier New" w:hAnsi="Courier New" w:cs="Courier New"/>
+          <w:color w:val="13939F"/>
+          <w:kern w:val="0"/>
+          <w:sz w:val="24"/>
+          <w:szCs w:val="24"/>
+        </w:rPr>
         <w:t xml:space="preserve">--secret-key </w:t>
       </w:r>
       <w:r>
@@ -3852,11 +3891,29 @@
           <w:sz w:val="24"/>
           <w:szCs w:val="24"/>
         </w:rPr>
+        <w:t>] [</w:t>
+      </w:r>
+      <w:r>
+        <w:rPr>
+          <w:rFonts w:ascii="Courier New" w:hAnsi="Courier New" w:cs="Courier New"/>
+          <w:color w:val="13939F"/>
+          <w:kern w:val="0"/>
+          <w:sz w:val="24"/>
+          <w:szCs w:val="24"/>
+        </w:rPr>
+        <w:t>--insecure</w:t>
+      </w:r>
+      <w:r>
+        <w:rPr>
+          <w:rFonts w:ascii="Courier New" w:hAnsi="Courier New" w:cs="Courier New"/>
+          <w:color w:val="3B2322"/>
+          <w:kern w:val="0"/>
+          <w:sz w:val="24"/>
+          <w:szCs w:val="24"/>
+        </w:rPr>
         <w:t>]</w:t>
       </w:r>
-    </w:p>
-    <w:p>
-      <w:pPr>
+      <w:r>
         <w:rPr>
           <w:rFonts w:ascii="Courier New" w:hAnsi="Courier New" w:cs="Courier New"/>
           <w:color w:val="13939F"/>
@@ -3864,7 +3921,8 @@
           <w:sz w:val="24"/>
           <w:szCs w:val="24"/>
         </w:rPr>
-      </w:pPr>
+        <w:t xml:space="preserve"> </w:t>
+      </w:r>
       <w:r>
         <w:rPr>
           <w:rFonts w:ascii="Courier New" w:hAnsi="Courier New" w:cs="Courier New"/>
@@ -3896,37 +3954,20 @@
         <w:t>y</w:t>
       </w:r>
       <w:r>
-        <w:t xml:space="preserve"> to identify the list </w:t>
-      </w:r>
-      <w:proofErr w:type="gramStart"/>
-      <w:r>
-        <w:t>of</w:t>
+        <w:t xml:space="preserve"> to identify the list of</w:t>
       </w:r>
       <w:r>
         <w:t xml:space="preserve"> </w:t>
       </w:r>
       <w:r>
-        <w:t xml:space="preserve"> individual</w:t>
-      </w:r>
-      <w:proofErr w:type="gramEnd"/>
-      <w:r>
-        <w:t xml:space="preserve"> </w:t>
+        <w:t xml:space="preserve"> individual </w:t>
       </w:r>
       <w:r>
         <w:t>files due for auto-tiering</w:t>
       </w:r>
-    </w:p>
-    <w:p>
-      <w:pPr>
-        <w:ind w:left="576"/>
-        <w:rPr>
-          <w:rFonts w:ascii="Courier New" w:hAnsi="Courier New" w:cs="Courier New"/>
-          <w:color w:val="149802"/>
-          <w:kern w:val="0"/>
-          <w:sz w:val="24"/>
-          <w:szCs w:val="24"/>
-        </w:rPr>
-      </w:pPr>
+      <w:r>
+        <w:br/>
+      </w:r>
       <w:r>
         <w:rPr>
           <w:rFonts w:ascii="Courier-Bold" w:hAnsi="Courier-Bold" w:cs="Courier-Bold"/>
@@ -3949,6 +3990,50 @@
         </w:rPr>
         <w:t xml:space="preserve"> </w:t>
       </w:r>
+      <w:proofErr w:type="spellStart"/>
+      <w:r>
+        <w:rPr>
+          <w:rFonts w:ascii="Courier New" w:hAnsi="Courier New" w:cs="Courier New"/>
+          <w:color w:val="3B2322"/>
+          <w:kern w:val="0"/>
+          <w:sz w:val="24"/>
+          <w:szCs w:val="24"/>
+        </w:rPr>
+        <w:t>parent_path</w:t>
+      </w:r>
+      <w:proofErr w:type="spellEnd"/>
+      <w:r>
+        <w:rPr>
+          <w:rFonts w:ascii="Courier New" w:hAnsi="Courier New" w:cs="Courier New"/>
+          <w:color w:val="3B2322"/>
+          <w:kern w:val="0"/>
+          <w:sz w:val="24"/>
+          <w:szCs w:val="24"/>
+        </w:rPr>
+        <w:t xml:space="preserve"> || name, </w:t>
+      </w:r>
+      <w:proofErr w:type="spellStart"/>
+      <w:r>
+        <w:rPr>
+          <w:rFonts w:ascii="Courier New" w:hAnsi="Courier New" w:cs="Courier New"/>
+          <w:color w:val="3B2322"/>
+          <w:kern w:val="0"/>
+          <w:sz w:val="24"/>
+          <w:szCs w:val="24"/>
+        </w:rPr>
+        <w:t>element_type</w:t>
+      </w:r>
+      <w:proofErr w:type="spellEnd"/>
+      <w:r>
+        <w:rPr>
+          <w:rFonts w:ascii="Courier New" w:hAnsi="Courier New" w:cs="Courier New"/>
+          <w:color w:val="3B2322"/>
+          <w:kern w:val="0"/>
+          <w:sz w:val="24"/>
+          <w:szCs w:val="24"/>
+        </w:rPr>
+        <w:t xml:space="preserve"> </w:t>
+      </w:r>
       <w:r>
         <w:rPr>
           <w:rFonts w:ascii="Courier-Bold" w:hAnsi="Courier-Bold" w:cs="Courier-Bold"/>
@@ -3959,7 +4044,7 @@
           <w:sz w:val="24"/>
           <w:szCs w:val="24"/>
         </w:rPr>
-        <w:t>replace</w:t>
+        <w:t>as</w:t>
       </w:r>
       <w:r>
         <w:rPr>
@@ -3969,69 +4054,7 @@
           <w:sz w:val="24"/>
           <w:szCs w:val="24"/>
         </w:rPr>
-        <w:t>(</w:t>
-      </w:r>
-      <w:proofErr w:type="spellStart"/>
-      <w:r>
-        <w:rPr>
-          <w:rFonts w:ascii="Courier New" w:hAnsi="Courier New" w:cs="Courier New"/>
-          <w:color w:val="3B2322"/>
-          <w:kern w:val="0"/>
-          <w:sz w:val="24"/>
-          <w:szCs w:val="24"/>
-        </w:rPr>
-        <w:t>search_path</w:t>
-      </w:r>
-      <w:proofErr w:type="spellEnd"/>
-      <w:r>
-        <w:rPr>
-          <w:rFonts w:ascii="Courier New" w:hAnsi="Courier New" w:cs="Courier New"/>
-          <w:color w:val="3B2322"/>
-          <w:kern w:val="0"/>
-          <w:sz w:val="24"/>
-          <w:szCs w:val="24"/>
-        </w:rPr>
-        <w:t xml:space="preserve">, </w:t>
-      </w:r>
-      <w:r>
-        <w:rPr>
-          <w:rFonts w:ascii="Courier New" w:hAnsi="Courier New" w:cs="Courier New"/>
-          <w:color w:val="149802"/>
-          <w:kern w:val="0"/>
-          <w:sz w:val="24"/>
-          <w:szCs w:val="24"/>
-        </w:rPr>
-        <w:t>'/CBIIT/DMAP/DMEDataStage2/AUTO-TIERING'</w:t>
-      </w:r>
-      <w:r>
-        <w:rPr>
-          <w:rFonts w:ascii="Courier New" w:hAnsi="Courier New" w:cs="Courier New"/>
-          <w:color w:val="3B2322"/>
-          <w:kern w:val="0"/>
-          <w:sz w:val="24"/>
-          <w:szCs w:val="24"/>
-        </w:rPr>
-        <w:t xml:space="preserve">, </w:t>
-      </w:r>
-      <w:r>
-        <w:rPr>
-          <w:rFonts w:ascii="Courier New" w:hAnsi="Courier New" w:cs="Courier New"/>
-          <w:color w:val="149802"/>
-          <w:kern w:val="0"/>
-          <w:sz w:val="24"/>
-          <w:szCs w:val="24"/>
-        </w:rPr>
-        <w:t>''</w:t>
-      </w:r>
-      <w:r>
-        <w:rPr>
-          <w:rFonts w:ascii="Courier New" w:hAnsi="Courier New" w:cs="Courier New"/>
-          <w:color w:val="3B2322"/>
-          <w:kern w:val="0"/>
-          <w:sz w:val="24"/>
-          <w:szCs w:val="24"/>
-        </w:rPr>
-        <w:t xml:space="preserve">) || name </w:t>
+        <w:t xml:space="preserve"> </w:t>
       </w:r>
       <w:r>
         <w:rPr>
@@ -4043,7 +4066,7 @@
           <w:sz w:val="24"/>
           <w:szCs w:val="24"/>
         </w:rPr>
-        <w:t>as</w:t>
+        <w:t>path</w:t>
       </w:r>
       <w:r>
         <w:rPr>
@@ -4053,7 +4076,71 @@
           <w:sz w:val="24"/>
           <w:szCs w:val="24"/>
         </w:rPr>
-        <w:t xml:space="preserve"> </w:t>
+        <w:t xml:space="preserve">, </w:t>
+      </w:r>
+      <w:proofErr w:type="spellStart"/>
+      <w:r>
+        <w:rPr>
+          <w:rFonts w:ascii="Courier New" w:hAnsi="Courier New" w:cs="Courier New"/>
+          <w:color w:val="3B2322"/>
+          <w:kern w:val="0"/>
+          <w:sz w:val="24"/>
+          <w:szCs w:val="24"/>
+        </w:rPr>
+        <w:t>user_tags</w:t>
+      </w:r>
+      <w:proofErr w:type="spellEnd"/>
+      <w:r>
+        <w:rPr>
+          <w:rFonts w:ascii="Courier New" w:hAnsi="Courier New" w:cs="Courier New"/>
+          <w:color w:val="3B2322"/>
+          <w:kern w:val="0"/>
+          <w:sz w:val="24"/>
+          <w:szCs w:val="24"/>
+        </w:rPr>
+        <w:t>[</w:t>
+      </w:r>
+      <w:r>
+        <w:rPr>
+          <w:rFonts w:ascii="Courier New" w:hAnsi="Courier New" w:cs="Courier New"/>
+          <w:color w:val="149802"/>
+          <w:kern w:val="0"/>
+          <w:sz w:val="24"/>
+          <w:szCs w:val="24"/>
+        </w:rPr>
+        <w:t>'</w:t>
+      </w:r>
+      <w:proofErr w:type="spellStart"/>
+      <w:r>
+        <w:rPr>
+          <w:rFonts w:ascii="Courier New" w:hAnsi="Courier New" w:cs="Courier New"/>
+          <w:color w:val="149802"/>
+          <w:kern w:val="0"/>
+          <w:sz w:val="24"/>
+          <w:szCs w:val="24"/>
+        </w:rPr>
+        <w:t>dme_access_time</w:t>
+      </w:r>
+      <w:proofErr w:type="spellEnd"/>
+      <w:r>
+        <w:rPr>
+          <w:rFonts w:ascii="Courier New" w:hAnsi="Courier New" w:cs="Courier New"/>
+          <w:color w:val="149802"/>
+          <w:kern w:val="0"/>
+          <w:sz w:val="24"/>
+          <w:szCs w:val="24"/>
+        </w:rPr>
+        <w:t>'</w:t>
+      </w:r>
+      <w:r>
+        <w:rPr>
+          <w:rFonts w:ascii="Courier New" w:hAnsi="Courier New" w:cs="Courier New"/>
+          <w:color w:val="3B2322"/>
+          <w:kern w:val="0"/>
+          <w:sz w:val="24"/>
+          <w:szCs w:val="24"/>
+        </w:rPr>
+        <w:t xml:space="preserve">] </w:t>
       </w:r>
       <w:r>
         <w:rPr>
@@ -4065,7 +4152,7 @@
           <w:sz w:val="24"/>
           <w:szCs w:val="24"/>
         </w:rPr>
-        <w:t>path</w:t>
+        <w:t>as</w:t>
       </w:r>
       <w:r>
         <w:rPr>
@@ -4077,6 +4164,49 @@
         </w:rPr>
         <w:t xml:space="preserve"> </w:t>
       </w:r>
+      <w:proofErr w:type="spellStart"/>
+      <w:r>
+        <w:rPr>
+          <w:rFonts w:ascii="Courier New" w:hAnsi="Courier New" w:cs="Courier New"/>
+          <w:color w:val="3B2322"/>
+          <w:kern w:val="0"/>
+          <w:sz w:val="24"/>
+          <w:szCs w:val="24"/>
+        </w:rPr>
+        <w:t>dme</w:t>
+      </w:r>
+      <w:r>
+        <w:rPr>
+          <w:rFonts w:ascii="Courier New" w:hAnsi="Courier New" w:cs="Courier New"/>
+          <w:color w:val="3B2322"/>
+          <w:kern w:val="0"/>
+          <w:sz w:val="24"/>
+          <w:szCs w:val="24"/>
+        </w:rPr>
+        <w:t>_access_</w:t>
+      </w:r>
+      <w:r>
+        <w:rPr>
+          <w:rFonts w:ascii="Courier New" w:hAnsi="Courier New" w:cs="Courier New"/>
+          <w:color w:val="3B2322"/>
+          <w:kern w:val="0"/>
+          <w:sz w:val="24"/>
+          <w:szCs w:val="24"/>
+        </w:rPr>
+        <w:t>time</w:t>
+      </w:r>
+      <w:proofErr w:type="spellEnd"/>
+      <w:r>
+        <w:rPr>
+          <w:rFonts w:ascii="Courier New" w:hAnsi="Courier New" w:cs="Courier New"/>
+          <w:color w:val="3B2322"/>
+          <w:kern w:val="0"/>
+          <w:sz w:val="24"/>
+          <w:szCs w:val="24"/>
+        </w:rPr>
+        <w:t xml:space="preserve"> </w:t>
+      </w:r>
+      <w:proofErr w:type="spellStart"/>
       <w:r>
         <w:rPr>
           <w:rFonts w:ascii="Courier-Bold" w:hAnsi="Courier-Bold" w:cs="Courier-Bold"/>
@@ -4097,7 +4227,18 @@
           <w:sz w:val="24"/>
           <w:szCs w:val="24"/>
         </w:rPr>
-        <w:t xml:space="preserve"> "vast-big-catalog-bucket|vast_big_catalog_schema"."vast_big_catalog_table" </w:t>
+        <w:t xml:space="preserve"> vast_big_catalog_</w:t>
+      </w:r>
+      <w:proofErr w:type="spellEnd"/>
+      <w:r>
+        <w:rPr>
+          <w:rFonts w:ascii="Courier New" w:hAnsi="Courier New" w:cs="Courier New"/>
+          <w:color w:val="3B2322"/>
+          <w:kern w:val="0"/>
+          <w:sz w:val="24"/>
+          <w:szCs w:val="24"/>
+        </w:rPr>
+        <w:t xml:space="preserve">table </w:t>
       </w:r>
       <w:r>
         <w:rPr>
@@ -4194,7 +4335,7 @@
           <w:sz w:val="24"/>
           <w:szCs w:val="24"/>
         </w:rPr>
-        <w:t>atime</w:t>
+        <w:t>parent_path</w:t>
       </w:r>
       <w:proofErr w:type="spellEnd"/>
       <w:r>
@@ -4205,9 +4346,8 @@
           <w:sz w:val="24"/>
           <w:szCs w:val="24"/>
         </w:rPr>
-        <w:t xml:space="preserve"> &lt; </w:t>
-      </w:r>
-      <w:proofErr w:type="spellStart"/>
+        <w:t xml:space="preserve"> </w:t>
+      </w:r>
       <w:r>
         <w:rPr>
           <w:rFonts w:ascii="Courier-Bold" w:hAnsi="Courier-Bold" w:cs="Courier-Bold"/>
@@ -4218,9 +4358,8 @@
           <w:sz w:val="24"/>
           <w:szCs w:val="24"/>
         </w:rPr>
-        <w:t>current_timestamp</w:t>
-      </w:r>
-      <w:proofErr w:type="spellEnd"/>
+        <w:t>like</w:t>
+      </w:r>
       <w:r>
         <w:rPr>
           <w:rFonts w:ascii="Courier New" w:hAnsi="Courier New" w:cs="Courier New"/>
@@ -4229,7 +4368,27 @@
           <w:sz w:val="24"/>
           <w:szCs w:val="24"/>
         </w:rPr>
-        <w:t xml:space="preserve"> - </w:t>
+        <w:t xml:space="preserve"> </w:t>
+      </w:r>
+      <w:r>
+        <w:rPr>
+          <w:rFonts w:ascii="Courier New" w:hAnsi="Courier New" w:cs="Courier New"/>
+          <w:color w:val="149802"/>
+          <w:kern w:val="0"/>
+          <w:sz w:val="24"/>
+          <w:szCs w:val="24"/>
+        </w:rPr>
+        <w:t>'/CBIIT/DMAP/DME_test_DataStage2/AUTO-TIERING%'</w:t>
+      </w:r>
+      <w:r>
+        <w:rPr>
+          <w:rFonts w:ascii="Courier New" w:hAnsi="Courier New" w:cs="Courier New"/>
+          <w:color w:val="3B2322"/>
+          <w:kern w:val="0"/>
+          <w:sz w:val="24"/>
+          <w:szCs w:val="24"/>
+        </w:rPr>
+        <w:t xml:space="preserve"> </w:t>
       </w:r>
       <w:r>
         <w:rPr>
@@ -4241,7 +4400,7 @@
           <w:sz w:val="24"/>
           <w:szCs w:val="24"/>
         </w:rPr>
-        <w:t>INTERVAL</w:t>
+        <w:t>and</w:t>
       </w:r>
       <w:r>
         <w:rPr>
@@ -4251,7 +4410,29 @@
           <w:sz w:val="24"/>
           <w:szCs w:val="24"/>
         </w:rPr>
-        <w:t xml:space="preserve"> </w:t>
+        <w:t xml:space="preserve"> (</w:t>
+      </w:r>
+      <w:proofErr w:type="spellStart"/>
+      <w:r>
+        <w:rPr>
+          <w:rFonts w:ascii="Courier New" w:hAnsi="Courier New" w:cs="Courier New"/>
+          <w:color w:val="3B2322"/>
+          <w:kern w:val="0"/>
+          <w:sz w:val="24"/>
+          <w:szCs w:val="24"/>
+        </w:rPr>
+        <w:t>user_tags</w:t>
+      </w:r>
+      <w:proofErr w:type="spellEnd"/>
+      <w:r>
+        <w:rPr>
+          <w:rFonts w:ascii="Courier New" w:hAnsi="Courier New" w:cs="Courier New"/>
+          <w:color w:val="3B2322"/>
+          <w:kern w:val="0"/>
+          <w:sz w:val="24"/>
+          <w:szCs w:val="24"/>
+        </w:rPr>
+        <w:t>[</w:t>
       </w:r>
       <w:r>
         <w:rPr>
@@ -4261,7 +4442,29 @@
           <w:sz w:val="24"/>
           <w:szCs w:val="24"/>
         </w:rPr>
-        <w:t>'6'</w:t>
+        <w:t>'</w:t>
+      </w:r>
+      <w:proofErr w:type="spellStart"/>
+      <w:r>
+        <w:rPr>
+          <w:rFonts w:ascii="Courier New" w:hAnsi="Courier New" w:cs="Courier New"/>
+          <w:color w:val="149802"/>
+          <w:kern w:val="0"/>
+          <w:sz w:val="24"/>
+          <w:szCs w:val="24"/>
+        </w:rPr>
+        <w:t>dme_access_time</w:t>
+      </w:r>
+      <w:proofErr w:type="spellEnd"/>
+      <w:r>
+        <w:rPr>
+          <w:rFonts w:ascii="Courier New" w:hAnsi="Courier New" w:cs="Courier New"/>
+          <w:color w:val="149802"/>
+          <w:kern w:val="0"/>
+          <w:sz w:val="24"/>
+          <w:szCs w:val="24"/>
+        </w:rPr>
+        <w:t>'</w:t>
       </w:r>
       <w:r>
         <w:rPr>
@@ -4271,7 +4474,7 @@
           <w:sz w:val="24"/>
           <w:szCs w:val="24"/>
         </w:rPr>
-        <w:t xml:space="preserve"> </w:t>
+        <w:t xml:space="preserve">] </w:t>
       </w:r>
       <w:r>
         <w:rPr>
@@ -4283,7 +4486,7 @@
           <w:sz w:val="24"/>
           <w:szCs w:val="24"/>
         </w:rPr>
-        <w:t>MONTH</w:t>
+        <w:t>is</w:t>
       </w:r>
       <w:r>
         <w:rPr>
@@ -4305,30 +4508,8 @@
           <w:sz w:val="24"/>
           <w:szCs w:val="24"/>
         </w:rPr>
-        <w:t>and</w:t>
-      </w:r>
-      <w:r>
-        <w:rPr>
-          <w:rFonts w:ascii="Courier New" w:hAnsi="Courier New" w:cs="Courier New"/>
-          <w:color w:val="3B2322"/>
-          <w:kern w:val="0"/>
-          <w:sz w:val="24"/>
-          <w:szCs w:val="24"/>
-        </w:rPr>
-        <w:t xml:space="preserve"> </w:t>
-      </w:r>
-      <w:proofErr w:type="spellStart"/>
-      <w:r>
-        <w:rPr>
-          <w:rFonts w:ascii="Courier New" w:hAnsi="Courier New" w:cs="Courier New"/>
-          <w:color w:val="3B2322"/>
-          <w:kern w:val="0"/>
-          <w:sz w:val="24"/>
-          <w:szCs w:val="24"/>
-        </w:rPr>
-        <w:t>search_path</w:t>
-      </w:r>
-      <w:proofErr w:type="spellEnd"/>
+        <w:t>null</w:t>
+      </w:r>
       <w:r>
         <w:rPr>
           <w:rFonts w:ascii="Courier New" w:hAnsi="Courier New" w:cs="Courier New"/>
@@ -4349,27 +4530,7 @@
           <w:sz w:val="24"/>
           <w:szCs w:val="24"/>
         </w:rPr>
-        <w:t>like</w:t>
-      </w:r>
-      <w:r>
-        <w:rPr>
-          <w:rFonts w:ascii="Courier New" w:hAnsi="Courier New" w:cs="Courier New"/>
-          <w:color w:val="3B2322"/>
-          <w:kern w:val="0"/>
-          <w:sz w:val="24"/>
-          <w:szCs w:val="24"/>
-        </w:rPr>
-        <w:t xml:space="preserve"> </w:t>
-      </w:r>
-      <w:r>
-        <w:rPr>
-          <w:rFonts w:ascii="Courier New" w:hAnsi="Courier New" w:cs="Courier New"/>
-          <w:color w:val="149802"/>
-          <w:kern w:val="0"/>
-          <w:sz w:val="24"/>
-          <w:szCs w:val="24"/>
-        </w:rPr>
-        <w:t>'/CBIIT/DMAP/DMEDataStage2/AUTO-TIERING'</w:t>
+        <w:t>or</w:t>
       </w:r>
       <w:r>
         <w:rPr>
@@ -4391,7 +4552,7 @@
           <w:sz w:val="24"/>
           <w:szCs w:val="24"/>
         </w:rPr>
-        <w:t>and</w:t>
+        <w:t>CAST</w:t>
       </w:r>
       <w:r>
         <w:rPr>
@@ -4401,7 +4562,71 @@
           <w:sz w:val="24"/>
           <w:szCs w:val="24"/>
         </w:rPr>
-        <w:t xml:space="preserve"> name </w:t>
+        <w:t>(</w:t>
+      </w:r>
+      <w:proofErr w:type="spellStart"/>
+      <w:r>
+        <w:rPr>
+          <w:rFonts w:ascii="Courier New" w:hAnsi="Courier New" w:cs="Courier New"/>
+          <w:color w:val="3B2322"/>
+          <w:kern w:val="0"/>
+          <w:sz w:val="24"/>
+          <w:szCs w:val="24"/>
+        </w:rPr>
+        <w:t>user_tags</w:t>
+      </w:r>
+      <w:proofErr w:type="spellEnd"/>
+      <w:r>
+        <w:rPr>
+          <w:rFonts w:ascii="Courier New" w:hAnsi="Courier New" w:cs="Courier New"/>
+          <w:color w:val="3B2322"/>
+          <w:kern w:val="0"/>
+          <w:sz w:val="24"/>
+          <w:szCs w:val="24"/>
+        </w:rPr>
+        <w:t>[</w:t>
+      </w:r>
+      <w:r>
+        <w:rPr>
+          <w:rFonts w:ascii="Courier New" w:hAnsi="Courier New" w:cs="Courier New"/>
+          <w:color w:val="149802"/>
+          <w:kern w:val="0"/>
+          <w:sz w:val="24"/>
+          <w:szCs w:val="24"/>
+        </w:rPr>
+        <w:t>'</w:t>
+      </w:r>
+      <w:proofErr w:type="spellStart"/>
+      <w:r>
+        <w:rPr>
+          <w:rFonts w:ascii="Courier New" w:hAnsi="Courier New" w:cs="Courier New"/>
+          <w:color w:val="149802"/>
+          <w:kern w:val="0"/>
+          <w:sz w:val="24"/>
+          <w:szCs w:val="24"/>
+        </w:rPr>
+        <w:t>dme_access_time</w:t>
+      </w:r>
+      <w:proofErr w:type="spellEnd"/>
+      <w:r>
+        <w:rPr>
+          <w:rFonts w:ascii="Courier New" w:hAnsi="Courier New" w:cs="Courier New"/>
+          <w:color w:val="149802"/>
+          <w:kern w:val="0"/>
+          <w:sz w:val="24"/>
+          <w:szCs w:val="24"/>
+        </w:rPr>
+        <w:t>'</w:t>
+      </w:r>
+      <w:r>
+        <w:rPr>
+          <w:rFonts w:ascii="Courier New" w:hAnsi="Courier New" w:cs="Courier New"/>
+          <w:color w:val="3B2322"/>
+          <w:kern w:val="0"/>
+          <w:sz w:val="24"/>
+          <w:szCs w:val="24"/>
+        </w:rPr>
+        <w:t xml:space="preserve">] </w:t>
       </w:r>
       <w:r>
         <w:rPr>
@@ -4413,7 +4638,7 @@
           <w:sz w:val="24"/>
           <w:szCs w:val="24"/>
         </w:rPr>
-        <w:t>NOT</w:t>
+        <w:t>AS</w:t>
       </w:r>
       <w:r>
         <w:rPr>
@@ -4435,7 +4660,7 @@
           <w:sz w:val="24"/>
           <w:szCs w:val="24"/>
         </w:rPr>
-        <w:t>LIKE</w:t>
+        <w:t>TIMESTAMP</w:t>
       </w:r>
       <w:r>
         <w:rPr>
@@ -4445,6 +4670,52 @@
           <w:sz w:val="24"/>
           <w:szCs w:val="24"/>
         </w:rPr>
+        <w:t xml:space="preserve">) &lt; </w:t>
+      </w:r>
+      <w:proofErr w:type="spellStart"/>
+      <w:r>
+        <w:rPr>
+          <w:rFonts w:ascii="Courier-Bold" w:hAnsi="Courier-Bold" w:cs="Courier-Bold"/>
+          <w:b/>
+          <w:bCs/>
+          <w:color w:val="802A19"/>
+          <w:kern w:val="0"/>
+          <w:sz w:val="24"/>
+          <w:szCs w:val="24"/>
+        </w:rPr>
+        <w:t>current_timestamp</w:t>
+      </w:r>
+      <w:proofErr w:type="spellEnd"/>
+      <w:r>
+        <w:rPr>
+          <w:rFonts w:ascii="Courier New" w:hAnsi="Courier New" w:cs="Courier New"/>
+          <w:color w:val="3B2322"/>
+          <w:kern w:val="0"/>
+          <w:sz w:val="24"/>
+          <w:szCs w:val="24"/>
+        </w:rPr>
+        <w:t xml:space="preserve"> - </w:t>
+      </w:r>
+      <w:r>
+        <w:rPr>
+          <w:rFonts w:ascii="Courier-Bold" w:hAnsi="Courier-Bold" w:cs="Courier-Bold"/>
+          <w:b/>
+          <w:bCs/>
+          <w:color w:val="802A19"/>
+          <w:kern w:val="0"/>
+          <w:sz w:val="24"/>
+          <w:szCs w:val="24"/>
+        </w:rPr>
+        <w:t>INTERVAL</w:t>
+      </w:r>
+      <w:r>
+        <w:rPr>
+          <w:rFonts w:ascii="Courier New" w:hAnsi="Courier New" w:cs="Courier New"/>
+          <w:color w:val="3B2322"/>
+          <w:kern w:val="0"/>
+          <w:sz w:val="24"/>
+          <w:szCs w:val="24"/>
+        </w:rPr>
         <w:t xml:space="preserve"> </w:t>
       </w:r>
       <w:r>
@@ -4455,7 +4726,39 @@
           <w:sz w:val="24"/>
           <w:szCs w:val="24"/>
         </w:rPr>
-        <w:t>'%/'</w:t>
+        <w:t>'6'</w:t>
+      </w:r>
+      <w:r>
+        <w:rPr>
+          <w:rFonts w:ascii="Courier New" w:hAnsi="Courier New" w:cs="Courier New"/>
+          <w:color w:val="3B2322"/>
+          <w:kern w:val="0"/>
+          <w:sz w:val="24"/>
+          <w:szCs w:val="24"/>
+        </w:rPr>
+        <w:t xml:space="preserve"> </w:t>
+      </w:r>
+      <w:r>
+        <w:rPr>
+          <w:rFonts w:ascii="Courier-Bold" w:hAnsi="Courier-Bold" w:cs="Courier-Bold"/>
+          <w:b/>
+          <w:bCs/>
+          <w:color w:val="802A19"/>
+          <w:kern w:val="0"/>
+          <w:sz w:val="24"/>
+          <w:szCs w:val="24"/>
+        </w:rPr>
+        <w:t>MONTH</w:t>
+      </w:r>
+      <w:r>
+        <w:rPr>
+          <w:rFonts w:ascii="Courier New" w:hAnsi="Courier New" w:cs="Courier New"/>
+          <w:color w:val="3B2322"/>
+          <w:kern w:val="0"/>
+          <w:sz w:val="24"/>
+          <w:szCs w:val="24"/>
+        </w:rPr>
+        <w:t>) ;</w:t>
       </w:r>
     </w:p>
     <w:p>
@@ -4919,7 +5222,7 @@
             </wp:anchor>
           </w:drawing>
         </mc:Choice>
-        <mc:Fallback xmlns:a="http://schemas.openxmlformats.org/drawingml/2006/main" xmlns:arto="http://schemas.microsoft.com/office/word/2006/arto">
+        <mc:Fallback xmlns:arto="http://schemas.microsoft.com/office/word/2006/arto" xmlns:a="http://schemas.openxmlformats.org/drawingml/2006/main">
           <w:pict>
             <v:rect id="Rectangle 72" style="position:absolute;margin-left:0;margin-top:0;width:580.8pt;height:752.4pt;z-index:251661312;visibility:visible;mso-wrap-style:square;mso-width-percent:950;mso-height-percent:950;mso-wrap-distance-left:9pt;mso-wrap-distance-top:0;mso-wrap-distance-right:9pt;mso-wrap-distance-bottom:0;mso-position-horizontal:center;mso-position-horizontal-relative:page;mso-position-vertical:center;mso-position-vertical-relative:page;mso-width-percent:950;mso-height-percent:950;mso-width-relative:page;mso-height-relative:page;v-text-anchor:middle" o:spid="_x0000_s1026" filled="f" strokecolor="#938953 [1614]" strokeweight="1.25pt" w14:anchorId="5C3517D5" o:gfxdata="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">
               <w10:wrap anchorx="page" anchory="page"/>
@@ -5864,7 +6167,7 @@
   <w:style w:type="paragraph" w:default="1" w:styleId="Normal">
     <w:name w:val="Normal"/>
     <w:qFormat/>
-    <w:rsid w:val="002D0624"/>
+    <w:rsid w:val="00A0610B"/>
     <w:rPr>
       <w:sz w:val="26"/>
     </w:rPr>
@@ -6992,6 +7295,7 @@
     <w:rsid w:val="002E3481"/>
     <w:rsid w:val="00300C11"/>
     <w:rsid w:val="00376212"/>
+    <w:rsid w:val="00396093"/>
     <w:rsid w:val="003E3252"/>
     <w:rsid w:val="00480526"/>
     <w:rsid w:val="004845D4"/>
@@ -7000,6 +7304,7 @@
     <w:rsid w:val="005A1D2B"/>
     <w:rsid w:val="00690E31"/>
     <w:rsid w:val="006D7AC7"/>
+    <w:rsid w:val="007071F5"/>
     <w:rsid w:val="00773B85"/>
     <w:rsid w:val="00797E59"/>
     <w:rsid w:val="007A3068"/>

</xml_diff>

<commit_message>
Updated query and doc
</commit_message>
<xml_diff>
--- a/doc/development/HPCDATAMGM-2088 - External Archive Auto-Tiering.docx
+++ b/doc/development/HPCDATAMGM-2088 - External Archive Auto-Tiering.docx
@@ -2355,6 +2355,57 @@
       <w:r>
         <w:t>The purpose of this document is to provide a technical design to perform auto-tiering from external archives</w:t>
       </w:r>
+      <w:r>
+        <w:t>.</w:t>
+      </w:r>
+    </w:p>
+    <w:p>
+      <w:pPr>
+        <w:ind w:left="576"/>
+      </w:pPr>
+      <w:r>
+        <w:t>User Stories covered:</w:t>
+      </w:r>
+    </w:p>
+    <w:p>
+      <w:pPr>
+        <w:pStyle w:val="ListParagraph"/>
+        <w:numPr>
+          <w:ilvl w:val="0"/>
+          <w:numId w:val="4"/>
+        </w:numPr>
+      </w:pPr>
+      <w:hyperlink r:id="rId8" w:history="1">
+        <w:r>
+          <w:rPr>
+            <w:rStyle w:val="Hyperlink"/>
+          </w:rPr>
+          <w:t>https://tracker.nci.nih.gov/browse/HPCDATAMGM-2088</w:t>
+        </w:r>
+      </w:hyperlink>
+    </w:p>
+    <w:p>
+      <w:pPr>
+        <w:pStyle w:val="ListParagraph"/>
+        <w:numPr>
+          <w:ilvl w:val="0"/>
+          <w:numId w:val="4"/>
+        </w:numPr>
+      </w:pPr>
+      <w:hyperlink r:id="rId9" w:history="1">
+        <w:r>
+          <w:rPr>
+            <w:rStyle w:val="Hyperlink"/>
+          </w:rPr>
+          <w:t>https://tracker.nci.nih.gov/browse/HPCDATAMGM-2088</w:t>
+        </w:r>
+      </w:hyperlink>
+    </w:p>
+    <w:p>
+      <w:pPr>
+        <w:pStyle w:val="ListParagraph"/>
+        <w:ind w:left="1296"/>
+      </w:pPr>
     </w:p>
     <w:p>
       <w:pPr>
@@ -2494,6 +2545,7 @@
       </w:pPr>
       <w:bookmarkStart w:id="6" w:name="_Toc220160286"/>
       <w:r>
+        <w:lastRenderedPageBreak/>
         <w:t>Constraints</w:t>
       </w:r>
       <w:bookmarkEnd w:id="6"/>
@@ -2571,7 +2623,6 @@
         </w:numPr>
       </w:pPr>
       <w:r>
-        <w:lastRenderedPageBreak/>
         <w:t>Locate the external archives that need to be scanned for auto-tiering. This is done by extending the DME data management configuration</w:t>
       </w:r>
     </w:p>
@@ -2776,7 +2827,11 @@
         <w:t xml:space="preserve">For each </w:t>
       </w:r>
       <w:r>
-        <w:t>data management configuration that is configured with external archive to be auto-tiering, the task will create a migration task of a new type – BULK_AUTO_TIERING. This migration task will be added to the HPC_DATA_MIGRATION_TASK table</w:t>
+        <w:t xml:space="preserve">data management configuration that is configured with external archive to be auto-tiering, the task will create a migration task of a new type – </w:t>
+      </w:r>
+      <w:r>
+        <w:lastRenderedPageBreak/>
+        <w:t>BULK_AUTO_TIERING. This migration task will be added to the HPC_DATA_MIGRATION_TASK table</w:t>
       </w:r>
     </w:p>
     <w:p>
@@ -2891,7 +2946,6 @@
         </w:numPr>
       </w:pPr>
       <w:r>
-        <w:lastRenderedPageBreak/>
         <w:t>For each bulk auto-tiering task, a Trino query will be used to identify all the data objects that are included in it. A migration task of type DATA_OBJECT will be created for each file and associated with the bulk request</w:t>
       </w:r>
       <w:r>
@@ -3305,7 +3359,7 @@
       <w:r>
         <w:t xml:space="preserve">Details on how the driver configuration is here - </w:t>
       </w:r>
-      <w:hyperlink r:id="rId8" w:history="1">
+      <w:hyperlink r:id="rId10" w:history="1">
         <w:r>
           <w:rPr>
             <w:rStyle w:val="Hyperlink"/>
@@ -4010,29 +4064,7 @@
           <w:sz w:val="24"/>
           <w:szCs w:val="24"/>
         </w:rPr>
-        <w:t xml:space="preserve"> || name, </w:t>
-      </w:r>
-      <w:proofErr w:type="spellStart"/>
-      <w:r>
-        <w:rPr>
-          <w:rFonts w:ascii="Courier New" w:hAnsi="Courier New" w:cs="Courier New"/>
-          <w:color w:val="3B2322"/>
-          <w:kern w:val="0"/>
-          <w:sz w:val="24"/>
-          <w:szCs w:val="24"/>
-        </w:rPr>
-        <w:t>element_type</w:t>
-      </w:r>
-      <w:proofErr w:type="spellEnd"/>
-      <w:r>
-        <w:rPr>
-          <w:rFonts w:ascii="Courier New" w:hAnsi="Courier New" w:cs="Courier New"/>
-          <w:color w:val="3B2322"/>
-          <w:kern w:val="0"/>
-          <w:sz w:val="24"/>
-          <w:szCs w:val="24"/>
-        </w:rPr>
-        <w:t xml:space="preserve"> </w:t>
+        <w:t xml:space="preserve"> || name </w:t>
       </w:r>
       <w:r>
         <w:rPr>
@@ -4206,7 +4238,6 @@
         </w:rPr>
         <w:t xml:space="preserve"> </w:t>
       </w:r>
-      <w:proofErr w:type="spellStart"/>
       <w:r>
         <w:rPr>
           <w:rFonts w:ascii="Courier-Bold" w:hAnsi="Courier-Bold" w:cs="Courier-Bold"/>
@@ -4227,7 +4258,18 @@
           <w:sz w:val="24"/>
           <w:szCs w:val="24"/>
         </w:rPr>
-        <w:t xml:space="preserve"> vast_big_catalog_</w:t>
+        <w:t xml:space="preserve"> </w:t>
+      </w:r>
+      <w:proofErr w:type="spellStart"/>
+      <w:r>
+        <w:rPr>
+          <w:rFonts w:ascii="Courier New" w:hAnsi="Courier New" w:cs="Courier New"/>
+          <w:color w:val="3B2322"/>
+          <w:kern w:val="0"/>
+          <w:sz w:val="24"/>
+          <w:szCs w:val="24"/>
+        </w:rPr>
+        <w:t>vast_big_catalog_table</w:t>
       </w:r>
       <w:proofErr w:type="spellEnd"/>
       <w:r>
@@ -4238,7 +4280,7 @@
           <w:sz w:val="24"/>
           <w:szCs w:val="24"/>
         </w:rPr>
-        <w:t xml:space="preserve">table </w:t>
+        <w:t xml:space="preserve"> </w:t>
       </w:r>
       <w:r>
         <w:rPr>
@@ -4863,10 +4905,10 @@
       </w:pPr>
     </w:p>
     <w:sectPr>
-      <w:headerReference w:type="default" r:id="rId9"/>
-      <w:footerReference w:type="default" r:id="rId10"/>
-      <w:headerReference w:type="first" r:id="rId11"/>
-      <w:footerReference w:type="first" r:id="rId12"/>
+      <w:headerReference w:type="default" r:id="rId11"/>
+      <w:footerReference w:type="default" r:id="rId12"/>
+      <w:headerReference w:type="first" r:id="rId13"/>
+      <w:footerReference w:type="first" r:id="rId14"/>
       <w:pgSz w:w="12240" w:h="15840"/>
       <w:pgMar w:top="1440" w:right="720" w:bottom="1440" w:left="720" w:header="720" w:footer="720" w:gutter="0"/>
       <w:cols w:space="720"/>
@@ -5222,7 +5264,7 @@
             </wp:anchor>
           </w:drawing>
         </mc:Choice>
-        <mc:Fallback xmlns:arto="http://schemas.microsoft.com/office/word/2006/arto" xmlns:a="http://schemas.openxmlformats.org/drawingml/2006/main">
+        <mc:Fallback xmlns:a="http://schemas.openxmlformats.org/drawingml/2006/main" xmlns:arto="http://schemas.microsoft.com/office/word/2006/arto">
           <w:pict>
             <v:rect id="Rectangle 72" style="position:absolute;margin-left:0;margin-top:0;width:580.8pt;height:752.4pt;z-index:251661312;visibility:visible;mso-wrap-style:square;mso-width-percent:950;mso-height-percent:950;mso-wrap-distance-left:9pt;mso-wrap-distance-top:0;mso-wrap-distance-right:9pt;mso-wrap-distance-bottom:0;mso-position-horizontal:center;mso-position-horizontal-relative:page;mso-position-vertical:center;mso-position-vertical-relative:page;mso-width-percent:950;mso-height-percent:950;mso-width-relative:page;mso-height-relative:page;v-text-anchor:middle" o:spid="_x0000_s1026" filled="f" strokecolor="#938953 [1614]" strokeweight="1.25pt" w14:anchorId="5C3517D5" o:gfxdata="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">
               <w10:wrap anchorx="page" anchory="page"/>
@@ -5660,6 +5702,119 @@
     </w:lvl>
   </w:abstractNum>
   <w:abstractNum w:abstractNumId="2" w15:restartNumberingAfterBreak="0">
+    <w:nsid w:val="446935A6"/>
+    <w:multiLevelType w:val="hybridMultilevel"/>
+    <w:tmpl w:val="A41E7A6C"/>
+    <w:lvl w:ilvl="0" w:tplc="04090001">
+      <w:start w:val="1"/>
+      <w:numFmt w:val="bullet"/>
+      <w:lvlText w:val=""/>
+      <w:lvlJc w:val="left"/>
+      <w:pPr>
+        <w:ind w:left="1296" w:hanging="360"/>
+      </w:pPr>
+      <w:rPr>
+        <w:rFonts w:ascii="Symbol" w:hAnsi="Symbol" w:hint="default"/>
+      </w:rPr>
+    </w:lvl>
+    <w:lvl w:ilvl="1" w:tplc="04090003" w:tentative="1">
+      <w:start w:val="1"/>
+      <w:numFmt w:val="bullet"/>
+      <w:lvlText w:val="o"/>
+      <w:lvlJc w:val="left"/>
+      <w:pPr>
+        <w:ind w:left="2016" w:hanging="360"/>
+      </w:pPr>
+      <w:rPr>
+        <w:rFonts w:ascii="Courier New" w:hAnsi="Courier New" w:cs="Courier New" w:hint="default"/>
+      </w:rPr>
+    </w:lvl>
+    <w:lvl w:ilvl="2" w:tplc="04090005" w:tentative="1">
+      <w:start w:val="1"/>
+      <w:numFmt w:val="bullet"/>
+      <w:lvlText w:val=""/>
+      <w:lvlJc w:val="left"/>
+      <w:pPr>
+        <w:ind w:left="2736" w:hanging="360"/>
+      </w:pPr>
+      <w:rPr>
+        <w:rFonts w:ascii="Wingdings" w:hAnsi="Wingdings" w:hint="default"/>
+      </w:rPr>
+    </w:lvl>
+    <w:lvl w:ilvl="3" w:tplc="04090001" w:tentative="1">
+      <w:start w:val="1"/>
+      <w:numFmt w:val="bullet"/>
+      <w:lvlText w:val=""/>
+      <w:lvlJc w:val="left"/>
+      <w:pPr>
+        <w:ind w:left="3456" w:hanging="360"/>
+      </w:pPr>
+      <w:rPr>
+        <w:rFonts w:ascii="Symbol" w:hAnsi="Symbol" w:hint="default"/>
+      </w:rPr>
+    </w:lvl>
+    <w:lvl w:ilvl="4" w:tplc="04090003" w:tentative="1">
+      <w:start w:val="1"/>
+      <w:numFmt w:val="bullet"/>
+      <w:lvlText w:val="o"/>
+      <w:lvlJc w:val="left"/>
+      <w:pPr>
+        <w:ind w:left="4176" w:hanging="360"/>
+      </w:pPr>
+      <w:rPr>
+        <w:rFonts w:ascii="Courier New" w:hAnsi="Courier New" w:cs="Courier New" w:hint="default"/>
+      </w:rPr>
+    </w:lvl>
+    <w:lvl w:ilvl="5" w:tplc="04090005" w:tentative="1">
+      <w:start w:val="1"/>
+      <w:numFmt w:val="bullet"/>
+      <w:lvlText w:val=""/>
+      <w:lvlJc w:val="left"/>
+      <w:pPr>
+        <w:ind w:left="4896" w:hanging="360"/>
+      </w:pPr>
+      <w:rPr>
+        <w:rFonts w:ascii="Wingdings" w:hAnsi="Wingdings" w:hint="default"/>
+      </w:rPr>
+    </w:lvl>
+    <w:lvl w:ilvl="6" w:tplc="04090001" w:tentative="1">
+      <w:start w:val="1"/>
+      <w:numFmt w:val="bullet"/>
+      <w:lvlText w:val=""/>
+      <w:lvlJc w:val="left"/>
+      <w:pPr>
+        <w:ind w:left="5616" w:hanging="360"/>
+      </w:pPr>
+      <w:rPr>
+        <w:rFonts w:ascii="Symbol" w:hAnsi="Symbol" w:hint="default"/>
+      </w:rPr>
+    </w:lvl>
+    <w:lvl w:ilvl="7" w:tplc="04090003" w:tentative="1">
+      <w:start w:val="1"/>
+      <w:numFmt w:val="bullet"/>
+      <w:lvlText w:val="o"/>
+      <w:lvlJc w:val="left"/>
+      <w:pPr>
+        <w:ind w:left="6336" w:hanging="360"/>
+      </w:pPr>
+      <w:rPr>
+        <w:rFonts w:ascii="Courier New" w:hAnsi="Courier New" w:cs="Courier New" w:hint="default"/>
+      </w:rPr>
+    </w:lvl>
+    <w:lvl w:ilvl="8" w:tplc="04090005" w:tentative="1">
+      <w:start w:val="1"/>
+      <w:numFmt w:val="bullet"/>
+      <w:lvlText w:val=""/>
+      <w:lvlJc w:val="left"/>
+      <w:pPr>
+        <w:ind w:left="7056" w:hanging="360"/>
+      </w:pPr>
+      <w:rPr>
+        <w:rFonts w:ascii="Wingdings" w:hAnsi="Wingdings" w:hint="default"/>
+      </w:rPr>
+    </w:lvl>
+  </w:abstractNum>
+  <w:abstractNum w:abstractNumId="3" w15:restartNumberingAfterBreak="0">
     <w:nsid w:val="7ABF36DF"/>
     <w:multiLevelType w:val="multilevel"/>
     <w:tmpl w:val="04090025"/>
@@ -5755,13 +5910,16 @@
     </w:lvl>
   </w:abstractNum>
   <w:num w:numId="1" w16cid:durableId="1395007836">
-    <w:abstractNumId w:val="2"/>
+    <w:abstractNumId w:val="3"/>
   </w:num>
   <w:num w:numId="2" w16cid:durableId="383524221">
     <w:abstractNumId w:val="0"/>
   </w:num>
   <w:num w:numId="3" w16cid:durableId="1856382266">
     <w:abstractNumId w:val="1"/>
+  </w:num>
+  <w:num w:numId="4" w16cid:durableId="710884847">
+    <w:abstractNumId w:val="2"/>
   </w:num>
   <w:numIdMacAtCleanup w:val="3"/>
 </w:numbering>
@@ -7291,6 +7449,7 @@
     <w:rsidRoot w:val="002E3481"/>
     <w:rsid w:val="000634E3"/>
     <w:rsid w:val="00235B96"/>
+    <w:rsid w:val="00266BAB"/>
     <w:rsid w:val="00277525"/>
     <w:rsid w:val="002E3481"/>
     <w:rsid w:val="00300C11"/>

</xml_diff>

<commit_message>
Initial implementation of HPCDATAMGM-2189
</commit_message>
<xml_diff>
--- a/doc/development/HPCDATAMGM-2088 - External Archive Auto-Tiering.docx
+++ b/doc/development/HPCDATAMGM-2088 - External Archive Auto-Tiering.docx
@@ -1,6 +1,6 @@
 
 <file path=word/document.xml><?xml version="1.0" encoding="utf-8"?>
-<w:document xmlns:wpc="http://schemas.microsoft.com/office/word/2010/wordprocessingCanvas" xmlns:cx="http://schemas.microsoft.com/office/drawing/2014/chartex" xmlns:cx1="http://schemas.microsoft.com/office/drawing/2015/9/8/chartex" xmlns:cx2="http://schemas.microsoft.com/office/drawing/2015/10/21/chartex" xmlns:cx3="http://schemas.microsoft.com/office/drawing/2016/5/9/chartex" xmlns:cx4="http://schemas.microsoft.com/office/drawing/2016/5/10/chartex" xmlns:cx5="http://schemas.microsoft.com/office/drawing/2016/5/11/chartex" xmlns:cx6="http://schemas.microsoft.com/office/drawing/2016/5/12/chartex" xmlns:cx7="http://schemas.microsoft.com/office/drawing/2016/5/13/chartex" xmlns:cx8="http://schemas.microsoft.com/office/drawing/2016/5/14/chartex" xmlns:mc="http://schemas.openxmlformats.org/markup-compatibility/2006" xmlns:aink="http://schemas.microsoft.com/office/drawing/2016/ink" xmlns:am3d="http://schemas.microsoft.com/office/drawing/2017/model3d" xmlns:o="urn:schemas-microsoft-com:office:office" xmlns:oel="http://schemas.microsoft.com/office/2019/extlst" xmlns:r="http://schemas.openxmlformats.org/officeDocument/2006/relationships" xmlns:m="http://schemas.openxmlformats.org/officeDocument/2006/math" xmlns:v="urn:schemas-microsoft-com:vml" xmlns:wp14="http://schemas.microsoft.com/office/word/2010/wordprocessingDrawing" xmlns:wp="http://schemas.openxmlformats.org/drawingml/2006/wordprocessingDrawing" xmlns:w10="urn:schemas-microsoft-com:office:word" xmlns:w="http://schemas.openxmlformats.org/wordprocessingml/2006/main" xmlns:w14="http://schemas.microsoft.com/office/word/2010/wordml" xmlns:w15="http://schemas.microsoft.com/office/word/2012/wordml" xmlns:w16cex="http://schemas.microsoft.com/office/word/2018/wordml/cex" xmlns:w16cid="http://schemas.microsoft.com/office/word/2016/wordml/cid" xmlns:w16="http://schemas.microsoft.com/office/word/2018/wordml" xmlns:w16du="http://schemas.microsoft.com/office/word/2023/wordml/word16du" xmlns:w16sdtdh="http://schemas.microsoft.com/office/word/2020/wordml/sdtdatahash" xmlns:w16sdtfl="http://schemas.microsoft.com/office/word/2024/wordml/sdtformatlock" xmlns:w16se="http://schemas.microsoft.com/office/word/2015/wordml/symex" xmlns:wpg="http://schemas.microsoft.com/office/word/2010/wordprocessingGroup" xmlns:wpi="http://schemas.microsoft.com/office/word/2010/wordprocessingInk" xmlns:wne="http://schemas.microsoft.com/office/word/2006/wordml" xmlns:wps="http://schemas.microsoft.com/office/word/2010/wordprocessingShape" mc:Ignorable="w14 w15 w16se w16cid w16 w16cex w16sdtdh w16sdtfl w16du wp14">
+<w:document xmlns:wpc="http://schemas.microsoft.com/office/word/2010/wordprocessingCanvas" xmlns:cx="http://schemas.microsoft.com/office/drawing/2014/chartex" xmlns:cx1="http://schemas.microsoft.com/office/drawing/2015/9/8/chartex" xmlns:cx2="http://schemas.microsoft.com/office/drawing/2015/10/21/chartex" xmlns:cx3="http://schemas.microsoft.com/office/drawing/2016/5/9/chartex" xmlns:cx4="http://schemas.microsoft.com/office/drawing/2016/5/10/chartex" xmlns:cx5="http://schemas.microsoft.com/office/drawing/2016/5/11/chartex" xmlns:cx6="http://schemas.microsoft.com/office/drawing/2016/5/12/chartex" xmlns:cx7="http://schemas.microsoft.com/office/drawing/2016/5/13/chartex" xmlns:cx8="http://schemas.microsoft.com/office/drawing/2016/5/14/chartex" xmlns:mc="http://schemas.openxmlformats.org/markup-compatibility/2006" xmlns:m="http://schemas.openxmlformats.org/officeDocument/2006/math" xmlns:aink="http://schemas.microsoft.com/office/drawing/2016/ink" xmlns:am3d="http://schemas.microsoft.com/office/drawing/2017/model3d" xmlns:oel="http://schemas.microsoft.com/office/2019/extlst" xmlns:r="http://schemas.openxmlformats.org/officeDocument/2006/relationships" xmlns:wp14="http://schemas.microsoft.com/office/word/2010/wordprocessingDrawing" xmlns:wp="http://schemas.openxmlformats.org/drawingml/2006/wordprocessingDrawing" xmlns:wpg="http://schemas.microsoft.com/office/word/2010/wordprocessingGroup" xmlns:wpi="http://schemas.microsoft.com/office/word/2010/wordprocessingInk" xmlns:wps="http://schemas.microsoft.com/office/word/2010/wordprocessingShape" xmlns:o="urn:schemas-microsoft-com:office:office" xmlns:v="urn:schemas-microsoft-com:vml" xmlns:w10="urn:schemas-microsoft-com:office:word" xmlns:w="http://schemas.openxmlformats.org/wordprocessingml/2006/main" xmlns:w14="http://schemas.microsoft.com/office/word/2010/wordml" xmlns:w15="http://schemas.microsoft.com/office/word/2012/wordml" xmlns:w16cex="http://schemas.microsoft.com/office/word/2018/wordml/cex" xmlns:w16cid="http://schemas.microsoft.com/office/word/2016/wordml/cid" xmlns:w16="http://schemas.microsoft.com/office/word/2018/wordml" xmlns:w16sdtdh="http://schemas.microsoft.com/office/word/2020/wordml/sdtdatahash" xmlns:w16sdtfl="http://schemas.microsoft.com/office/word/2024/wordml/sdtformatlock" xmlns:w16se="http://schemas.microsoft.com/office/word/2015/wordml/symex" xmlns:w16du="http://schemas.microsoft.com/office/word/2023/wordml/word16du" xmlns:wne="http://schemas.microsoft.com/office/word/2006/wordml" mc:Ignorable="w14 w15 w16se w16cid w16 w16cex w16sdtdh w16sdtfl w16du wp14">
   <w:body>
     <w:p/>
     <w:p>
@@ -2384,38 +2384,41 @@
         </w:r>
       </w:hyperlink>
     </w:p>
-    <w:p>
-      <w:pPr>
-        <w:pStyle w:val="ListParagraph"/>
-        <w:numPr>
-          <w:ilvl w:val="0"/>
-          <w:numId w:val="4"/>
-        </w:numPr>
-      </w:pPr>
-      <w:hyperlink r:id="rId9" w:history="1">
-        <w:r>
-          <w:rPr>
-            <w:rStyle w:val="Hyperlink"/>
-          </w:rPr>
-          <w:t>https://tracker.nci.nih.gov/browse/HPCDATAMGM-2088</w:t>
-        </w:r>
-      </w:hyperlink>
-    </w:p>
+    <w:bookmarkStart w:id="3" w:name="OLE_LINK3"/>
     <w:p>
       <w:pPr>
         <w:pStyle w:val="ListParagraph"/>
         <w:ind w:left="1296"/>
       </w:pPr>
+      <w:r>
+        <w:fldChar w:fldCharType="begin"/>
+      </w:r>
+      <w:r>
+        <w:instrText>HYPERLINK "https://tracker.nci.nih.gov/browse/HPCDATAMGM-2189"</w:instrText>
+      </w:r>
+      <w:r>
+        <w:fldChar w:fldCharType="separate"/>
+      </w:r>
+      <w:r>
+        <w:rPr>
+          <w:rStyle w:val="Hyperlink"/>
+        </w:rPr>
+        <w:t>https://tracker.nci.nih.gov/browse/HPCDATAMGM-2189</w:t>
+      </w:r>
+      <w:r>
+        <w:fldChar w:fldCharType="end"/>
+      </w:r>
     </w:p>
     <w:p>
       <w:pPr>
         <w:pStyle w:val="Heading2"/>
       </w:pPr>
-      <w:bookmarkStart w:id="3" w:name="_Toc220160283"/>
+      <w:bookmarkStart w:id="4" w:name="_Toc220160283"/>
+      <w:bookmarkEnd w:id="3"/>
       <w:r>
         <w:t>Background</w:t>
       </w:r>
-      <w:bookmarkEnd w:id="3"/>
+      <w:bookmarkEnd w:id="4"/>
     </w:p>
     <w:p>
       <w:pPr>
@@ -2459,29 +2462,46 @@
       <w:pPr>
         <w:pStyle w:val="Heading2"/>
       </w:pPr>
-      <w:bookmarkStart w:id="4" w:name="_Toc220160284"/>
+      <w:bookmarkStart w:id="5" w:name="_Toc220160284"/>
       <w:r>
         <w:t>Scope</w:t>
       </w:r>
-      <w:bookmarkEnd w:id="4"/>
+      <w:bookmarkEnd w:id="5"/>
     </w:p>
     <w:p>
       <w:pPr>
         <w:ind w:left="576"/>
       </w:pPr>
       <w:r>
-        <w:t>The scope of this design is around a specific requirement for this new DME capability – documented in HPCDATAMGM-2088. Files in the external archive that were not accessed by users over a given time will be migrated to Glacier Deep Archive. The migration means the files will get registered in DME and then transferred to S3 Glacier archive</w:t>
+        <w:t>The scope of this design is around a specific requirement for this new DME capability – documented in HPCDATAMGM-</w:t>
+      </w:r>
+      <w:proofErr w:type="gramStart"/>
+      <w:r>
+        <w:t>2088</w:t>
+      </w:r>
+      <w:r>
+        <w:t>.</w:t>
+      </w:r>
+      <w:r>
+        <w:t>.</w:t>
+      </w:r>
+      <w:proofErr w:type="gramEnd"/>
+      <w:r>
+        <w:t xml:space="preserve"> Files in the external archive that were not accessed by users over a given time will be migrated to Glacier Deep Archive. The migration means the files will get registered in DME and then transferred to S3 Glacier archive</w:t>
+      </w:r>
+      <w:r>
+        <w:t>. HPCDATAMGM-2189 expands this capability to internal HPC archives</w:t>
       </w:r>
     </w:p>
     <w:p>
       <w:pPr>
         <w:pStyle w:val="Heading2"/>
       </w:pPr>
-      <w:bookmarkStart w:id="5" w:name="_Toc220160285"/>
+      <w:bookmarkStart w:id="6" w:name="_Toc220160285"/>
       <w:r>
         <w:t>Assumptions</w:t>
       </w:r>
-      <w:bookmarkEnd w:id="5"/>
+      <w:bookmarkEnd w:id="6"/>
     </w:p>
     <w:p>
       <w:pPr>
@@ -2543,65 +2563,65 @@
       <w:pPr>
         <w:pStyle w:val="Heading2"/>
       </w:pPr>
-      <w:bookmarkStart w:id="6" w:name="_Toc220160286"/>
+      <w:bookmarkStart w:id="7" w:name="_Toc220160286"/>
       <w:r>
         <w:lastRenderedPageBreak/>
         <w:t>Constraints</w:t>
       </w:r>
-      <w:bookmarkEnd w:id="6"/>
+      <w:bookmarkEnd w:id="7"/>
     </w:p>
     <w:p>
       <w:pPr>
         <w:pStyle w:val="Heading1"/>
       </w:pPr>
-      <w:bookmarkStart w:id="7" w:name="_Toc220160287"/>
+      <w:bookmarkStart w:id="8" w:name="_Toc220160287"/>
       <w:r>
         <w:t>Architecture Design</w:t>
       </w:r>
-      <w:bookmarkEnd w:id="7"/>
+      <w:bookmarkEnd w:id="8"/>
     </w:p>
     <w:p>
       <w:pPr>
         <w:pStyle w:val="Heading2"/>
       </w:pPr>
-      <w:bookmarkStart w:id="8" w:name="_Toc220160288"/>
+      <w:bookmarkStart w:id="9" w:name="_Toc220160288"/>
       <w:r>
         <w:t>Hardware Architecture</w:t>
       </w:r>
-      <w:bookmarkEnd w:id="8"/>
+      <w:bookmarkEnd w:id="9"/>
     </w:p>
     <w:p>
       <w:pPr>
         <w:pStyle w:val="Heading2"/>
       </w:pPr>
-      <w:bookmarkStart w:id="9" w:name="_Toc220160289"/>
+      <w:bookmarkStart w:id="10" w:name="_Toc220160289"/>
       <w:r>
         <w:t xml:space="preserve">Software </w:t>
       </w:r>
       <w:r>
         <w:t>Architecture</w:t>
       </w:r>
-      <w:bookmarkEnd w:id="9"/>
+      <w:bookmarkEnd w:id="10"/>
     </w:p>
     <w:p>
       <w:pPr>
         <w:pStyle w:val="Heading1"/>
       </w:pPr>
-      <w:bookmarkStart w:id="10" w:name="_Toc220160290"/>
+      <w:bookmarkStart w:id="11" w:name="_Toc220160290"/>
       <w:r>
         <w:t>Software Design</w:t>
       </w:r>
-      <w:bookmarkEnd w:id="10"/>
+      <w:bookmarkEnd w:id="11"/>
     </w:p>
     <w:p>
       <w:pPr>
         <w:pStyle w:val="Heading2"/>
       </w:pPr>
-      <w:bookmarkStart w:id="11" w:name="_Toc220160291"/>
+      <w:bookmarkStart w:id="12" w:name="_Toc220160291"/>
       <w:r>
         <w:t>Introduction</w:t>
       </w:r>
-      <w:bookmarkEnd w:id="11"/>
+      <w:bookmarkEnd w:id="12"/>
     </w:p>
     <w:p>
       <w:r>
@@ -2681,21 +2701,21 @@
       <w:pPr>
         <w:pStyle w:val="Heading2"/>
       </w:pPr>
-      <w:bookmarkStart w:id="12" w:name="_Toc220160292"/>
+      <w:bookmarkStart w:id="13" w:name="_Toc220160292"/>
       <w:r>
         <w:t>Detailed Design</w:t>
       </w:r>
-      <w:bookmarkEnd w:id="12"/>
+      <w:bookmarkEnd w:id="13"/>
     </w:p>
     <w:p>
       <w:pPr>
         <w:pStyle w:val="Heading3"/>
       </w:pPr>
-      <w:bookmarkStart w:id="13" w:name="_Toc220160293"/>
+      <w:bookmarkStart w:id="14" w:name="_Toc220160293"/>
       <w:r>
         <w:t>Scheduled Tasks</w:t>
       </w:r>
-      <w:bookmarkEnd w:id="13"/>
+      <w:bookmarkEnd w:id="14"/>
     </w:p>
     <w:p>
       <w:pPr>
@@ -2946,7 +2966,19 @@
         </w:numPr>
       </w:pPr>
       <w:r>
-        <w:t>For each bulk auto-tiering task, a Trino query will be used to identify all the data objects that are included in it. A migration task of type DATA_OBJECT will be created for each file and associated with the bulk request</w:t>
+        <w:t xml:space="preserve">For each bulk auto-tiering task, </w:t>
+      </w:r>
+      <w:r>
+        <w:t xml:space="preserve">based on S3 configuration </w:t>
+      </w:r>
+      <w:r>
+        <w:t xml:space="preserve">a Trino </w:t>
+      </w:r>
+      <w:r>
+        <w:t xml:space="preserve">or Oracle </w:t>
+      </w:r>
+      <w:r>
+        <w:t>query will be used to identify all the data objects that are included in it. A migration task of type DATA_OBJECT will be created for each file and associated with the bulk request</w:t>
       </w:r>
       <w:r>
         <w:t xml:space="preserve">. </w:t>
@@ -3180,11 +3212,11 @@
       <w:pPr>
         <w:pStyle w:val="Heading3"/>
       </w:pPr>
-      <w:bookmarkStart w:id="14" w:name="_Toc220160294"/>
+      <w:bookmarkStart w:id="15" w:name="_Toc220160294"/>
       <w:r>
         <w:t>API</w:t>
       </w:r>
-      <w:bookmarkEnd w:id="14"/>
+      <w:bookmarkEnd w:id="15"/>
     </w:p>
     <w:p>
       <w:pPr>
@@ -3218,26 +3250,16 @@
         <w:t xml:space="preserve"> with empty request/response JSON. 200 will be returned on success.</w:t>
       </w:r>
     </w:p>
-    <w:p>
-      <w:pPr>
-        <w:ind w:left="720"/>
-      </w:pPr>
-    </w:p>
-    <w:p>
-      <w:pPr>
-        <w:pStyle w:val="ListParagraph"/>
-      </w:pPr>
-    </w:p>
     <w:p/>
     <w:p>
       <w:pPr>
         <w:pStyle w:val="Heading3"/>
       </w:pPr>
-      <w:bookmarkStart w:id="15" w:name="_Toc220160295"/>
+      <w:bookmarkStart w:id="16" w:name="_Toc220160295"/>
       <w:r>
         <w:t>DAO</w:t>
       </w:r>
-      <w:bookmarkEnd w:id="15"/>
+      <w:bookmarkEnd w:id="16"/>
     </w:p>
     <w:p>
       <w:pPr>
@@ -3256,7 +3278,13 @@
       </w:r>
       <w:proofErr w:type="spellStart"/>
       <w:r>
-        <w:t>HpcExternalArchiveDAO</w:t>
+        <w:t>Hpc</w:t>
+      </w:r>
+      <w:r>
+        <w:t>AutoTiering</w:t>
+      </w:r>
+      <w:r>
+        <w:t>DAO</w:t>
       </w:r>
       <w:proofErr w:type="spellEnd"/>
       <w:r>
@@ -3281,16 +3309,320 @@
     </w:p>
     <w:p>
       <w:pPr>
+        <w:shd w:val="clear" w:color="auto" w:fill="FFFFFF"/>
+        <w:tabs>
+          <w:tab w:val="left" w:pos="916"/>
+          <w:tab w:val="left" w:pos="1832"/>
+          <w:tab w:val="left" w:pos="2748"/>
+          <w:tab w:val="left" w:pos="3664"/>
+          <w:tab w:val="left" w:pos="4580"/>
+          <w:tab w:val="left" w:pos="5496"/>
+          <w:tab w:val="left" w:pos="6412"/>
+          <w:tab w:val="left" w:pos="7328"/>
+          <w:tab w:val="left" w:pos="8244"/>
+          <w:tab w:val="left" w:pos="9160"/>
+          <w:tab w:val="left" w:pos="10076"/>
+          <w:tab w:val="left" w:pos="10992"/>
+          <w:tab w:val="left" w:pos="11908"/>
+          <w:tab w:val="left" w:pos="12824"/>
+          <w:tab w:val="left" w:pos="13740"/>
+          <w:tab w:val="left" w:pos="14656"/>
+        </w:tabs>
+        <w:spacing w:after="0" w:line="240" w:lineRule="auto"/>
         <w:ind w:left="576"/>
-      </w:pPr>
-      <w:r>
-        <w:t>TBD: Add method signature after Trino query is finalized</w:t>
-      </w:r>
+        <w:rPr>
+          <w:rFonts w:ascii="Courier New" w:eastAsia="Times New Roman" w:hAnsi="Courier New" w:cs="Courier New"/>
+          <w:color w:val="080808"/>
+          <w:kern w:val="0"/>
+          <w:sz w:val="24"/>
+          <w:szCs w:val="24"/>
+          <w14:ligatures w14:val="none"/>
+        </w:rPr>
+      </w:pPr>
+      <w:r>
+        <w:rPr>
+          <w:rFonts w:ascii="Courier New" w:eastAsia="Times New Roman" w:hAnsi="Courier New" w:cs="Courier New"/>
+          <w:color w:val="000000"/>
+          <w:kern w:val="0"/>
+          <w:sz w:val="24"/>
+          <w:szCs w:val="24"/>
+          <w14:ligatures w14:val="none"/>
+        </w:rPr>
+        <w:t>List</w:t>
+      </w:r>
+      <w:r>
+        <w:rPr>
+          <w:rFonts w:ascii="Courier New" w:eastAsia="Times New Roman" w:hAnsi="Courier New" w:cs="Courier New"/>
+          <w:color w:val="080808"/>
+          <w:kern w:val="0"/>
+          <w:sz w:val="24"/>
+          <w:szCs w:val="24"/>
+          <w14:ligatures w14:val="none"/>
+        </w:rPr>
+        <w:t>&lt;</w:t>
+      </w:r>
+      <w:r>
+        <w:rPr>
+          <w:rFonts w:ascii="Courier New" w:eastAsia="Times New Roman" w:hAnsi="Courier New" w:cs="Courier New"/>
+          <w:color w:val="000000"/>
+          <w:kern w:val="0"/>
+          <w:sz w:val="24"/>
+          <w:szCs w:val="24"/>
+          <w14:ligatures w14:val="none"/>
+        </w:rPr>
+        <w:t>String</w:t>
+      </w:r>
+      <w:r>
+        <w:rPr>
+          <w:rFonts w:ascii="Courier New" w:eastAsia="Times New Roman" w:hAnsi="Courier New" w:cs="Courier New"/>
+          <w:color w:val="080808"/>
+          <w:kern w:val="0"/>
+          <w:sz w:val="24"/>
+          <w:szCs w:val="24"/>
+          <w14:ligatures w14:val="none"/>
+        </w:rPr>
+        <w:t xml:space="preserve">&gt; </w:t>
+      </w:r>
+      <w:proofErr w:type="spellStart"/>
+      <w:proofErr w:type="gramStart"/>
+      <w:r>
+        <w:rPr>
+          <w:rFonts w:ascii="Courier New" w:eastAsia="Times New Roman" w:hAnsi="Courier New" w:cs="Courier New"/>
+          <w:color w:val="00627A"/>
+          <w:kern w:val="0"/>
+          <w:sz w:val="24"/>
+          <w:szCs w:val="24"/>
+          <w14:ligatures w14:val="none"/>
+        </w:rPr>
+        <w:t>getFilesNotAccessed</w:t>
+      </w:r>
+      <w:proofErr w:type="spellEnd"/>
+      <w:r>
+        <w:rPr>
+          <w:rFonts w:ascii="Courier New" w:eastAsia="Times New Roman" w:hAnsi="Courier New" w:cs="Courier New"/>
+          <w:color w:val="080808"/>
+          <w:kern w:val="0"/>
+          <w:sz w:val="24"/>
+          <w:szCs w:val="24"/>
+          <w14:ligatures w14:val="none"/>
+        </w:rPr>
+        <w:t>(</w:t>
+      </w:r>
+      <w:proofErr w:type="gramEnd"/>
+      <w:r>
+        <w:rPr>
+          <w:rFonts w:ascii="Courier New" w:eastAsia="Times New Roman" w:hAnsi="Courier New" w:cs="Courier New"/>
+          <w:color w:val="000000"/>
+          <w:kern w:val="0"/>
+          <w:sz w:val="24"/>
+          <w:szCs w:val="24"/>
+          <w14:ligatures w14:val="none"/>
+        </w:rPr>
+        <w:t xml:space="preserve">String </w:t>
+      </w:r>
+      <w:proofErr w:type="spellStart"/>
+      <w:r>
+        <w:rPr>
+          <w:rFonts w:ascii="Courier New" w:eastAsia="Times New Roman" w:hAnsi="Courier New" w:cs="Courier New"/>
+          <w:color w:val="000000"/>
+          <w:kern w:val="0"/>
+          <w:sz w:val="24"/>
+          <w:szCs w:val="24"/>
+          <w14:ligatures w14:val="none"/>
+        </w:rPr>
+        <w:t>searchPath</w:t>
+      </w:r>
+      <w:proofErr w:type="spellEnd"/>
+      <w:r>
+        <w:rPr>
+          <w:rFonts w:ascii="Courier New" w:eastAsia="Times New Roman" w:hAnsi="Courier New" w:cs="Courier New"/>
+          <w:color w:val="080808"/>
+          <w:kern w:val="0"/>
+          <w:sz w:val="24"/>
+          <w:szCs w:val="24"/>
+          <w14:ligatures w14:val="none"/>
+        </w:rPr>
+        <w:t xml:space="preserve">, </w:t>
+      </w:r>
+      <w:r>
+        <w:rPr>
+          <w:rFonts w:ascii="Courier New" w:eastAsia="Times New Roman" w:hAnsi="Courier New" w:cs="Courier New"/>
+          <w:color w:val="000000"/>
+          <w:kern w:val="0"/>
+          <w:sz w:val="24"/>
+          <w:szCs w:val="24"/>
+          <w14:ligatures w14:val="none"/>
+        </w:rPr>
+        <w:t xml:space="preserve">Integer </w:t>
+      </w:r>
+      <w:proofErr w:type="spellStart"/>
+      <w:r>
+        <w:rPr>
+          <w:rFonts w:ascii="Courier New" w:eastAsia="Times New Roman" w:hAnsi="Courier New" w:cs="Courier New"/>
+          <w:color w:val="000000"/>
+          <w:kern w:val="0"/>
+          <w:sz w:val="24"/>
+          <w:szCs w:val="24"/>
+          <w14:ligatures w14:val="none"/>
+        </w:rPr>
+        <w:t>monthsNotAccessed</w:t>
+      </w:r>
+      <w:proofErr w:type="spellEnd"/>
+      <w:r>
+        <w:rPr>
+          <w:rFonts w:ascii="Courier New" w:eastAsia="Times New Roman" w:hAnsi="Courier New" w:cs="Courier New"/>
+          <w:color w:val="080808"/>
+          <w:kern w:val="0"/>
+          <w:sz w:val="24"/>
+          <w:szCs w:val="24"/>
+          <w14:ligatures w14:val="none"/>
+        </w:rPr>
+        <w:t xml:space="preserve">) </w:t>
+      </w:r>
+      <w:r>
+        <w:rPr>
+          <w:rFonts w:ascii="Courier New" w:eastAsia="Times New Roman" w:hAnsi="Courier New" w:cs="Courier New"/>
+          <w:color w:val="0033B3"/>
+          <w:kern w:val="0"/>
+          <w:sz w:val="24"/>
+          <w:szCs w:val="24"/>
+          <w14:ligatures w14:val="none"/>
+        </w:rPr>
+        <w:t xml:space="preserve">throws </w:t>
+      </w:r>
+      <w:proofErr w:type="spellStart"/>
+      <w:r>
+        <w:rPr>
+          <w:rFonts w:ascii="Courier New" w:eastAsia="Times New Roman" w:hAnsi="Courier New" w:cs="Courier New"/>
+          <w:color w:val="000000"/>
+          <w:kern w:val="0"/>
+          <w:sz w:val="24"/>
+          <w:szCs w:val="24"/>
+          <w14:ligatures w14:val="none"/>
+        </w:rPr>
+        <w:t>HpcException</w:t>
+      </w:r>
+      <w:proofErr w:type="spellEnd"/>
+      <w:r>
+        <w:rPr>
+          <w:rFonts w:ascii="Courier New" w:eastAsia="Times New Roman" w:hAnsi="Courier New" w:cs="Courier New"/>
+          <w:color w:val="080808"/>
+          <w:kern w:val="0"/>
+          <w:sz w:val="24"/>
+          <w:szCs w:val="24"/>
+          <w14:ligatures w14:val="none"/>
+        </w:rPr>
+        <w:t>;</w:t>
+      </w:r>
+    </w:p>
+    <w:p>
+      <w:pPr>
+        <w:shd w:val="clear" w:color="auto" w:fill="FFFFFF"/>
+        <w:tabs>
+          <w:tab w:val="left" w:pos="916"/>
+          <w:tab w:val="left" w:pos="1832"/>
+          <w:tab w:val="left" w:pos="2748"/>
+          <w:tab w:val="left" w:pos="3664"/>
+          <w:tab w:val="left" w:pos="4580"/>
+          <w:tab w:val="left" w:pos="5496"/>
+          <w:tab w:val="left" w:pos="6412"/>
+          <w:tab w:val="left" w:pos="7328"/>
+          <w:tab w:val="left" w:pos="8244"/>
+          <w:tab w:val="left" w:pos="9160"/>
+          <w:tab w:val="left" w:pos="10076"/>
+          <w:tab w:val="left" w:pos="10992"/>
+          <w:tab w:val="left" w:pos="11908"/>
+          <w:tab w:val="left" w:pos="12824"/>
+          <w:tab w:val="left" w:pos="13740"/>
+          <w:tab w:val="left" w:pos="14656"/>
+        </w:tabs>
+        <w:spacing w:after="0" w:line="240" w:lineRule="auto"/>
+        <w:ind w:left="576"/>
+        <w:rPr>
+          <w:rFonts w:ascii="Courier New" w:eastAsia="Times New Roman" w:hAnsi="Courier New" w:cs="Courier New"/>
+          <w:color w:val="080808"/>
+          <w:kern w:val="0"/>
+          <w:sz w:val="20"/>
+          <w:szCs w:val="20"/>
+          <w14:ligatures w14:val="none"/>
+        </w:rPr>
+      </w:pPr>
+    </w:p>
+    <w:p>
+      <w:pPr>
+        <w:shd w:val="clear" w:color="auto" w:fill="FFFFFF"/>
+        <w:tabs>
+          <w:tab w:val="left" w:pos="916"/>
+          <w:tab w:val="left" w:pos="1832"/>
+          <w:tab w:val="left" w:pos="2748"/>
+          <w:tab w:val="left" w:pos="3664"/>
+          <w:tab w:val="left" w:pos="4580"/>
+          <w:tab w:val="left" w:pos="5496"/>
+          <w:tab w:val="left" w:pos="6412"/>
+          <w:tab w:val="left" w:pos="7328"/>
+          <w:tab w:val="left" w:pos="8244"/>
+          <w:tab w:val="left" w:pos="9160"/>
+          <w:tab w:val="left" w:pos="10076"/>
+          <w:tab w:val="left" w:pos="10992"/>
+          <w:tab w:val="left" w:pos="11908"/>
+          <w:tab w:val="left" w:pos="12824"/>
+          <w:tab w:val="left" w:pos="13740"/>
+          <w:tab w:val="left" w:pos="14656"/>
+        </w:tabs>
+        <w:spacing w:after="0" w:line="240" w:lineRule="auto"/>
+        <w:ind w:left="576"/>
+        <w:rPr>
+          <w:rFonts w:ascii="Courier New" w:eastAsia="Times New Roman" w:hAnsi="Courier New" w:cs="Courier New"/>
+          <w:color w:val="080808"/>
+          <w:kern w:val="0"/>
+          <w:sz w:val="20"/>
+          <w:szCs w:val="20"/>
+          <w14:ligatures w14:val="none"/>
+        </w:rPr>
+      </w:pPr>
+      <w:r>
+        <w:t>This DAO interface will be implemented in both Trino and Oracle. This enables a capability to search for inactive files via Trino (external archive), or DME Oracle (internal archive)</w:t>
+      </w:r>
+    </w:p>
+    <w:p>
+      <w:pPr>
+        <w:shd w:val="clear" w:color="auto" w:fill="FFFFFF"/>
+        <w:tabs>
+          <w:tab w:val="left" w:pos="916"/>
+          <w:tab w:val="left" w:pos="1832"/>
+          <w:tab w:val="left" w:pos="2748"/>
+          <w:tab w:val="left" w:pos="3664"/>
+          <w:tab w:val="left" w:pos="4580"/>
+          <w:tab w:val="left" w:pos="5496"/>
+          <w:tab w:val="left" w:pos="6412"/>
+          <w:tab w:val="left" w:pos="7328"/>
+          <w:tab w:val="left" w:pos="8244"/>
+          <w:tab w:val="left" w:pos="9160"/>
+          <w:tab w:val="left" w:pos="10076"/>
+          <w:tab w:val="left" w:pos="10992"/>
+          <w:tab w:val="left" w:pos="11908"/>
+          <w:tab w:val="left" w:pos="12824"/>
+          <w:tab w:val="left" w:pos="13740"/>
+          <w:tab w:val="left" w:pos="14656"/>
+        </w:tabs>
+        <w:spacing w:after="0" w:line="240" w:lineRule="auto"/>
+        <w:rPr>
+          <w:rFonts w:ascii="Courier New" w:eastAsia="Times New Roman" w:hAnsi="Courier New" w:cs="Courier New"/>
+          <w:color w:val="080808"/>
+          <w:kern w:val="0"/>
+          <w:sz w:val="20"/>
+          <w:szCs w:val="20"/>
+          <w14:ligatures w14:val="none"/>
+        </w:rPr>
+      </w:pPr>
     </w:p>
     <w:p>
       <w:pPr>
         <w:pStyle w:val="Heading4"/>
       </w:pPr>
+      <w:r>
+        <w:t xml:space="preserve">Trino </w:t>
+      </w:r>
       <w:r>
         <w:t xml:space="preserve">DAO </w:t>
       </w:r>
@@ -3359,7 +3691,7 @@
       <w:r>
         <w:t xml:space="preserve">Details on how the driver configuration is here - </w:t>
       </w:r>
-      <w:hyperlink r:id="rId10" w:history="1">
+      <w:hyperlink r:id="rId9" w:history="1">
         <w:r>
           <w:rPr>
             <w:rStyle w:val="Hyperlink"/>
@@ -3395,7 +3727,7 @@
     </w:p>
     <w:p>
       <w:pPr>
-        <w:pStyle w:val="Heading4"/>
+        <w:pStyle w:val="Heading5"/>
       </w:pPr>
       <w:r>
         <w:t>Vast</w:t>
@@ -3977,7 +4309,27 @@
         </w:rPr>
         <w:t xml:space="preserve"> </w:t>
       </w:r>
-      <w:r>
+    </w:p>
+    <w:p>
+      <w:pPr>
+        <w:tabs>
+          <w:tab w:val="left" w:pos="560"/>
+          <w:tab w:val="left" w:pos="1120"/>
+          <w:tab w:val="left" w:pos="1680"/>
+          <w:tab w:val="left" w:pos="2240"/>
+          <w:tab w:val="left" w:pos="2800"/>
+          <w:tab w:val="left" w:pos="3360"/>
+          <w:tab w:val="left" w:pos="3920"/>
+          <w:tab w:val="left" w:pos="4480"/>
+          <w:tab w:val="left" w:pos="5040"/>
+          <w:tab w:val="left" w:pos="5600"/>
+          <w:tab w:val="left" w:pos="6160"/>
+          <w:tab w:val="left" w:pos="6720"/>
+        </w:tabs>
+        <w:autoSpaceDE w:val="0"/>
+        <w:autoSpaceDN w:val="0"/>
+        <w:adjustRightInd w:val="0"/>
+        <w:spacing w:after="0" w:line="240" w:lineRule="auto"/>
         <w:rPr>
           <w:rFonts w:ascii="Courier New" w:hAnsi="Courier New" w:cs="Courier New"/>
           <w:color w:val="13939F"/>
@@ -3985,43 +4337,32 @@
           <w:sz w:val="24"/>
           <w:szCs w:val="24"/>
         </w:rPr>
-        <w:br w:type="page"/>
-      </w:r>
-    </w:p>
-    <w:p>
-      <w:pPr>
-        <w:pStyle w:val="Heading4"/>
-      </w:pPr>
-      <w:r>
-        <w:lastRenderedPageBreak/>
+      </w:pPr>
+    </w:p>
+    <w:p>
+      <w:pPr>
+        <w:pStyle w:val="Heading5"/>
+      </w:pPr>
+      <w:r>
         <w:t>Trino Query</w:t>
       </w:r>
     </w:p>
     <w:p>
       <w:pPr>
         <w:pStyle w:val="Heading5"/>
-      </w:pPr>
-      <w:r>
-        <w:t>Quer</w:t>
-      </w:r>
-      <w:r>
-        <w:t>y</w:t>
-      </w:r>
-      <w:r>
-        <w:t xml:space="preserve"> to identify the list of</w:t>
-      </w:r>
-      <w:r>
-        <w:t xml:space="preserve"> </w:t>
-      </w:r>
-      <w:r>
-        <w:t xml:space="preserve"> individual </w:t>
-      </w:r>
-      <w:r>
-        <w:t>files due for auto-tiering</w:t>
-      </w:r>
-      <w:r>
-        <w:br/>
-      </w:r>
+        <w:numPr>
+          <w:ilvl w:val="0"/>
+          <w:numId w:val="0"/>
+        </w:numPr>
+        <w:ind w:left="1008"/>
+        <w:rPr>
+          <w:rFonts w:ascii="Courier New" w:hAnsi="Courier New" w:cs="Courier New"/>
+          <w:color w:val="3B2322"/>
+          <w:kern w:val="0"/>
+          <w:sz w:val="24"/>
+          <w:szCs w:val="24"/>
+        </w:rPr>
+      </w:pPr>
       <w:r>
         <w:rPr>
           <w:rFonts w:ascii="Courier-Bold" w:hAnsi="Courier-Bold" w:cs="Courier-Bold"/>
@@ -4800,61 +5141,426 @@
           <w:sz w:val="24"/>
           <w:szCs w:val="24"/>
         </w:rPr>
-        <w:t>) ;</w:t>
-      </w:r>
+        <w:t xml:space="preserve">) </w:t>
+      </w:r>
+    </w:p>
+    <w:p/>
+    <w:p>
+      <w:pPr>
+        <w:shd w:val="clear" w:color="auto" w:fill="FFFFFF"/>
+        <w:tabs>
+          <w:tab w:val="left" w:pos="916"/>
+          <w:tab w:val="left" w:pos="1832"/>
+          <w:tab w:val="left" w:pos="2748"/>
+          <w:tab w:val="left" w:pos="3664"/>
+          <w:tab w:val="left" w:pos="4580"/>
+          <w:tab w:val="left" w:pos="5496"/>
+          <w:tab w:val="left" w:pos="6412"/>
+          <w:tab w:val="left" w:pos="7328"/>
+          <w:tab w:val="left" w:pos="8244"/>
+          <w:tab w:val="left" w:pos="9160"/>
+          <w:tab w:val="left" w:pos="10076"/>
+          <w:tab w:val="left" w:pos="10992"/>
+          <w:tab w:val="left" w:pos="11908"/>
+          <w:tab w:val="left" w:pos="12824"/>
+          <w:tab w:val="left" w:pos="13740"/>
+          <w:tab w:val="left" w:pos="14656"/>
+        </w:tabs>
+        <w:spacing w:after="0" w:line="240" w:lineRule="auto"/>
+        <w:rPr>
+          <w:rFonts w:ascii="Courier New" w:eastAsia="Times New Roman" w:hAnsi="Courier New" w:cs="Courier New"/>
+          <w:color w:val="080808"/>
+          <w:kern w:val="0"/>
+          <w:sz w:val="20"/>
+          <w:szCs w:val="20"/>
+          <w14:ligatures w14:val="none"/>
+        </w:rPr>
+      </w:pPr>
+    </w:p>
+    <w:p>
+      <w:pPr>
+        <w:pStyle w:val="Heading4"/>
+      </w:pPr>
+      <w:r>
+        <w:t>Oracle DAO Implementation</w:t>
+      </w:r>
+    </w:p>
+    <w:p>
+      <w:pPr>
+        <w:pStyle w:val="ListParagraph"/>
+        <w:tabs>
+          <w:tab w:val="left" w:pos="560"/>
+          <w:tab w:val="left" w:pos="1120"/>
+          <w:tab w:val="left" w:pos="1680"/>
+          <w:tab w:val="left" w:pos="2240"/>
+          <w:tab w:val="left" w:pos="2800"/>
+          <w:tab w:val="left" w:pos="3360"/>
+          <w:tab w:val="left" w:pos="3920"/>
+          <w:tab w:val="left" w:pos="4480"/>
+          <w:tab w:val="left" w:pos="5040"/>
+          <w:tab w:val="left" w:pos="5600"/>
+          <w:tab w:val="left" w:pos="6160"/>
+          <w:tab w:val="left" w:pos="6720"/>
+        </w:tabs>
+        <w:autoSpaceDE w:val="0"/>
+        <w:autoSpaceDN w:val="0"/>
+        <w:adjustRightInd w:val="0"/>
+        <w:spacing w:after="0" w:line="240" w:lineRule="auto"/>
+        <w:rPr>
+          <w:rFonts w:ascii="Courier New" w:hAnsi="Courier New" w:cs="Courier New"/>
+          <w:color w:val="13939F"/>
+          <w:kern w:val="0"/>
+          <w:sz w:val="24"/>
+          <w:szCs w:val="24"/>
+        </w:rPr>
+      </w:pPr>
+      <w:r>
+        <w:t xml:space="preserve">The implementation of the DAO will utilize the HPC_DATA_OBJECT_LAST_ACCESS_MV materialized </w:t>
+      </w:r>
+      <w:r>
+        <w:t>view.</w:t>
+      </w:r>
+    </w:p>
+    <w:p>
+      <w:pPr>
+        <w:pStyle w:val="ListParagraph"/>
+        <w:tabs>
+          <w:tab w:val="left" w:pos="560"/>
+          <w:tab w:val="left" w:pos="1120"/>
+          <w:tab w:val="left" w:pos="1680"/>
+          <w:tab w:val="left" w:pos="2240"/>
+          <w:tab w:val="left" w:pos="2800"/>
+          <w:tab w:val="left" w:pos="3360"/>
+          <w:tab w:val="left" w:pos="3920"/>
+          <w:tab w:val="left" w:pos="4480"/>
+          <w:tab w:val="left" w:pos="5040"/>
+          <w:tab w:val="left" w:pos="5600"/>
+          <w:tab w:val="left" w:pos="6160"/>
+          <w:tab w:val="left" w:pos="6720"/>
+        </w:tabs>
+        <w:autoSpaceDE w:val="0"/>
+        <w:autoSpaceDN w:val="0"/>
+        <w:adjustRightInd w:val="0"/>
+        <w:spacing w:after="0" w:line="240" w:lineRule="auto"/>
+        <w:rPr>
+          <w:rFonts w:ascii="Courier New" w:hAnsi="Courier New" w:cs="Courier New"/>
+          <w:color w:val="13939F"/>
+          <w:kern w:val="0"/>
+          <w:sz w:val="24"/>
+          <w:szCs w:val="24"/>
+        </w:rPr>
+      </w:pPr>
+    </w:p>
+    <w:p>
+      <w:pPr>
+        <w:pStyle w:val="Heading5"/>
+      </w:pPr>
+      <w:r>
+        <w:t>Oracle Query</w:t>
+      </w:r>
+    </w:p>
+    <w:p>
+      <w:pPr>
+        <w:pStyle w:val="HTMLPreformatted"/>
+        <w:shd w:val="clear" w:color="auto" w:fill="FFFFFF"/>
+        <w:ind w:left="576"/>
+        <w:rPr>
+          <w:color w:val="080808"/>
+          <w:sz w:val="24"/>
+          <w:szCs w:val="24"/>
+        </w:rPr>
+      </w:pPr>
+      <w:r>
+        <w:rPr>
+          <w:color w:val="0033B3"/>
+          <w:sz w:val="24"/>
+          <w:szCs w:val="24"/>
+        </w:rPr>
+        <w:t xml:space="preserve">select </w:t>
+      </w:r>
+      <w:r>
+        <w:rPr>
+          <w:color w:val="871094"/>
+          <w:sz w:val="24"/>
+          <w:szCs w:val="24"/>
+        </w:rPr>
+        <w:t xml:space="preserve">path </w:t>
+      </w:r>
+      <w:r>
+        <w:rPr>
+          <w:color w:val="0033B3"/>
+          <w:sz w:val="24"/>
+          <w:szCs w:val="24"/>
+        </w:rPr>
+        <w:t xml:space="preserve">from </w:t>
+      </w:r>
+      <w:r>
+        <w:rPr>
+          <w:color w:val="000000"/>
+          <w:sz w:val="24"/>
+          <w:szCs w:val="24"/>
+        </w:rPr>
+        <w:t xml:space="preserve">HPC_DATA_OBJECT_LAST_ACCESS_MV </w:t>
+      </w:r>
+      <w:r>
+        <w:rPr>
+          <w:color w:val="0033B3"/>
+          <w:sz w:val="24"/>
+          <w:szCs w:val="24"/>
+        </w:rPr>
+        <w:t xml:space="preserve">where </w:t>
+      </w:r>
+      <w:r>
+        <w:rPr>
+          <w:color w:val="871094"/>
+          <w:sz w:val="24"/>
+          <w:szCs w:val="24"/>
+        </w:rPr>
+        <w:t xml:space="preserve">path </w:t>
+      </w:r>
+      <w:r>
+        <w:rPr>
+          <w:color w:val="0033B3"/>
+          <w:sz w:val="24"/>
+          <w:szCs w:val="24"/>
+        </w:rPr>
+        <w:t xml:space="preserve">like </w:t>
+      </w:r>
+      <w:r>
+        <w:rPr>
+          <w:color w:val="067D17"/>
+          <w:sz w:val="24"/>
+          <w:szCs w:val="24"/>
+        </w:rPr>
+        <w:t>'/</w:t>
+      </w:r>
+      <w:proofErr w:type="spellStart"/>
+      <w:r>
+        <w:rPr>
+          <w:color w:val="067D17"/>
+          <w:sz w:val="24"/>
+          <w:szCs w:val="24"/>
+        </w:rPr>
+        <w:t>TEST_EXT_Archive</w:t>
+      </w:r>
+      <w:proofErr w:type="spellEnd"/>
+      <w:r>
+        <w:rPr>
+          <w:color w:val="067D17"/>
+          <w:sz w:val="24"/>
+          <w:szCs w:val="24"/>
+        </w:rPr>
+        <w:t xml:space="preserve">%' </w:t>
+      </w:r>
+      <w:r>
+        <w:rPr>
+          <w:color w:val="0033B3"/>
+          <w:sz w:val="24"/>
+          <w:szCs w:val="24"/>
+        </w:rPr>
+        <w:t xml:space="preserve">and </w:t>
+      </w:r>
+      <w:r>
+        <w:rPr>
+          <w:color w:val="0033B3"/>
+          <w:sz w:val="24"/>
+          <w:szCs w:val="24"/>
+        </w:rPr>
+        <w:t>(</w:t>
+      </w:r>
+      <w:proofErr w:type="spellStart"/>
+      <w:r>
+        <w:rPr>
+          <w:color w:val="871094"/>
+          <w:sz w:val="24"/>
+          <w:szCs w:val="24"/>
+        </w:rPr>
+        <w:t>effective_accessed_date</w:t>
+      </w:r>
+      <w:proofErr w:type="spellEnd"/>
+      <w:r>
+        <w:rPr>
+          <w:color w:val="871094"/>
+          <w:sz w:val="24"/>
+          <w:szCs w:val="24"/>
+        </w:rPr>
+        <w:t xml:space="preserve"> </w:t>
+      </w:r>
+      <w:r>
+        <w:rPr>
+          <w:color w:val="0033B3"/>
+          <w:sz w:val="24"/>
+          <w:szCs w:val="24"/>
+        </w:rPr>
+        <w:t xml:space="preserve">is null or </w:t>
+      </w:r>
+      <w:proofErr w:type="spellStart"/>
+      <w:r>
+        <w:rPr>
+          <w:color w:val="871094"/>
+          <w:sz w:val="24"/>
+          <w:szCs w:val="24"/>
+        </w:rPr>
+        <w:t>effective_accessed_</w:t>
+      </w:r>
+      <w:proofErr w:type="gramStart"/>
+      <w:r>
+        <w:rPr>
+          <w:color w:val="871094"/>
+          <w:sz w:val="24"/>
+          <w:szCs w:val="24"/>
+        </w:rPr>
+        <w:t>date</w:t>
+      </w:r>
+      <w:proofErr w:type="spellEnd"/>
+      <w:r>
+        <w:rPr>
+          <w:color w:val="871094"/>
+          <w:sz w:val="24"/>
+          <w:szCs w:val="24"/>
+        </w:rPr>
+        <w:t xml:space="preserve">  </w:t>
+      </w:r>
+      <w:r>
+        <w:rPr>
+          <w:color w:val="080808"/>
+          <w:sz w:val="24"/>
+          <w:szCs w:val="24"/>
+        </w:rPr>
+        <w:t>&lt;</w:t>
+      </w:r>
+      <w:proofErr w:type="gramEnd"/>
+      <w:r>
+        <w:rPr>
+          <w:color w:val="080808"/>
+          <w:sz w:val="24"/>
+          <w:szCs w:val="24"/>
+        </w:rPr>
+        <w:t xml:space="preserve"> </w:t>
+      </w:r>
+      <w:proofErr w:type="spellStart"/>
+      <w:r>
+        <w:rPr>
+          <w:i/>
+          <w:iCs/>
+          <w:color w:val="00627A"/>
+          <w:sz w:val="24"/>
+          <w:szCs w:val="24"/>
+        </w:rPr>
+        <w:t>current_timestamp</w:t>
+      </w:r>
+      <w:proofErr w:type="spellEnd"/>
+      <w:r>
+        <w:rPr>
+          <w:i/>
+          <w:iCs/>
+          <w:color w:val="00627A"/>
+          <w:sz w:val="24"/>
+          <w:szCs w:val="24"/>
+        </w:rPr>
+        <w:t xml:space="preserve"> </w:t>
+      </w:r>
+      <w:r>
+        <w:rPr>
+          <w:color w:val="080808"/>
+          <w:sz w:val="24"/>
+          <w:szCs w:val="24"/>
+        </w:rPr>
+        <w:t xml:space="preserve">- </w:t>
+      </w:r>
+      <w:r>
+        <w:rPr>
+          <w:color w:val="0033B3"/>
+          <w:sz w:val="24"/>
+          <w:szCs w:val="24"/>
+        </w:rPr>
+        <w:t xml:space="preserve">INTERVAL </w:t>
+      </w:r>
+      <w:r>
+        <w:rPr>
+          <w:color w:val="067D17"/>
+          <w:sz w:val="24"/>
+          <w:szCs w:val="24"/>
+        </w:rPr>
+        <w:t xml:space="preserve">'6' </w:t>
+      </w:r>
+      <w:r>
+        <w:rPr>
+          <w:color w:val="0033B3"/>
+          <w:sz w:val="24"/>
+          <w:szCs w:val="24"/>
+        </w:rPr>
+        <w:t>MONTH</w:t>
+      </w:r>
+      <w:r>
+        <w:rPr>
+          <w:color w:val="0033B3"/>
+          <w:sz w:val="24"/>
+          <w:szCs w:val="24"/>
+        </w:rPr>
+        <w:t>)</w:t>
+      </w:r>
+    </w:p>
+    <w:p>
+      <w:pPr>
+        <w:rPr>
+          <w:sz w:val="24"/>
+          <w:szCs w:val="24"/>
+        </w:rPr>
+      </w:pPr>
     </w:p>
     <w:p>
       <w:pPr>
         <w:pStyle w:val="Heading2"/>
       </w:pPr>
-      <w:bookmarkStart w:id="16" w:name="_Toc220160296"/>
+      <w:bookmarkStart w:id="17" w:name="_Toc220160296"/>
       <w:r>
         <w:t>User Interface</w:t>
       </w:r>
       <w:r>
         <w:t xml:space="preserve"> Design</w:t>
       </w:r>
-      <w:bookmarkEnd w:id="16"/>
+      <w:bookmarkEnd w:id="17"/>
     </w:p>
     <w:p>
       <w:pPr>
         <w:pStyle w:val="Heading2"/>
       </w:pPr>
-      <w:bookmarkStart w:id="17" w:name="_Toc220160297"/>
+      <w:bookmarkStart w:id="18" w:name="_Toc220160297"/>
       <w:r>
         <w:t>System Integration</w:t>
       </w:r>
-      <w:bookmarkEnd w:id="17"/>
+      <w:bookmarkEnd w:id="18"/>
     </w:p>
     <w:p>
       <w:pPr>
         <w:pStyle w:val="Heading1"/>
       </w:pPr>
-      <w:bookmarkStart w:id="18" w:name="_Toc220160298"/>
+      <w:bookmarkStart w:id="19" w:name="_Toc220160298"/>
       <w:r>
         <w:t>Database Design</w:t>
       </w:r>
-      <w:bookmarkEnd w:id="18"/>
+      <w:bookmarkEnd w:id="19"/>
     </w:p>
     <w:p>
       <w:pPr>
         <w:pStyle w:val="Heading2"/>
       </w:pPr>
-      <w:bookmarkStart w:id="19" w:name="_Toc220160299"/>
+      <w:bookmarkStart w:id="20" w:name="_Toc220160299"/>
       <w:r>
         <w:t>Table Design</w:t>
       </w:r>
-      <w:bookmarkEnd w:id="19"/>
+      <w:bookmarkEnd w:id="20"/>
     </w:p>
     <w:p>
       <w:pPr>
         <w:pStyle w:val="Heading3"/>
       </w:pPr>
-      <w:bookmarkStart w:id="20" w:name="_Toc220160300"/>
+      <w:bookmarkStart w:id="21" w:name="_Toc220160300"/>
       <w:r>
         <w:t>HPC_DATA_MIGRATION_TASK &amp; HPC_DATA_MIGRATION_TASK_RESULT</w:t>
       </w:r>
-      <w:bookmarkEnd w:id="20"/>
+      <w:bookmarkEnd w:id="21"/>
     </w:p>
     <w:p>
       <w:pPr>
@@ -4868,11 +5574,12 @@
       <w:pPr>
         <w:pStyle w:val="Heading3"/>
       </w:pPr>
-      <w:bookmarkStart w:id="21" w:name="_Toc220160301"/>
-      <w:r>
+      <w:bookmarkStart w:id="22" w:name="_Toc220160301"/>
+      <w:r>
+        <w:lastRenderedPageBreak/>
         <w:t>HPC_DATA_MANAGEMENT_CONFIGURATION</w:t>
       </w:r>
-      <w:bookmarkEnd w:id="21"/>
+      <w:bookmarkEnd w:id="22"/>
     </w:p>
     <w:p>
       <w:pPr>
@@ -4881,11 +5588,11 @@
       <w:r>
         <w:t xml:space="preserve">A new column </w:t>
       </w:r>
-      <w:bookmarkStart w:id="22" w:name="OLE_LINK1"/>
+      <w:bookmarkStart w:id="23" w:name="OLE_LINK1"/>
       <w:r>
         <w:t>S3_TIERING_ARCHIVE_CONFIGURATION_ID</w:t>
       </w:r>
-      <w:bookmarkEnd w:id="22"/>
+      <w:bookmarkEnd w:id="23"/>
       <w:r>
         <w:t xml:space="preserve"> of type </w:t>
       </w:r>
@@ -4898,6 +5605,101 @@
         <w:t>50) will be added to this table. It will include the S3 archive configuration ID to which external archive files will be migrated to.</w:t>
       </w:r>
     </w:p>
+    <w:p>
+      <w:pPr>
+        <w:pStyle w:val="Heading3"/>
+      </w:pPr>
+      <w:r>
+        <w:t>HPC_S3_ARCHIVE_CONFIGURATION</w:t>
+      </w:r>
+    </w:p>
+    <w:p>
+      <w:pPr>
+        <w:ind w:left="720"/>
+      </w:pPr>
+      <w:r>
+        <w:t>2 new columns will be added to this table. For each S3 configuration that is a source of auto-tiering – the following must be configured</w:t>
+      </w:r>
+    </w:p>
+    <w:p>
+      <w:pPr>
+        <w:pStyle w:val="ListParagraph"/>
+        <w:numPr>
+          <w:ilvl w:val="0"/>
+          <w:numId w:val="8"/>
+        </w:numPr>
+      </w:pPr>
+      <w:r>
+        <w:t xml:space="preserve">AUTO_TIERING_INACTIVITY_MONTHS – The number of inactivity months (no access) to </w:t>
+      </w:r>
+      <w:proofErr w:type="spellStart"/>
+      <w:r>
+        <w:t>triger</w:t>
+      </w:r>
+      <w:proofErr w:type="spellEnd"/>
+      <w:r>
+        <w:t xml:space="preserve"> auto-tiering</w:t>
+      </w:r>
+    </w:p>
+    <w:p>
+      <w:pPr>
+        <w:pStyle w:val="ListParagraph"/>
+        <w:numPr>
+          <w:ilvl w:val="0"/>
+          <w:numId w:val="8"/>
+        </w:numPr>
+      </w:pPr>
+      <w:r>
+        <w:t>AUTO_TIERING_SEARCH_</w:t>
+      </w:r>
+      <w:r>
+        <w:t>SOURCE_</w:t>
+      </w:r>
+      <w:r>
+        <w:t xml:space="preserve">PATH – capture the </w:t>
+      </w:r>
+      <w:r>
+        <w:t xml:space="preserve">source </w:t>
+      </w:r>
+      <w:r>
+        <w:t xml:space="preserve">search </w:t>
+      </w:r>
+      <w:r>
+        <w:t xml:space="preserve">(which DB), </w:t>
+      </w:r>
+      <w:r>
+        <w:t>and search path (for a SQL like) to query. The value can be one of 2 options:</w:t>
+      </w:r>
+    </w:p>
+    <w:p>
+      <w:pPr>
+        <w:pStyle w:val="ListParagraph"/>
+        <w:numPr>
+          <w:ilvl w:val="1"/>
+          <w:numId w:val="8"/>
+        </w:numPr>
+      </w:pPr>
+      <w:r>
+        <w:t>TRINO:&lt;search-path&gt; - to search in Trino</w:t>
+      </w:r>
+    </w:p>
+    <w:p>
+      <w:pPr>
+        <w:pStyle w:val="ListParagraph"/>
+        <w:numPr>
+          <w:ilvl w:val="1"/>
+          <w:numId w:val="8"/>
+        </w:numPr>
+      </w:pPr>
+      <w:r>
+        <w:t>ORACLE:&lt;search-path&gt; - to search in Oracle</w:t>
+      </w:r>
+    </w:p>
+    <w:p>
+      <w:pPr>
+        <w:pStyle w:val="ListParagraph"/>
+      </w:pPr>
+    </w:p>
     <w:p/>
     <w:p>
       <w:pPr>
@@ -4905,10 +5707,10 @@
       </w:pPr>
     </w:p>
     <w:sectPr>
-      <w:headerReference w:type="default" r:id="rId11"/>
-      <w:footerReference w:type="default" r:id="rId12"/>
-      <w:headerReference w:type="first" r:id="rId13"/>
-      <w:footerReference w:type="first" r:id="rId14"/>
+      <w:headerReference w:type="default" r:id="rId10"/>
+      <w:footerReference w:type="default" r:id="rId11"/>
+      <w:headerReference w:type="first" r:id="rId12"/>
+      <w:footerReference w:type="first" r:id="rId13"/>
       <w:pgSz w:w="12240" w:h="15840"/>
       <w:pgMar w:top="1440" w:right="720" w:bottom="1440" w:left="720" w:header="720" w:footer="720" w:gutter="0"/>
       <w:cols w:space="720"/>
@@ -4920,7 +5722,7 @@
 </file>
 
 <file path=word/endnotes.xml><?xml version="1.0" encoding="utf-8"?>
-<w:endnotes xmlns:wpc="http://schemas.microsoft.com/office/word/2010/wordprocessingCanvas" xmlns:cx="http://schemas.microsoft.com/office/drawing/2014/chartex" xmlns:cx1="http://schemas.microsoft.com/office/drawing/2015/9/8/chartex" xmlns:cx2="http://schemas.microsoft.com/office/drawing/2015/10/21/chartex" xmlns:cx3="http://schemas.microsoft.com/office/drawing/2016/5/9/chartex" xmlns:cx4="http://schemas.microsoft.com/office/drawing/2016/5/10/chartex" xmlns:cx5="http://schemas.microsoft.com/office/drawing/2016/5/11/chartex" xmlns:cx6="http://schemas.microsoft.com/office/drawing/2016/5/12/chartex" xmlns:cx7="http://schemas.microsoft.com/office/drawing/2016/5/13/chartex" xmlns:cx8="http://schemas.microsoft.com/office/drawing/2016/5/14/chartex" xmlns:mc="http://schemas.openxmlformats.org/markup-compatibility/2006" xmlns:aink="http://schemas.microsoft.com/office/drawing/2016/ink" xmlns:am3d="http://schemas.microsoft.com/office/drawing/2017/model3d" xmlns:o="urn:schemas-microsoft-com:office:office" xmlns:oel="http://schemas.microsoft.com/office/2019/extlst" xmlns:r="http://schemas.openxmlformats.org/officeDocument/2006/relationships" xmlns:m="http://schemas.openxmlformats.org/officeDocument/2006/math" xmlns:v="urn:schemas-microsoft-com:vml" xmlns:wp14="http://schemas.microsoft.com/office/word/2010/wordprocessingDrawing" xmlns:wp="http://schemas.openxmlformats.org/drawingml/2006/wordprocessingDrawing" xmlns:w10="urn:schemas-microsoft-com:office:word" xmlns:w="http://schemas.openxmlformats.org/wordprocessingml/2006/main" xmlns:w14="http://schemas.microsoft.com/office/word/2010/wordml" xmlns:w15="http://schemas.microsoft.com/office/word/2012/wordml" xmlns:w16cex="http://schemas.microsoft.com/office/word/2018/wordml/cex" xmlns:w16cid="http://schemas.microsoft.com/office/word/2016/wordml/cid" xmlns:w16="http://schemas.microsoft.com/office/word/2018/wordml" xmlns:w16du="http://schemas.microsoft.com/office/word/2023/wordml/word16du" xmlns:w16sdtdh="http://schemas.microsoft.com/office/word/2020/wordml/sdtdatahash" xmlns:w16sdtfl="http://schemas.microsoft.com/office/word/2024/wordml/sdtformatlock" xmlns:w16se="http://schemas.microsoft.com/office/word/2015/wordml/symex" xmlns:wpg="http://schemas.microsoft.com/office/word/2010/wordprocessingGroup" xmlns:wpi="http://schemas.microsoft.com/office/word/2010/wordprocessingInk" xmlns:wne="http://schemas.microsoft.com/office/word/2006/wordml" xmlns:wps="http://schemas.microsoft.com/office/word/2010/wordprocessingShape" mc:Ignorable="w14 w15 w16se w16cid w16 w16cex w16sdtdh w16sdtfl w16du wp14">
+<w:endnotes xmlns:wpc="http://schemas.microsoft.com/office/word/2010/wordprocessingCanvas" xmlns:cx="http://schemas.microsoft.com/office/drawing/2014/chartex" xmlns:cx1="http://schemas.microsoft.com/office/drawing/2015/9/8/chartex" xmlns:cx2="http://schemas.microsoft.com/office/drawing/2015/10/21/chartex" xmlns:cx3="http://schemas.microsoft.com/office/drawing/2016/5/9/chartex" xmlns:cx4="http://schemas.microsoft.com/office/drawing/2016/5/10/chartex" xmlns:cx5="http://schemas.microsoft.com/office/drawing/2016/5/11/chartex" xmlns:cx6="http://schemas.microsoft.com/office/drawing/2016/5/12/chartex" xmlns:cx7="http://schemas.microsoft.com/office/drawing/2016/5/13/chartex" xmlns:cx8="http://schemas.microsoft.com/office/drawing/2016/5/14/chartex" xmlns:mc="http://schemas.openxmlformats.org/markup-compatibility/2006" xmlns:m="http://schemas.openxmlformats.org/officeDocument/2006/math" xmlns:aink="http://schemas.microsoft.com/office/drawing/2016/ink" xmlns:am3d="http://schemas.microsoft.com/office/drawing/2017/model3d" xmlns:oel="http://schemas.microsoft.com/office/2019/extlst" xmlns:r="http://schemas.openxmlformats.org/officeDocument/2006/relationships" xmlns:wp14="http://schemas.microsoft.com/office/word/2010/wordprocessingDrawing" xmlns:wp="http://schemas.openxmlformats.org/drawingml/2006/wordprocessingDrawing" xmlns:wpg="http://schemas.microsoft.com/office/word/2010/wordprocessingGroup" xmlns:wpi="http://schemas.microsoft.com/office/word/2010/wordprocessingInk" xmlns:wps="http://schemas.microsoft.com/office/word/2010/wordprocessingShape" xmlns:o="urn:schemas-microsoft-com:office:office" xmlns:v="urn:schemas-microsoft-com:vml" xmlns:w10="urn:schemas-microsoft-com:office:word" xmlns:w="http://schemas.openxmlformats.org/wordprocessingml/2006/main" xmlns:w14="http://schemas.microsoft.com/office/word/2010/wordml" xmlns:w15="http://schemas.microsoft.com/office/word/2012/wordml" xmlns:w16cex="http://schemas.microsoft.com/office/word/2018/wordml/cex" xmlns:w16cid="http://schemas.microsoft.com/office/word/2016/wordml/cid" xmlns:w16="http://schemas.microsoft.com/office/word/2018/wordml" xmlns:w16sdtdh="http://schemas.microsoft.com/office/word/2020/wordml/sdtdatahash" xmlns:w16sdtfl="http://schemas.microsoft.com/office/word/2024/wordml/sdtformatlock" xmlns:w16se="http://schemas.microsoft.com/office/word/2015/wordml/symex" xmlns:w16du="http://schemas.microsoft.com/office/word/2023/wordml/word16du" xmlns:wne="http://schemas.microsoft.com/office/word/2006/wordml" mc:Ignorable="w14 w15 w16se w16cid w16 w16cex w16sdtdh w16sdtfl w16du wp14">
   <w:endnote w:type="separator" w:id="-1">
     <w:p>
       <w:pPr>
@@ -4952,7 +5754,7 @@
 </file>
 
 <file path=word/footer1.xml><?xml version="1.0" encoding="utf-8"?>
-<w:ftr xmlns:wpc="http://schemas.microsoft.com/office/word/2010/wordprocessingCanvas" xmlns:cx="http://schemas.microsoft.com/office/drawing/2014/chartex" xmlns:cx1="http://schemas.microsoft.com/office/drawing/2015/9/8/chartex" xmlns:cx2="http://schemas.microsoft.com/office/drawing/2015/10/21/chartex" xmlns:cx3="http://schemas.microsoft.com/office/drawing/2016/5/9/chartex" xmlns:cx4="http://schemas.microsoft.com/office/drawing/2016/5/10/chartex" xmlns:cx5="http://schemas.microsoft.com/office/drawing/2016/5/11/chartex" xmlns:cx6="http://schemas.microsoft.com/office/drawing/2016/5/12/chartex" xmlns:cx7="http://schemas.microsoft.com/office/drawing/2016/5/13/chartex" xmlns:cx8="http://schemas.microsoft.com/office/drawing/2016/5/14/chartex" xmlns:mc="http://schemas.openxmlformats.org/markup-compatibility/2006" xmlns:aink="http://schemas.microsoft.com/office/drawing/2016/ink" xmlns:am3d="http://schemas.microsoft.com/office/drawing/2017/model3d" xmlns:o="urn:schemas-microsoft-com:office:office" xmlns:oel="http://schemas.microsoft.com/office/2019/extlst" xmlns:r="http://schemas.openxmlformats.org/officeDocument/2006/relationships" xmlns:m="http://schemas.openxmlformats.org/officeDocument/2006/math" xmlns:v="urn:schemas-microsoft-com:vml" xmlns:wp14="http://schemas.microsoft.com/office/word/2010/wordprocessingDrawing" xmlns:wp="http://schemas.openxmlformats.org/drawingml/2006/wordprocessingDrawing" xmlns:w10="urn:schemas-microsoft-com:office:word" xmlns:w="http://schemas.openxmlformats.org/wordprocessingml/2006/main" xmlns:w14="http://schemas.microsoft.com/office/word/2010/wordml" xmlns:w15="http://schemas.microsoft.com/office/word/2012/wordml" xmlns:w16cex="http://schemas.microsoft.com/office/word/2018/wordml/cex" xmlns:w16cid="http://schemas.microsoft.com/office/word/2016/wordml/cid" xmlns:w16="http://schemas.microsoft.com/office/word/2018/wordml" xmlns:w16du="http://schemas.microsoft.com/office/word/2023/wordml/word16du" xmlns:w16sdtdh="http://schemas.microsoft.com/office/word/2020/wordml/sdtdatahash" xmlns:w16sdtfl="http://schemas.microsoft.com/office/word/2024/wordml/sdtformatlock" xmlns:w16se="http://schemas.microsoft.com/office/word/2015/wordml/symex" xmlns:wpg="http://schemas.microsoft.com/office/word/2010/wordprocessingGroup" xmlns:wpi="http://schemas.microsoft.com/office/word/2010/wordprocessingInk" xmlns:wne="http://schemas.microsoft.com/office/word/2006/wordml" xmlns:wps="http://schemas.microsoft.com/office/word/2010/wordprocessingShape" mc:Ignorable="w14 w15 w16se w16cid w16 w16cex w16sdtdh w16sdtfl w16du wp14">
+<w:ftr xmlns:wpc="http://schemas.microsoft.com/office/word/2010/wordprocessingCanvas" xmlns:cx="http://schemas.microsoft.com/office/drawing/2014/chartex" xmlns:cx1="http://schemas.microsoft.com/office/drawing/2015/9/8/chartex" xmlns:cx2="http://schemas.microsoft.com/office/drawing/2015/10/21/chartex" xmlns:cx3="http://schemas.microsoft.com/office/drawing/2016/5/9/chartex" xmlns:cx4="http://schemas.microsoft.com/office/drawing/2016/5/10/chartex" xmlns:cx5="http://schemas.microsoft.com/office/drawing/2016/5/11/chartex" xmlns:cx6="http://schemas.microsoft.com/office/drawing/2016/5/12/chartex" xmlns:cx7="http://schemas.microsoft.com/office/drawing/2016/5/13/chartex" xmlns:cx8="http://schemas.microsoft.com/office/drawing/2016/5/14/chartex" xmlns:mc="http://schemas.openxmlformats.org/markup-compatibility/2006" xmlns:m="http://schemas.openxmlformats.org/officeDocument/2006/math" xmlns:aink="http://schemas.microsoft.com/office/drawing/2016/ink" xmlns:am3d="http://schemas.microsoft.com/office/drawing/2017/model3d" xmlns:oel="http://schemas.microsoft.com/office/2019/extlst" xmlns:r="http://schemas.openxmlformats.org/officeDocument/2006/relationships" xmlns:wp14="http://schemas.microsoft.com/office/word/2010/wordprocessingDrawing" xmlns:wp="http://schemas.openxmlformats.org/drawingml/2006/wordprocessingDrawing" xmlns:wpg="http://schemas.microsoft.com/office/word/2010/wordprocessingGroup" xmlns:wpi="http://schemas.microsoft.com/office/word/2010/wordprocessingInk" xmlns:wps="http://schemas.microsoft.com/office/word/2010/wordprocessingShape" xmlns:o="urn:schemas-microsoft-com:office:office" xmlns:v="urn:schemas-microsoft-com:vml" xmlns:w10="urn:schemas-microsoft-com:office:word" xmlns:w="http://schemas.openxmlformats.org/wordprocessingml/2006/main" xmlns:w14="http://schemas.microsoft.com/office/word/2010/wordml" xmlns:w15="http://schemas.microsoft.com/office/word/2012/wordml" xmlns:w16cex="http://schemas.microsoft.com/office/word/2018/wordml/cex" xmlns:w16cid="http://schemas.microsoft.com/office/word/2016/wordml/cid" xmlns:w16="http://schemas.microsoft.com/office/word/2018/wordml" xmlns:w16sdtdh="http://schemas.microsoft.com/office/word/2020/wordml/sdtdatahash" xmlns:w16sdtfl="http://schemas.microsoft.com/office/word/2024/wordml/sdtformatlock" xmlns:w16se="http://schemas.microsoft.com/office/word/2015/wordml/symex" xmlns:w16du="http://schemas.microsoft.com/office/word/2023/wordml/word16du" xmlns:wne="http://schemas.microsoft.com/office/word/2006/wordml" mc:Ignorable="w14 w15 w16se w16cid w16 w16cex w16sdtdh w16sdtfl w16du wp14">
   <w:sdt>
     <w:sdtPr>
       <w:id w:val="1603763343"/>
@@ -5084,7 +5886,7 @@
 </file>
 
 <file path=word/footer2.xml><?xml version="1.0" encoding="utf-8"?>
-<w:ftr xmlns:wpc="http://schemas.microsoft.com/office/word/2010/wordprocessingCanvas" xmlns:cx="http://schemas.microsoft.com/office/drawing/2014/chartex" xmlns:cx1="http://schemas.microsoft.com/office/drawing/2015/9/8/chartex" xmlns:cx2="http://schemas.microsoft.com/office/drawing/2015/10/21/chartex" xmlns:cx3="http://schemas.microsoft.com/office/drawing/2016/5/9/chartex" xmlns:cx4="http://schemas.microsoft.com/office/drawing/2016/5/10/chartex" xmlns:cx5="http://schemas.microsoft.com/office/drawing/2016/5/11/chartex" xmlns:cx6="http://schemas.microsoft.com/office/drawing/2016/5/12/chartex" xmlns:cx7="http://schemas.microsoft.com/office/drawing/2016/5/13/chartex" xmlns:cx8="http://schemas.microsoft.com/office/drawing/2016/5/14/chartex" xmlns:mc="http://schemas.openxmlformats.org/markup-compatibility/2006" xmlns:aink="http://schemas.microsoft.com/office/drawing/2016/ink" xmlns:am3d="http://schemas.microsoft.com/office/drawing/2017/model3d" xmlns:o="urn:schemas-microsoft-com:office:office" xmlns:oel="http://schemas.microsoft.com/office/2019/extlst" xmlns:r="http://schemas.openxmlformats.org/officeDocument/2006/relationships" xmlns:m="http://schemas.openxmlformats.org/officeDocument/2006/math" xmlns:v="urn:schemas-microsoft-com:vml" xmlns:wp14="http://schemas.microsoft.com/office/word/2010/wordprocessingDrawing" xmlns:wp="http://schemas.openxmlformats.org/drawingml/2006/wordprocessingDrawing" xmlns:w10="urn:schemas-microsoft-com:office:word" xmlns:w="http://schemas.openxmlformats.org/wordprocessingml/2006/main" xmlns:w14="http://schemas.microsoft.com/office/word/2010/wordml" xmlns:w15="http://schemas.microsoft.com/office/word/2012/wordml" xmlns:w16cex="http://schemas.microsoft.com/office/word/2018/wordml/cex" xmlns:w16cid="http://schemas.microsoft.com/office/word/2016/wordml/cid" xmlns:w16="http://schemas.microsoft.com/office/word/2018/wordml" xmlns:w16du="http://schemas.microsoft.com/office/word/2023/wordml/word16du" xmlns:w16sdtdh="http://schemas.microsoft.com/office/word/2020/wordml/sdtdatahash" xmlns:w16sdtfl="http://schemas.microsoft.com/office/word/2024/wordml/sdtformatlock" xmlns:w16se="http://schemas.microsoft.com/office/word/2015/wordml/symex" xmlns:wpg="http://schemas.microsoft.com/office/word/2010/wordprocessingGroup" xmlns:wpi="http://schemas.microsoft.com/office/word/2010/wordprocessingInk" xmlns:wne="http://schemas.microsoft.com/office/word/2006/wordml" xmlns:wps="http://schemas.microsoft.com/office/word/2010/wordprocessingShape" mc:Ignorable="w14 w15 w16se w16cid w16 w16cex w16sdtdh w16sdtfl w16du wp14">
+<w:ftr xmlns:wpc="http://schemas.microsoft.com/office/word/2010/wordprocessingCanvas" xmlns:cx="http://schemas.microsoft.com/office/drawing/2014/chartex" xmlns:cx1="http://schemas.microsoft.com/office/drawing/2015/9/8/chartex" xmlns:cx2="http://schemas.microsoft.com/office/drawing/2015/10/21/chartex" xmlns:cx3="http://schemas.microsoft.com/office/drawing/2016/5/9/chartex" xmlns:cx4="http://schemas.microsoft.com/office/drawing/2016/5/10/chartex" xmlns:cx5="http://schemas.microsoft.com/office/drawing/2016/5/11/chartex" xmlns:cx6="http://schemas.microsoft.com/office/drawing/2016/5/12/chartex" xmlns:cx7="http://schemas.microsoft.com/office/drawing/2016/5/13/chartex" xmlns:cx8="http://schemas.microsoft.com/office/drawing/2016/5/14/chartex" xmlns:mc="http://schemas.openxmlformats.org/markup-compatibility/2006" xmlns:m="http://schemas.openxmlformats.org/officeDocument/2006/math" xmlns:aink="http://schemas.microsoft.com/office/drawing/2016/ink" xmlns:am3d="http://schemas.microsoft.com/office/drawing/2017/model3d" xmlns:oel="http://schemas.microsoft.com/office/2019/extlst" xmlns:r="http://schemas.openxmlformats.org/officeDocument/2006/relationships" xmlns:wp14="http://schemas.microsoft.com/office/word/2010/wordprocessingDrawing" xmlns:wp="http://schemas.openxmlformats.org/drawingml/2006/wordprocessingDrawing" xmlns:wpg="http://schemas.microsoft.com/office/word/2010/wordprocessingGroup" xmlns:wpi="http://schemas.microsoft.com/office/word/2010/wordprocessingInk" xmlns:wps="http://schemas.microsoft.com/office/word/2010/wordprocessingShape" xmlns:o="urn:schemas-microsoft-com:office:office" xmlns:v="urn:schemas-microsoft-com:vml" xmlns:w10="urn:schemas-microsoft-com:office:word" xmlns:w="http://schemas.openxmlformats.org/wordprocessingml/2006/main" xmlns:w14="http://schemas.microsoft.com/office/word/2010/wordml" xmlns:w15="http://schemas.microsoft.com/office/word/2012/wordml" xmlns:w16cex="http://schemas.microsoft.com/office/word/2018/wordml/cex" xmlns:w16cid="http://schemas.microsoft.com/office/word/2016/wordml/cid" xmlns:w16="http://schemas.microsoft.com/office/word/2018/wordml" xmlns:w16sdtdh="http://schemas.microsoft.com/office/word/2020/wordml/sdtdatahash" xmlns:w16sdtfl="http://schemas.microsoft.com/office/word/2024/wordml/sdtformatlock" xmlns:w16se="http://schemas.microsoft.com/office/word/2015/wordml/symex" xmlns:w16du="http://schemas.microsoft.com/office/word/2023/wordml/word16du" xmlns:wne="http://schemas.microsoft.com/office/word/2006/wordml" mc:Ignorable="w14 w15 w16se w16cid w16 w16cex w16sdtdh w16sdtfl w16du wp14">
   <w:sdt>
     <w:sdtPr>
       <w:id w:val="-9535277"/>
@@ -5147,7 +5949,7 @@
 </file>
 
 <file path=word/footnotes.xml><?xml version="1.0" encoding="utf-8"?>
-<w:footnotes xmlns:wpc="http://schemas.microsoft.com/office/word/2010/wordprocessingCanvas" xmlns:cx="http://schemas.microsoft.com/office/drawing/2014/chartex" xmlns:cx1="http://schemas.microsoft.com/office/drawing/2015/9/8/chartex" xmlns:cx2="http://schemas.microsoft.com/office/drawing/2015/10/21/chartex" xmlns:cx3="http://schemas.microsoft.com/office/drawing/2016/5/9/chartex" xmlns:cx4="http://schemas.microsoft.com/office/drawing/2016/5/10/chartex" xmlns:cx5="http://schemas.microsoft.com/office/drawing/2016/5/11/chartex" xmlns:cx6="http://schemas.microsoft.com/office/drawing/2016/5/12/chartex" xmlns:cx7="http://schemas.microsoft.com/office/drawing/2016/5/13/chartex" xmlns:cx8="http://schemas.microsoft.com/office/drawing/2016/5/14/chartex" xmlns:mc="http://schemas.openxmlformats.org/markup-compatibility/2006" xmlns:aink="http://schemas.microsoft.com/office/drawing/2016/ink" xmlns:am3d="http://schemas.microsoft.com/office/drawing/2017/model3d" xmlns:o="urn:schemas-microsoft-com:office:office" xmlns:oel="http://schemas.microsoft.com/office/2019/extlst" xmlns:r="http://schemas.openxmlformats.org/officeDocument/2006/relationships" xmlns:m="http://schemas.openxmlformats.org/officeDocument/2006/math" xmlns:v="urn:schemas-microsoft-com:vml" xmlns:wp14="http://schemas.microsoft.com/office/word/2010/wordprocessingDrawing" xmlns:wp="http://schemas.openxmlformats.org/drawingml/2006/wordprocessingDrawing" xmlns:w10="urn:schemas-microsoft-com:office:word" xmlns:w="http://schemas.openxmlformats.org/wordprocessingml/2006/main" xmlns:w14="http://schemas.microsoft.com/office/word/2010/wordml" xmlns:w15="http://schemas.microsoft.com/office/word/2012/wordml" xmlns:w16cex="http://schemas.microsoft.com/office/word/2018/wordml/cex" xmlns:w16cid="http://schemas.microsoft.com/office/word/2016/wordml/cid" xmlns:w16="http://schemas.microsoft.com/office/word/2018/wordml" xmlns:w16du="http://schemas.microsoft.com/office/word/2023/wordml/word16du" xmlns:w16sdtdh="http://schemas.microsoft.com/office/word/2020/wordml/sdtdatahash" xmlns:w16sdtfl="http://schemas.microsoft.com/office/word/2024/wordml/sdtformatlock" xmlns:w16se="http://schemas.microsoft.com/office/word/2015/wordml/symex" xmlns:wpg="http://schemas.microsoft.com/office/word/2010/wordprocessingGroup" xmlns:wpi="http://schemas.microsoft.com/office/word/2010/wordprocessingInk" xmlns:wne="http://schemas.microsoft.com/office/word/2006/wordml" xmlns:wps="http://schemas.microsoft.com/office/word/2010/wordprocessingShape" mc:Ignorable="w14 w15 w16se w16cid w16 w16cex w16sdtdh w16sdtfl w16du wp14">
+<w:footnotes xmlns:wpc="http://schemas.microsoft.com/office/word/2010/wordprocessingCanvas" xmlns:cx="http://schemas.microsoft.com/office/drawing/2014/chartex" xmlns:cx1="http://schemas.microsoft.com/office/drawing/2015/9/8/chartex" xmlns:cx2="http://schemas.microsoft.com/office/drawing/2015/10/21/chartex" xmlns:cx3="http://schemas.microsoft.com/office/drawing/2016/5/9/chartex" xmlns:cx4="http://schemas.microsoft.com/office/drawing/2016/5/10/chartex" xmlns:cx5="http://schemas.microsoft.com/office/drawing/2016/5/11/chartex" xmlns:cx6="http://schemas.microsoft.com/office/drawing/2016/5/12/chartex" xmlns:cx7="http://schemas.microsoft.com/office/drawing/2016/5/13/chartex" xmlns:cx8="http://schemas.microsoft.com/office/drawing/2016/5/14/chartex" xmlns:mc="http://schemas.openxmlformats.org/markup-compatibility/2006" xmlns:m="http://schemas.openxmlformats.org/officeDocument/2006/math" xmlns:aink="http://schemas.microsoft.com/office/drawing/2016/ink" xmlns:am3d="http://schemas.microsoft.com/office/drawing/2017/model3d" xmlns:oel="http://schemas.microsoft.com/office/2019/extlst" xmlns:r="http://schemas.openxmlformats.org/officeDocument/2006/relationships" xmlns:wp14="http://schemas.microsoft.com/office/word/2010/wordprocessingDrawing" xmlns:wp="http://schemas.openxmlformats.org/drawingml/2006/wordprocessingDrawing" xmlns:wpg="http://schemas.microsoft.com/office/word/2010/wordprocessingGroup" xmlns:wpi="http://schemas.microsoft.com/office/word/2010/wordprocessingInk" xmlns:wps="http://schemas.microsoft.com/office/word/2010/wordprocessingShape" xmlns:o="urn:schemas-microsoft-com:office:office" xmlns:v="urn:schemas-microsoft-com:vml" xmlns:w10="urn:schemas-microsoft-com:office:word" xmlns:w="http://schemas.openxmlformats.org/wordprocessingml/2006/main" xmlns:w14="http://schemas.microsoft.com/office/word/2010/wordml" xmlns:w15="http://schemas.microsoft.com/office/word/2012/wordml" xmlns:w16cex="http://schemas.microsoft.com/office/word/2018/wordml/cex" xmlns:w16cid="http://schemas.microsoft.com/office/word/2016/wordml/cid" xmlns:w16="http://schemas.microsoft.com/office/word/2018/wordml" xmlns:w16sdtdh="http://schemas.microsoft.com/office/word/2020/wordml/sdtdatahash" xmlns:w16sdtfl="http://schemas.microsoft.com/office/word/2024/wordml/sdtformatlock" xmlns:w16se="http://schemas.microsoft.com/office/word/2015/wordml/symex" xmlns:w16du="http://schemas.microsoft.com/office/word/2023/wordml/word16du" xmlns:wne="http://schemas.microsoft.com/office/word/2006/wordml" mc:Ignorable="w14 w15 w16se w16cid w16 w16cex w16sdtdh w16sdtfl w16du wp14">
   <w:footnote w:type="separator" w:id="-1">
     <w:p>
       <w:pPr>
@@ -5179,7 +5981,7 @@
 </file>
 
 <file path=word/header1.xml><?xml version="1.0" encoding="utf-8"?>
-<w:hdr xmlns:wpc="http://schemas.microsoft.com/office/word/2010/wordprocessingCanvas" xmlns:cx="http://schemas.microsoft.com/office/drawing/2014/chartex" xmlns:cx1="http://schemas.microsoft.com/office/drawing/2015/9/8/chartex" xmlns:cx2="http://schemas.microsoft.com/office/drawing/2015/10/21/chartex" xmlns:cx3="http://schemas.microsoft.com/office/drawing/2016/5/9/chartex" xmlns:cx4="http://schemas.microsoft.com/office/drawing/2016/5/10/chartex" xmlns:cx5="http://schemas.microsoft.com/office/drawing/2016/5/11/chartex" xmlns:cx6="http://schemas.microsoft.com/office/drawing/2016/5/12/chartex" xmlns:cx7="http://schemas.microsoft.com/office/drawing/2016/5/13/chartex" xmlns:cx8="http://schemas.microsoft.com/office/drawing/2016/5/14/chartex" xmlns:mc="http://schemas.openxmlformats.org/markup-compatibility/2006" xmlns:aink="http://schemas.microsoft.com/office/drawing/2016/ink" xmlns:am3d="http://schemas.microsoft.com/office/drawing/2017/model3d" xmlns:o="urn:schemas-microsoft-com:office:office" xmlns:oel="http://schemas.microsoft.com/office/2019/extlst" xmlns:r="http://schemas.openxmlformats.org/officeDocument/2006/relationships" xmlns:m="http://schemas.openxmlformats.org/officeDocument/2006/math" xmlns:v="urn:schemas-microsoft-com:vml" xmlns:wp14="http://schemas.microsoft.com/office/word/2010/wordprocessingDrawing" xmlns:wp="http://schemas.openxmlformats.org/drawingml/2006/wordprocessingDrawing" xmlns:w10="urn:schemas-microsoft-com:office:word" xmlns:w="http://schemas.openxmlformats.org/wordprocessingml/2006/main" xmlns:w14="http://schemas.microsoft.com/office/word/2010/wordml" xmlns:w15="http://schemas.microsoft.com/office/word/2012/wordml" xmlns:w16cex="http://schemas.microsoft.com/office/word/2018/wordml/cex" xmlns:w16cid="http://schemas.microsoft.com/office/word/2016/wordml/cid" xmlns:w16="http://schemas.microsoft.com/office/word/2018/wordml" xmlns:w16du="http://schemas.microsoft.com/office/word/2023/wordml/word16du" xmlns:w16sdtdh="http://schemas.microsoft.com/office/word/2020/wordml/sdtdatahash" xmlns:w16sdtfl="http://schemas.microsoft.com/office/word/2024/wordml/sdtformatlock" xmlns:w16se="http://schemas.microsoft.com/office/word/2015/wordml/symex" xmlns:wpg="http://schemas.microsoft.com/office/word/2010/wordprocessingGroup" xmlns:wpi="http://schemas.microsoft.com/office/word/2010/wordprocessingInk" xmlns:wne="http://schemas.microsoft.com/office/word/2006/wordml" xmlns:wps="http://schemas.microsoft.com/office/word/2010/wordprocessingShape" mc:Ignorable="w14 w15 w16se w16cid w16 w16cex w16sdtdh w16sdtfl w16du wp14">
+<w:hdr xmlns:wpc="http://schemas.microsoft.com/office/word/2010/wordprocessingCanvas" xmlns:cx="http://schemas.microsoft.com/office/drawing/2014/chartex" xmlns:cx1="http://schemas.microsoft.com/office/drawing/2015/9/8/chartex" xmlns:cx2="http://schemas.microsoft.com/office/drawing/2015/10/21/chartex" xmlns:cx3="http://schemas.microsoft.com/office/drawing/2016/5/9/chartex" xmlns:cx4="http://schemas.microsoft.com/office/drawing/2016/5/10/chartex" xmlns:cx5="http://schemas.microsoft.com/office/drawing/2016/5/11/chartex" xmlns:cx6="http://schemas.microsoft.com/office/drawing/2016/5/12/chartex" xmlns:cx7="http://schemas.microsoft.com/office/drawing/2016/5/13/chartex" xmlns:cx8="http://schemas.microsoft.com/office/drawing/2016/5/14/chartex" xmlns:mc="http://schemas.openxmlformats.org/markup-compatibility/2006" xmlns:m="http://schemas.openxmlformats.org/officeDocument/2006/math" xmlns:aink="http://schemas.microsoft.com/office/drawing/2016/ink" xmlns:am3d="http://schemas.microsoft.com/office/drawing/2017/model3d" xmlns:oel="http://schemas.microsoft.com/office/2019/extlst" xmlns:r="http://schemas.openxmlformats.org/officeDocument/2006/relationships" xmlns:wp14="http://schemas.microsoft.com/office/word/2010/wordprocessingDrawing" xmlns:wp="http://schemas.openxmlformats.org/drawingml/2006/wordprocessingDrawing" xmlns:wpg="http://schemas.microsoft.com/office/word/2010/wordprocessingGroup" xmlns:wpi="http://schemas.microsoft.com/office/word/2010/wordprocessingInk" xmlns:wps="http://schemas.microsoft.com/office/word/2010/wordprocessingShape" xmlns:o="urn:schemas-microsoft-com:office:office" xmlns:v="urn:schemas-microsoft-com:vml" xmlns:w10="urn:schemas-microsoft-com:office:word" xmlns:w="http://schemas.openxmlformats.org/wordprocessingml/2006/main" xmlns:w14="http://schemas.microsoft.com/office/word/2010/wordml" xmlns:w15="http://schemas.microsoft.com/office/word/2012/wordml" xmlns:w16cex="http://schemas.microsoft.com/office/word/2018/wordml/cex" xmlns:w16cid="http://schemas.microsoft.com/office/word/2016/wordml/cid" xmlns:w16="http://schemas.microsoft.com/office/word/2018/wordml" xmlns:w16sdtdh="http://schemas.microsoft.com/office/word/2020/wordml/sdtdatahash" xmlns:w16sdtfl="http://schemas.microsoft.com/office/word/2024/wordml/sdtformatlock" xmlns:w16se="http://schemas.microsoft.com/office/word/2015/wordml/symex" xmlns:w16du="http://schemas.microsoft.com/office/word/2023/wordml/word16du" xmlns:wne="http://schemas.microsoft.com/office/word/2006/wordml" mc:Ignorable="w14 w15 w16se w16cid w16 w16cex w16sdtdh w16sdtfl w16du wp14">
   <w:p>
     <w:pPr>
       <w:spacing w:line="264" w:lineRule="auto"/>
@@ -5308,7 +6110,7 @@
 </file>
 
 <file path=word/header2.xml><?xml version="1.0" encoding="utf-8"?>
-<w:hdr xmlns:wpc="http://schemas.microsoft.com/office/word/2010/wordprocessingCanvas" xmlns:cx="http://schemas.microsoft.com/office/drawing/2014/chartex" xmlns:cx1="http://schemas.microsoft.com/office/drawing/2015/9/8/chartex" xmlns:cx2="http://schemas.microsoft.com/office/drawing/2015/10/21/chartex" xmlns:cx3="http://schemas.microsoft.com/office/drawing/2016/5/9/chartex" xmlns:cx4="http://schemas.microsoft.com/office/drawing/2016/5/10/chartex" xmlns:cx5="http://schemas.microsoft.com/office/drawing/2016/5/11/chartex" xmlns:cx6="http://schemas.microsoft.com/office/drawing/2016/5/12/chartex" xmlns:cx7="http://schemas.microsoft.com/office/drawing/2016/5/13/chartex" xmlns:cx8="http://schemas.microsoft.com/office/drawing/2016/5/14/chartex" xmlns:mc="http://schemas.openxmlformats.org/markup-compatibility/2006" xmlns:aink="http://schemas.microsoft.com/office/drawing/2016/ink" xmlns:am3d="http://schemas.microsoft.com/office/drawing/2017/model3d" xmlns:o="urn:schemas-microsoft-com:office:office" xmlns:oel="http://schemas.microsoft.com/office/2019/extlst" xmlns:r="http://schemas.openxmlformats.org/officeDocument/2006/relationships" xmlns:m="http://schemas.openxmlformats.org/officeDocument/2006/math" xmlns:v="urn:schemas-microsoft-com:vml" xmlns:wp14="http://schemas.microsoft.com/office/word/2010/wordprocessingDrawing" xmlns:wp="http://schemas.openxmlformats.org/drawingml/2006/wordprocessingDrawing" xmlns:w10="urn:schemas-microsoft-com:office:word" xmlns:w="http://schemas.openxmlformats.org/wordprocessingml/2006/main" xmlns:w14="http://schemas.microsoft.com/office/word/2010/wordml" xmlns:w15="http://schemas.microsoft.com/office/word/2012/wordml" xmlns:w16cex="http://schemas.microsoft.com/office/word/2018/wordml/cex" xmlns:w16cid="http://schemas.microsoft.com/office/word/2016/wordml/cid" xmlns:w16="http://schemas.microsoft.com/office/word/2018/wordml" xmlns:w16du="http://schemas.microsoft.com/office/word/2023/wordml/word16du" xmlns:w16sdtdh="http://schemas.microsoft.com/office/word/2020/wordml/sdtdatahash" xmlns:w16sdtfl="http://schemas.microsoft.com/office/word/2024/wordml/sdtformatlock" xmlns:w16se="http://schemas.microsoft.com/office/word/2015/wordml/symex" xmlns:wpg="http://schemas.microsoft.com/office/word/2010/wordprocessingGroup" xmlns:wpi="http://schemas.microsoft.com/office/word/2010/wordprocessingInk" xmlns:wne="http://schemas.microsoft.com/office/word/2006/wordml" xmlns:wps="http://schemas.microsoft.com/office/word/2010/wordprocessingShape" mc:Ignorable="w14 w15 w16se w16cid w16 w16cex w16sdtdh w16sdtfl w16du wp14">
+<w:hdr xmlns:wpc="http://schemas.microsoft.com/office/word/2010/wordprocessingCanvas" xmlns:cx="http://schemas.microsoft.com/office/drawing/2014/chartex" xmlns:cx1="http://schemas.microsoft.com/office/drawing/2015/9/8/chartex" xmlns:cx2="http://schemas.microsoft.com/office/drawing/2015/10/21/chartex" xmlns:cx3="http://schemas.microsoft.com/office/drawing/2016/5/9/chartex" xmlns:cx4="http://schemas.microsoft.com/office/drawing/2016/5/10/chartex" xmlns:cx5="http://schemas.microsoft.com/office/drawing/2016/5/11/chartex" xmlns:cx6="http://schemas.microsoft.com/office/drawing/2016/5/12/chartex" xmlns:cx7="http://schemas.microsoft.com/office/drawing/2016/5/13/chartex" xmlns:cx8="http://schemas.microsoft.com/office/drawing/2016/5/14/chartex" xmlns:mc="http://schemas.openxmlformats.org/markup-compatibility/2006" xmlns:m="http://schemas.openxmlformats.org/officeDocument/2006/math" xmlns:aink="http://schemas.microsoft.com/office/drawing/2016/ink" xmlns:am3d="http://schemas.microsoft.com/office/drawing/2017/model3d" xmlns:oel="http://schemas.microsoft.com/office/2019/extlst" xmlns:r="http://schemas.openxmlformats.org/officeDocument/2006/relationships" xmlns:wp14="http://schemas.microsoft.com/office/word/2010/wordprocessingDrawing" xmlns:wp="http://schemas.openxmlformats.org/drawingml/2006/wordprocessingDrawing" xmlns:wpg="http://schemas.microsoft.com/office/word/2010/wordprocessingGroup" xmlns:wpi="http://schemas.microsoft.com/office/word/2010/wordprocessingInk" xmlns:wps="http://schemas.microsoft.com/office/word/2010/wordprocessingShape" xmlns:o="urn:schemas-microsoft-com:office:office" xmlns:v="urn:schemas-microsoft-com:vml" xmlns:w10="urn:schemas-microsoft-com:office:word" xmlns:w="http://schemas.openxmlformats.org/wordprocessingml/2006/main" xmlns:w14="http://schemas.microsoft.com/office/word/2010/wordml" xmlns:w15="http://schemas.microsoft.com/office/word/2012/wordml" xmlns:w16cex="http://schemas.microsoft.com/office/word/2018/wordml/cex" xmlns:w16cid="http://schemas.microsoft.com/office/word/2016/wordml/cid" xmlns:w16="http://schemas.microsoft.com/office/word/2018/wordml" xmlns:w16sdtdh="http://schemas.microsoft.com/office/word/2020/wordml/sdtdatahash" xmlns:w16sdtfl="http://schemas.microsoft.com/office/word/2024/wordml/sdtformatlock" xmlns:w16se="http://schemas.microsoft.com/office/word/2015/wordml/symex" xmlns:w16du="http://schemas.microsoft.com/office/word/2023/wordml/word16du" xmlns:wne="http://schemas.microsoft.com/office/word/2006/wordml" mc:Ignorable="w14 w15 w16se w16cid w16 w16cex w16sdtdh w16sdtfl w16du wp14">
   <w:p>
     <w:pPr>
       <w:pStyle w:val="Header"/>
@@ -5498,7 +6300,7 @@
 </file>
 
 <file path=word/numbering.xml><?xml version="1.0" encoding="utf-8"?>
-<w:numbering xmlns:wpc="http://schemas.microsoft.com/office/word/2010/wordprocessingCanvas" xmlns:cx="http://schemas.microsoft.com/office/drawing/2014/chartex" xmlns:cx1="http://schemas.microsoft.com/office/drawing/2015/9/8/chartex" xmlns:cx2="http://schemas.microsoft.com/office/drawing/2015/10/21/chartex" xmlns:cx3="http://schemas.microsoft.com/office/drawing/2016/5/9/chartex" xmlns:cx4="http://schemas.microsoft.com/office/drawing/2016/5/10/chartex" xmlns:cx5="http://schemas.microsoft.com/office/drawing/2016/5/11/chartex" xmlns:cx6="http://schemas.microsoft.com/office/drawing/2016/5/12/chartex" xmlns:cx7="http://schemas.microsoft.com/office/drawing/2016/5/13/chartex" xmlns:cx8="http://schemas.microsoft.com/office/drawing/2016/5/14/chartex" xmlns:mc="http://schemas.openxmlformats.org/markup-compatibility/2006" xmlns:aink="http://schemas.microsoft.com/office/drawing/2016/ink" xmlns:am3d="http://schemas.microsoft.com/office/drawing/2017/model3d" xmlns:o="urn:schemas-microsoft-com:office:office" xmlns:oel="http://schemas.microsoft.com/office/2019/extlst" xmlns:r="http://schemas.openxmlformats.org/officeDocument/2006/relationships" xmlns:m="http://schemas.openxmlformats.org/officeDocument/2006/math" xmlns:v="urn:schemas-microsoft-com:vml" xmlns:wp14="http://schemas.microsoft.com/office/word/2010/wordprocessingDrawing" xmlns:wp="http://schemas.openxmlformats.org/drawingml/2006/wordprocessingDrawing" xmlns:w10="urn:schemas-microsoft-com:office:word" xmlns:w="http://schemas.openxmlformats.org/wordprocessingml/2006/main" xmlns:w14="http://schemas.microsoft.com/office/word/2010/wordml" xmlns:w15="http://schemas.microsoft.com/office/word/2012/wordml" xmlns:w16cex="http://schemas.microsoft.com/office/word/2018/wordml/cex" xmlns:w16cid="http://schemas.microsoft.com/office/word/2016/wordml/cid" xmlns:w16="http://schemas.microsoft.com/office/word/2018/wordml" xmlns:w16du="http://schemas.microsoft.com/office/word/2023/wordml/word16du" xmlns:w16sdtdh="http://schemas.microsoft.com/office/word/2020/wordml/sdtdatahash" xmlns:w16sdtfl="http://schemas.microsoft.com/office/word/2024/wordml/sdtformatlock" xmlns:w16se="http://schemas.microsoft.com/office/word/2015/wordml/symex" xmlns:wpg="http://schemas.microsoft.com/office/word/2010/wordprocessingGroup" xmlns:wpi="http://schemas.microsoft.com/office/word/2010/wordprocessingInk" xmlns:wne="http://schemas.microsoft.com/office/word/2006/wordml" xmlns:wps="http://schemas.microsoft.com/office/word/2010/wordprocessingShape" mc:Ignorable="w14 w15 w16se w16cid w16 w16cex w16sdtdh w16sdtfl w16du wp14">
+<w:numbering xmlns:wpc="http://schemas.microsoft.com/office/word/2010/wordprocessingCanvas" xmlns:cx="http://schemas.microsoft.com/office/drawing/2014/chartex" xmlns:cx1="http://schemas.microsoft.com/office/drawing/2015/9/8/chartex" xmlns:cx2="http://schemas.microsoft.com/office/drawing/2015/10/21/chartex" xmlns:cx3="http://schemas.microsoft.com/office/drawing/2016/5/9/chartex" xmlns:cx4="http://schemas.microsoft.com/office/drawing/2016/5/10/chartex" xmlns:cx5="http://schemas.microsoft.com/office/drawing/2016/5/11/chartex" xmlns:cx6="http://schemas.microsoft.com/office/drawing/2016/5/12/chartex" xmlns:cx7="http://schemas.microsoft.com/office/drawing/2016/5/13/chartex" xmlns:cx8="http://schemas.microsoft.com/office/drawing/2016/5/14/chartex" xmlns:mc="http://schemas.openxmlformats.org/markup-compatibility/2006" xmlns:m="http://schemas.openxmlformats.org/officeDocument/2006/math" xmlns:aink="http://schemas.microsoft.com/office/drawing/2016/ink" xmlns:am3d="http://schemas.microsoft.com/office/drawing/2017/model3d" xmlns:oel="http://schemas.microsoft.com/office/2019/extlst" xmlns:r="http://schemas.openxmlformats.org/officeDocument/2006/relationships" xmlns:wp14="http://schemas.microsoft.com/office/word/2010/wordprocessingDrawing" xmlns:wp="http://schemas.openxmlformats.org/drawingml/2006/wordprocessingDrawing" xmlns:wpg="http://schemas.microsoft.com/office/word/2010/wordprocessingGroup" xmlns:wpi="http://schemas.microsoft.com/office/word/2010/wordprocessingInk" xmlns:wps="http://schemas.microsoft.com/office/word/2010/wordprocessingShape" xmlns:o="urn:schemas-microsoft-com:office:office" xmlns:v="urn:schemas-microsoft-com:vml" xmlns:w10="urn:schemas-microsoft-com:office:word" xmlns:w="http://schemas.openxmlformats.org/wordprocessingml/2006/main" xmlns:w14="http://schemas.microsoft.com/office/word/2010/wordml" xmlns:w15="http://schemas.microsoft.com/office/word/2012/wordml" xmlns:w16cex="http://schemas.microsoft.com/office/word/2018/wordml/cex" xmlns:w16cid="http://schemas.microsoft.com/office/word/2016/wordml/cid" xmlns:w16="http://schemas.microsoft.com/office/word/2018/wordml" xmlns:w16sdtdh="http://schemas.microsoft.com/office/word/2020/wordml/sdtdatahash" xmlns:w16sdtfl="http://schemas.microsoft.com/office/word/2024/wordml/sdtformatlock" xmlns:w16se="http://schemas.microsoft.com/office/word/2015/wordml/symex" xmlns:w16du="http://schemas.microsoft.com/office/word/2023/wordml/word16du" xmlns:wne="http://schemas.microsoft.com/office/word/2006/wordml" mc:Ignorable="w14 w15 w16se w16cid w16 w16cex w16sdtdh w16sdtfl w16du wp14">
   <w:abstractNum w:abstractNumId="0" w15:restartNumberingAfterBreak="0">
     <w:nsid w:val="079A5588"/>
     <w:multiLevelType w:val="hybridMultilevel"/>
@@ -5613,9 +6415,98 @@
     </w:lvl>
   </w:abstractNum>
   <w:abstractNum w:abstractNumId="1" w15:restartNumberingAfterBreak="0">
+    <w:nsid w:val="2FC42AE2"/>
+    <w:multiLevelType w:val="hybridMultilevel"/>
+    <w:tmpl w:val="33EE7790"/>
+    <w:lvl w:ilvl="0" w:tplc="FFFFFFFF">
+      <w:start w:val="1"/>
+      <w:numFmt w:val="decimal"/>
+      <w:lvlText w:val="%1."/>
+      <w:lvlJc w:val="left"/>
+      <w:pPr>
+        <w:ind w:left="720" w:hanging="360"/>
+      </w:pPr>
+      <w:rPr>
+        <w:rFonts w:hint="default"/>
+      </w:rPr>
+    </w:lvl>
+    <w:lvl w:ilvl="1" w:tplc="FFFFFFFF">
+      <w:start w:val="1"/>
+      <w:numFmt w:val="lowerLetter"/>
+      <w:lvlText w:val="%2."/>
+      <w:lvlJc w:val="left"/>
+      <w:pPr>
+        <w:ind w:left="1440" w:hanging="360"/>
+      </w:pPr>
+    </w:lvl>
+    <w:lvl w:ilvl="2" w:tplc="FFFFFFFF" w:tentative="1">
+      <w:start w:val="1"/>
+      <w:numFmt w:val="lowerRoman"/>
+      <w:lvlText w:val="%3."/>
+      <w:lvlJc w:val="right"/>
+      <w:pPr>
+        <w:ind w:left="2160" w:hanging="180"/>
+      </w:pPr>
+    </w:lvl>
+    <w:lvl w:ilvl="3" w:tplc="FFFFFFFF" w:tentative="1">
+      <w:start w:val="1"/>
+      <w:numFmt w:val="decimal"/>
+      <w:lvlText w:val="%4."/>
+      <w:lvlJc w:val="left"/>
+      <w:pPr>
+        <w:ind w:left="2880" w:hanging="360"/>
+      </w:pPr>
+    </w:lvl>
+    <w:lvl w:ilvl="4" w:tplc="FFFFFFFF" w:tentative="1">
+      <w:start w:val="1"/>
+      <w:numFmt w:val="lowerLetter"/>
+      <w:lvlText w:val="%5."/>
+      <w:lvlJc w:val="left"/>
+      <w:pPr>
+        <w:ind w:left="3600" w:hanging="360"/>
+      </w:pPr>
+    </w:lvl>
+    <w:lvl w:ilvl="5" w:tplc="FFFFFFFF" w:tentative="1">
+      <w:start w:val="1"/>
+      <w:numFmt w:val="lowerRoman"/>
+      <w:lvlText w:val="%6."/>
+      <w:lvlJc w:val="right"/>
+      <w:pPr>
+        <w:ind w:left="4320" w:hanging="180"/>
+      </w:pPr>
+    </w:lvl>
+    <w:lvl w:ilvl="6" w:tplc="FFFFFFFF" w:tentative="1">
+      <w:start w:val="1"/>
+      <w:numFmt w:val="decimal"/>
+      <w:lvlText w:val="%7."/>
+      <w:lvlJc w:val="left"/>
+      <w:pPr>
+        <w:ind w:left="5040" w:hanging="360"/>
+      </w:pPr>
+    </w:lvl>
+    <w:lvl w:ilvl="7" w:tplc="FFFFFFFF" w:tentative="1">
+      <w:start w:val="1"/>
+      <w:numFmt w:val="lowerLetter"/>
+      <w:lvlText w:val="%8."/>
+      <w:lvlJc w:val="left"/>
+      <w:pPr>
+        <w:ind w:left="5760" w:hanging="360"/>
+      </w:pPr>
+    </w:lvl>
+    <w:lvl w:ilvl="8" w:tplc="FFFFFFFF" w:tentative="1">
+      <w:start w:val="1"/>
+      <w:numFmt w:val="lowerRoman"/>
+      <w:lvlText w:val="%9."/>
+      <w:lvlJc w:val="right"/>
+      <w:pPr>
+        <w:ind w:left="6480" w:hanging="180"/>
+      </w:pPr>
+    </w:lvl>
+  </w:abstractNum>
+  <w:abstractNum w:abstractNumId="2" w15:restartNumberingAfterBreak="0">
     <w:nsid w:val="322A3B41"/>
     <w:multiLevelType w:val="hybridMultilevel"/>
-    <w:tmpl w:val="359ADB68"/>
+    <w:tmpl w:val="33EE7790"/>
     <w:lvl w:ilvl="0" w:tplc="0409000F">
       <w:start w:val="1"/>
       <w:numFmt w:val="decimal"/>
@@ -5623,6 +6514,95 @@
       <w:lvlJc w:val="left"/>
       <w:pPr>
         <w:ind w:left="720" w:hanging="360"/>
+      </w:pPr>
+      <w:rPr>
+        <w:rFonts w:hint="default"/>
+      </w:rPr>
+    </w:lvl>
+    <w:lvl w:ilvl="1" w:tplc="04090019">
+      <w:start w:val="1"/>
+      <w:numFmt w:val="lowerLetter"/>
+      <w:lvlText w:val="%2."/>
+      <w:lvlJc w:val="left"/>
+      <w:pPr>
+        <w:ind w:left="1440" w:hanging="360"/>
+      </w:pPr>
+    </w:lvl>
+    <w:lvl w:ilvl="2" w:tplc="0409001B" w:tentative="1">
+      <w:start w:val="1"/>
+      <w:numFmt w:val="lowerRoman"/>
+      <w:lvlText w:val="%3."/>
+      <w:lvlJc w:val="right"/>
+      <w:pPr>
+        <w:ind w:left="2160" w:hanging="180"/>
+      </w:pPr>
+    </w:lvl>
+    <w:lvl w:ilvl="3" w:tplc="0409000F" w:tentative="1">
+      <w:start w:val="1"/>
+      <w:numFmt w:val="decimal"/>
+      <w:lvlText w:val="%4."/>
+      <w:lvlJc w:val="left"/>
+      <w:pPr>
+        <w:ind w:left="2880" w:hanging="360"/>
+      </w:pPr>
+    </w:lvl>
+    <w:lvl w:ilvl="4" w:tplc="04090019" w:tentative="1">
+      <w:start w:val="1"/>
+      <w:numFmt w:val="lowerLetter"/>
+      <w:lvlText w:val="%5."/>
+      <w:lvlJc w:val="left"/>
+      <w:pPr>
+        <w:ind w:left="3600" w:hanging="360"/>
+      </w:pPr>
+    </w:lvl>
+    <w:lvl w:ilvl="5" w:tplc="0409001B" w:tentative="1">
+      <w:start w:val="1"/>
+      <w:numFmt w:val="lowerRoman"/>
+      <w:lvlText w:val="%6."/>
+      <w:lvlJc w:val="right"/>
+      <w:pPr>
+        <w:ind w:left="4320" w:hanging="180"/>
+      </w:pPr>
+    </w:lvl>
+    <w:lvl w:ilvl="6" w:tplc="0409000F" w:tentative="1">
+      <w:start w:val="1"/>
+      <w:numFmt w:val="decimal"/>
+      <w:lvlText w:val="%7."/>
+      <w:lvlJc w:val="left"/>
+      <w:pPr>
+        <w:ind w:left="5040" w:hanging="360"/>
+      </w:pPr>
+    </w:lvl>
+    <w:lvl w:ilvl="7" w:tplc="04090019" w:tentative="1">
+      <w:start w:val="1"/>
+      <w:numFmt w:val="lowerLetter"/>
+      <w:lvlText w:val="%8."/>
+      <w:lvlJc w:val="left"/>
+      <w:pPr>
+        <w:ind w:left="5760" w:hanging="360"/>
+      </w:pPr>
+    </w:lvl>
+    <w:lvl w:ilvl="8" w:tplc="0409001B" w:tentative="1">
+      <w:start w:val="1"/>
+      <w:numFmt w:val="lowerRoman"/>
+      <w:lvlText w:val="%9."/>
+      <w:lvlJc w:val="right"/>
+      <w:pPr>
+        <w:ind w:left="6480" w:hanging="180"/>
+      </w:pPr>
+    </w:lvl>
+  </w:abstractNum>
+  <w:abstractNum w:abstractNumId="3" w15:restartNumberingAfterBreak="0">
+    <w:nsid w:val="41731541"/>
+    <w:multiLevelType w:val="hybridMultilevel"/>
+    <w:tmpl w:val="262EFC22"/>
+    <w:lvl w:ilvl="0" w:tplc="FFFFFFFF">
+      <w:start w:val="1"/>
+      <w:numFmt w:val="decimal"/>
+      <w:lvlText w:val="%1."/>
+      <w:lvlJc w:val="left"/>
+      <w:pPr>
+        <w:ind w:left="1440" w:hanging="360"/>
       </w:pPr>
       <w:rPr>
         <w:rFonts w:hint="default"/>
@@ -5634,7 +6614,7 @@
       <w:lvlText w:val="%2."/>
       <w:lvlJc w:val="left"/>
       <w:pPr>
-        <w:ind w:left="1440" w:hanging="360"/>
+        <w:ind w:left="2160" w:hanging="360"/>
       </w:pPr>
     </w:lvl>
     <w:lvl w:ilvl="2" w:tplc="0409001B" w:tentative="1">
@@ -5643,7 +6623,7 @@
       <w:lvlText w:val="%3."/>
       <w:lvlJc w:val="right"/>
       <w:pPr>
-        <w:ind w:left="2160" w:hanging="180"/>
+        <w:ind w:left="2880" w:hanging="180"/>
       </w:pPr>
     </w:lvl>
     <w:lvl w:ilvl="3" w:tplc="0409000F" w:tentative="1">
@@ -5652,7 +6632,7 @@
       <w:lvlText w:val="%4."/>
       <w:lvlJc w:val="left"/>
       <w:pPr>
-        <w:ind w:left="2880" w:hanging="360"/>
+        <w:ind w:left="3600" w:hanging="360"/>
       </w:pPr>
     </w:lvl>
     <w:lvl w:ilvl="4" w:tplc="04090019" w:tentative="1">
@@ -5661,7 +6641,7 @@
       <w:lvlText w:val="%5."/>
       <w:lvlJc w:val="left"/>
       <w:pPr>
-        <w:ind w:left="3600" w:hanging="360"/>
+        <w:ind w:left="4320" w:hanging="360"/>
       </w:pPr>
     </w:lvl>
     <w:lvl w:ilvl="5" w:tplc="0409001B" w:tentative="1">
@@ -5670,7 +6650,7 @@
       <w:lvlText w:val="%6."/>
       <w:lvlJc w:val="right"/>
       <w:pPr>
-        <w:ind w:left="4320" w:hanging="180"/>
+        <w:ind w:left="5040" w:hanging="180"/>
       </w:pPr>
     </w:lvl>
     <w:lvl w:ilvl="6" w:tplc="0409000F" w:tentative="1">
@@ -5679,7 +6659,7 @@
       <w:lvlText w:val="%7."/>
       <w:lvlJc w:val="left"/>
       <w:pPr>
-        <w:ind w:left="5040" w:hanging="360"/>
+        <w:ind w:left="5760" w:hanging="360"/>
       </w:pPr>
     </w:lvl>
     <w:lvl w:ilvl="7" w:tplc="04090019" w:tentative="1">
@@ -5688,7 +6668,7 @@
       <w:lvlText w:val="%8."/>
       <w:lvlJc w:val="left"/>
       <w:pPr>
-        <w:ind w:left="5760" w:hanging="360"/>
+        <w:ind w:left="6480" w:hanging="360"/>
       </w:pPr>
     </w:lvl>
     <w:lvl w:ilvl="8" w:tplc="0409001B" w:tentative="1">
@@ -5697,11 +6677,11 @@
       <w:lvlText w:val="%9."/>
       <w:lvlJc w:val="right"/>
       <w:pPr>
-        <w:ind w:left="6480" w:hanging="180"/>
+        <w:ind w:left="7200" w:hanging="180"/>
       </w:pPr>
     </w:lvl>
   </w:abstractNum>
-  <w:abstractNum w:abstractNumId="2" w15:restartNumberingAfterBreak="0">
+  <w:abstractNum w:abstractNumId="4" w15:restartNumberingAfterBreak="0">
     <w:nsid w:val="446935A6"/>
     <w:multiLevelType w:val="hybridMultilevel"/>
     <w:tmpl w:val="A41E7A6C"/>
@@ -5814,7 +6794,206 @@
       </w:rPr>
     </w:lvl>
   </w:abstractNum>
-  <w:abstractNum w:abstractNumId="3" w15:restartNumberingAfterBreak="0">
+  <w:abstractNum w:abstractNumId="5" w15:restartNumberingAfterBreak="0">
+    <w:nsid w:val="5B687A09"/>
+    <w:multiLevelType w:val="hybridMultilevel"/>
+    <w:tmpl w:val="E6E0ABFC"/>
+    <w:lvl w:ilvl="0" w:tplc="0409000F">
+      <w:start w:val="1"/>
+      <w:numFmt w:val="decimal"/>
+      <w:lvlText w:val="%1."/>
+      <w:lvlJc w:val="left"/>
+      <w:pPr>
+        <w:ind w:left="360" w:hanging="360"/>
+      </w:pPr>
+    </w:lvl>
+    <w:lvl w:ilvl="1" w:tplc="04090019" w:tentative="1">
+      <w:start w:val="1"/>
+      <w:numFmt w:val="lowerLetter"/>
+      <w:lvlText w:val="%2."/>
+      <w:lvlJc w:val="left"/>
+      <w:pPr>
+        <w:ind w:left="1080" w:hanging="360"/>
+      </w:pPr>
+    </w:lvl>
+    <w:lvl w:ilvl="2" w:tplc="0409001B" w:tentative="1">
+      <w:start w:val="1"/>
+      <w:numFmt w:val="lowerRoman"/>
+      <w:lvlText w:val="%3."/>
+      <w:lvlJc w:val="right"/>
+      <w:pPr>
+        <w:ind w:left="1800" w:hanging="180"/>
+      </w:pPr>
+    </w:lvl>
+    <w:lvl w:ilvl="3" w:tplc="0409000F" w:tentative="1">
+      <w:start w:val="1"/>
+      <w:numFmt w:val="decimal"/>
+      <w:lvlText w:val="%4."/>
+      <w:lvlJc w:val="left"/>
+      <w:pPr>
+        <w:ind w:left="2520" w:hanging="360"/>
+      </w:pPr>
+    </w:lvl>
+    <w:lvl w:ilvl="4" w:tplc="04090019" w:tentative="1">
+      <w:start w:val="1"/>
+      <w:numFmt w:val="lowerLetter"/>
+      <w:lvlText w:val="%5."/>
+      <w:lvlJc w:val="left"/>
+      <w:pPr>
+        <w:ind w:left="3240" w:hanging="360"/>
+      </w:pPr>
+    </w:lvl>
+    <w:lvl w:ilvl="5" w:tplc="0409001B" w:tentative="1">
+      <w:start w:val="1"/>
+      <w:numFmt w:val="lowerRoman"/>
+      <w:lvlText w:val="%6."/>
+      <w:lvlJc w:val="right"/>
+      <w:pPr>
+        <w:ind w:left="3960" w:hanging="180"/>
+      </w:pPr>
+    </w:lvl>
+    <w:lvl w:ilvl="6" w:tplc="0409000F" w:tentative="1">
+      <w:start w:val="1"/>
+      <w:numFmt w:val="decimal"/>
+      <w:lvlText w:val="%7."/>
+      <w:lvlJc w:val="left"/>
+      <w:pPr>
+        <w:ind w:left="4680" w:hanging="360"/>
+      </w:pPr>
+    </w:lvl>
+    <w:lvl w:ilvl="7" w:tplc="04090019" w:tentative="1">
+      <w:start w:val="1"/>
+      <w:numFmt w:val="lowerLetter"/>
+      <w:lvlText w:val="%8."/>
+      <w:lvlJc w:val="left"/>
+      <w:pPr>
+        <w:ind w:left="5400" w:hanging="360"/>
+      </w:pPr>
+    </w:lvl>
+    <w:lvl w:ilvl="8" w:tplc="0409001B" w:tentative="1">
+      <w:start w:val="1"/>
+      <w:numFmt w:val="lowerRoman"/>
+      <w:lvlText w:val="%9."/>
+      <w:lvlJc w:val="right"/>
+      <w:pPr>
+        <w:ind w:left="6120" w:hanging="180"/>
+      </w:pPr>
+    </w:lvl>
+  </w:abstractNum>
+  <w:abstractNum w:abstractNumId="6" w15:restartNumberingAfterBreak="0">
+    <w:nsid w:val="644E44C9"/>
+    <w:multiLevelType w:val="hybridMultilevel"/>
+    <w:tmpl w:val="49E2BCDE"/>
+    <w:lvl w:ilvl="0" w:tplc="04090001">
+      <w:start w:val="1"/>
+      <w:numFmt w:val="bullet"/>
+      <w:lvlText w:val=""/>
+      <w:lvlJc w:val="left"/>
+      <w:pPr>
+        <w:ind w:left="1080" w:hanging="360"/>
+      </w:pPr>
+      <w:rPr>
+        <w:rFonts w:ascii="Symbol" w:hAnsi="Symbol" w:hint="default"/>
+      </w:rPr>
+    </w:lvl>
+    <w:lvl w:ilvl="1" w:tplc="04090003">
+      <w:start w:val="1"/>
+      <w:numFmt w:val="bullet"/>
+      <w:lvlText w:val="o"/>
+      <w:lvlJc w:val="left"/>
+      <w:pPr>
+        <w:ind w:left="1800" w:hanging="360"/>
+      </w:pPr>
+      <w:rPr>
+        <w:rFonts w:ascii="Courier New" w:hAnsi="Courier New" w:cs="Courier New" w:hint="default"/>
+      </w:rPr>
+    </w:lvl>
+    <w:lvl w:ilvl="2" w:tplc="04090005" w:tentative="1">
+      <w:start w:val="1"/>
+      <w:numFmt w:val="bullet"/>
+      <w:lvlText w:val=""/>
+      <w:lvlJc w:val="left"/>
+      <w:pPr>
+        <w:ind w:left="2520" w:hanging="360"/>
+      </w:pPr>
+      <w:rPr>
+        <w:rFonts w:ascii="Wingdings" w:hAnsi="Wingdings" w:hint="default"/>
+      </w:rPr>
+    </w:lvl>
+    <w:lvl w:ilvl="3" w:tplc="04090001" w:tentative="1">
+      <w:start w:val="1"/>
+      <w:numFmt w:val="bullet"/>
+      <w:lvlText w:val=""/>
+      <w:lvlJc w:val="left"/>
+      <w:pPr>
+        <w:ind w:left="3240" w:hanging="360"/>
+      </w:pPr>
+      <w:rPr>
+        <w:rFonts w:ascii="Symbol" w:hAnsi="Symbol" w:hint="default"/>
+      </w:rPr>
+    </w:lvl>
+    <w:lvl w:ilvl="4" w:tplc="04090003" w:tentative="1">
+      <w:start w:val="1"/>
+      <w:numFmt w:val="bullet"/>
+      <w:lvlText w:val="o"/>
+      <w:lvlJc w:val="left"/>
+      <w:pPr>
+        <w:ind w:left="3960" w:hanging="360"/>
+      </w:pPr>
+      <w:rPr>
+        <w:rFonts w:ascii="Courier New" w:hAnsi="Courier New" w:cs="Courier New" w:hint="default"/>
+      </w:rPr>
+    </w:lvl>
+    <w:lvl w:ilvl="5" w:tplc="04090005" w:tentative="1">
+      <w:start w:val="1"/>
+      <w:numFmt w:val="bullet"/>
+      <w:lvlText w:val=""/>
+      <w:lvlJc w:val="left"/>
+      <w:pPr>
+        <w:ind w:left="4680" w:hanging="360"/>
+      </w:pPr>
+      <w:rPr>
+        <w:rFonts w:ascii="Wingdings" w:hAnsi="Wingdings" w:hint="default"/>
+      </w:rPr>
+    </w:lvl>
+    <w:lvl w:ilvl="6" w:tplc="04090001" w:tentative="1">
+      <w:start w:val="1"/>
+      <w:numFmt w:val="bullet"/>
+      <w:lvlText w:val=""/>
+      <w:lvlJc w:val="left"/>
+      <w:pPr>
+        <w:ind w:left="5400" w:hanging="360"/>
+      </w:pPr>
+      <w:rPr>
+        <w:rFonts w:ascii="Symbol" w:hAnsi="Symbol" w:hint="default"/>
+      </w:rPr>
+    </w:lvl>
+    <w:lvl w:ilvl="7" w:tplc="04090003" w:tentative="1">
+      <w:start w:val="1"/>
+      <w:numFmt w:val="bullet"/>
+      <w:lvlText w:val="o"/>
+      <w:lvlJc w:val="left"/>
+      <w:pPr>
+        <w:ind w:left="6120" w:hanging="360"/>
+      </w:pPr>
+      <w:rPr>
+        <w:rFonts w:ascii="Courier New" w:hAnsi="Courier New" w:cs="Courier New" w:hint="default"/>
+      </w:rPr>
+    </w:lvl>
+    <w:lvl w:ilvl="8" w:tplc="04090005" w:tentative="1">
+      <w:start w:val="1"/>
+      <w:numFmt w:val="bullet"/>
+      <w:lvlText w:val=""/>
+      <w:lvlJc w:val="left"/>
+      <w:pPr>
+        <w:ind w:left="6840" w:hanging="360"/>
+      </w:pPr>
+      <w:rPr>
+        <w:rFonts w:ascii="Wingdings" w:hAnsi="Wingdings" w:hint="default"/>
+      </w:rPr>
+    </w:lvl>
+  </w:abstractNum>
+  <w:abstractNum w:abstractNumId="7" w15:restartNumberingAfterBreak="0">
     <w:nsid w:val="7ABF36DF"/>
     <w:multiLevelType w:val="multilevel"/>
     <w:tmpl w:val="04090025"/>
@@ -5910,23 +7089,35 @@
     </w:lvl>
   </w:abstractNum>
   <w:num w:numId="1" w16cid:durableId="1395007836">
-    <w:abstractNumId w:val="3"/>
+    <w:abstractNumId w:val="7"/>
   </w:num>
   <w:num w:numId="2" w16cid:durableId="383524221">
     <w:abstractNumId w:val="0"/>
   </w:num>
   <w:num w:numId="3" w16cid:durableId="1856382266">
+    <w:abstractNumId w:val="2"/>
+  </w:num>
+  <w:num w:numId="4" w16cid:durableId="710884847">
+    <w:abstractNumId w:val="4"/>
+  </w:num>
+  <w:num w:numId="5" w16cid:durableId="537548998">
+    <w:abstractNumId w:val="5"/>
+  </w:num>
+  <w:num w:numId="6" w16cid:durableId="1662585674">
     <w:abstractNumId w:val="1"/>
   </w:num>
-  <w:num w:numId="4" w16cid:durableId="710884847">
-    <w:abstractNumId w:val="2"/>
+  <w:num w:numId="7" w16cid:durableId="2124421459">
+    <w:abstractNumId w:val="3"/>
+  </w:num>
+  <w:num w:numId="8" w16cid:durableId="341782233">
+    <w:abstractNumId w:val="6"/>
   </w:num>
   <w:numIdMacAtCleanup w:val="3"/>
 </w:numbering>
 </file>
 
 <file path=word/styles.xml><?xml version="1.0" encoding="utf-8"?>
-<w:styles xmlns:mc="http://schemas.openxmlformats.org/markup-compatibility/2006" xmlns:r="http://schemas.openxmlformats.org/officeDocument/2006/relationships" xmlns:w="http://schemas.openxmlformats.org/wordprocessingml/2006/main" xmlns:w14="http://schemas.microsoft.com/office/word/2010/wordml" xmlns:w15="http://schemas.microsoft.com/office/word/2012/wordml" xmlns:w16cex="http://schemas.microsoft.com/office/word/2018/wordml/cex" xmlns:w16cid="http://schemas.microsoft.com/office/word/2016/wordml/cid" xmlns:w16="http://schemas.microsoft.com/office/word/2018/wordml" xmlns:w16du="http://schemas.microsoft.com/office/word/2023/wordml/word16du" xmlns:w16sdtdh="http://schemas.microsoft.com/office/word/2020/wordml/sdtdatahash" xmlns:w16sdtfl="http://schemas.microsoft.com/office/word/2024/wordml/sdtformatlock" xmlns:w16se="http://schemas.microsoft.com/office/word/2015/wordml/symex" mc:Ignorable="w14 w15 w16se w16cid w16 w16cex w16sdtdh w16sdtfl w16du">
+<w:styles xmlns:mc="http://schemas.openxmlformats.org/markup-compatibility/2006" xmlns:r="http://schemas.openxmlformats.org/officeDocument/2006/relationships" xmlns:w="http://schemas.openxmlformats.org/wordprocessingml/2006/main" xmlns:w14="http://schemas.microsoft.com/office/word/2010/wordml" xmlns:w15="http://schemas.microsoft.com/office/word/2012/wordml" xmlns:w16cex="http://schemas.microsoft.com/office/word/2018/wordml/cex" xmlns:w16cid="http://schemas.microsoft.com/office/word/2016/wordml/cid" xmlns:w16="http://schemas.microsoft.com/office/word/2018/wordml" xmlns:w16sdtdh="http://schemas.microsoft.com/office/word/2020/wordml/sdtdatahash" xmlns:w16sdtfl="http://schemas.microsoft.com/office/word/2024/wordml/sdtformatlock" xmlns:w16se="http://schemas.microsoft.com/office/word/2015/wordml/symex" xmlns:w16du="http://schemas.microsoft.com/office/word/2023/wordml/word16du" mc:Ignorable="w14 w15 w16se w16cid w16 w16cex w16sdtdh w16sdtfl w16du">
   <w:docDefaults>
     <w:rPrDefault>
       <w:rPr>
@@ -7314,11 +8505,63 @@
     <w:basedOn w:val="DefaultParagraphFont"/>
     <w:rsid w:val="007751DA"/>
   </w:style>
+  <w:style w:type="paragraph" w:styleId="HTMLPreformatted">
+    <w:name w:val="HTML Preformatted"/>
+    <w:basedOn w:val="Normal"/>
+    <w:link w:val="HTMLPreformattedChar"/>
+    <w:uiPriority w:val="99"/>
+    <w:semiHidden/>
+    <w:unhideWhenUsed/>
+    <w:rsid w:val="009830A3"/>
+    <w:pPr>
+      <w:tabs>
+        <w:tab w:val="left" w:pos="916"/>
+        <w:tab w:val="left" w:pos="1832"/>
+        <w:tab w:val="left" w:pos="2748"/>
+        <w:tab w:val="left" w:pos="3664"/>
+        <w:tab w:val="left" w:pos="4580"/>
+        <w:tab w:val="left" w:pos="5496"/>
+        <w:tab w:val="left" w:pos="6412"/>
+        <w:tab w:val="left" w:pos="7328"/>
+        <w:tab w:val="left" w:pos="8244"/>
+        <w:tab w:val="left" w:pos="9160"/>
+        <w:tab w:val="left" w:pos="10076"/>
+        <w:tab w:val="left" w:pos="10992"/>
+        <w:tab w:val="left" w:pos="11908"/>
+        <w:tab w:val="left" w:pos="12824"/>
+        <w:tab w:val="left" w:pos="13740"/>
+        <w:tab w:val="left" w:pos="14656"/>
+      </w:tabs>
+      <w:spacing w:after="0" w:line="240" w:lineRule="auto"/>
+    </w:pPr>
+    <w:rPr>
+      <w:rFonts w:ascii="Courier New" w:eastAsia="Times New Roman" w:hAnsi="Courier New" w:cs="Courier New"/>
+      <w:kern w:val="0"/>
+      <w:sz w:val="20"/>
+      <w:szCs w:val="20"/>
+      <w14:ligatures w14:val="none"/>
+    </w:rPr>
+  </w:style>
+  <w:style w:type="character" w:customStyle="1" w:styleId="HTMLPreformattedChar">
+    <w:name w:val="HTML Preformatted Char"/>
+    <w:basedOn w:val="DefaultParagraphFont"/>
+    <w:link w:val="HTMLPreformatted"/>
+    <w:uiPriority w:val="99"/>
+    <w:semiHidden/>
+    <w:rsid w:val="009830A3"/>
+    <w:rPr>
+      <w:rFonts w:ascii="Courier New" w:eastAsia="Times New Roman" w:hAnsi="Courier New" w:cs="Courier New"/>
+      <w:kern w:val="0"/>
+      <w:sz w:val="20"/>
+      <w:szCs w:val="20"/>
+      <w14:ligatures w14:val="none"/>
+    </w:rPr>
+  </w:style>
 </w:styles>
 </file>
 
 <file path=word/glossary/document.xml><?xml version="1.0" encoding="utf-8"?>
-<w:glossaryDocument xmlns:wpc="http://schemas.microsoft.com/office/word/2010/wordprocessingCanvas" xmlns:cx="http://schemas.microsoft.com/office/drawing/2014/chartex" xmlns:cx1="http://schemas.microsoft.com/office/drawing/2015/9/8/chartex" xmlns:cx2="http://schemas.microsoft.com/office/drawing/2015/10/21/chartex" xmlns:cx3="http://schemas.microsoft.com/office/drawing/2016/5/9/chartex" xmlns:cx4="http://schemas.microsoft.com/office/drawing/2016/5/10/chartex" xmlns:cx5="http://schemas.microsoft.com/office/drawing/2016/5/11/chartex" xmlns:cx6="http://schemas.microsoft.com/office/drawing/2016/5/12/chartex" xmlns:cx7="http://schemas.microsoft.com/office/drawing/2016/5/13/chartex" xmlns:cx8="http://schemas.microsoft.com/office/drawing/2016/5/14/chartex" xmlns:mc="http://schemas.openxmlformats.org/markup-compatibility/2006" xmlns:aink="http://schemas.microsoft.com/office/drawing/2016/ink" xmlns:am3d="http://schemas.microsoft.com/office/drawing/2017/model3d" xmlns:o="urn:schemas-microsoft-com:office:office" xmlns:oel="http://schemas.microsoft.com/office/2019/extlst" xmlns:r="http://schemas.openxmlformats.org/officeDocument/2006/relationships" xmlns:m="http://schemas.openxmlformats.org/officeDocument/2006/math" xmlns:v="urn:schemas-microsoft-com:vml" xmlns:wp14="http://schemas.microsoft.com/office/word/2010/wordprocessingDrawing" xmlns:wp="http://schemas.openxmlformats.org/drawingml/2006/wordprocessingDrawing" xmlns:w10="urn:schemas-microsoft-com:office:word" xmlns:w="http://schemas.openxmlformats.org/wordprocessingml/2006/main" xmlns:w14="http://schemas.microsoft.com/office/word/2010/wordml" xmlns:w15="http://schemas.microsoft.com/office/word/2012/wordml" xmlns:w16cex="http://schemas.microsoft.com/office/word/2018/wordml/cex" xmlns:w16cid="http://schemas.microsoft.com/office/word/2016/wordml/cid" xmlns:w16="http://schemas.microsoft.com/office/word/2018/wordml" xmlns:w16du="http://schemas.microsoft.com/office/word/2023/wordml/word16du" xmlns:w16sdtdh="http://schemas.microsoft.com/office/word/2020/wordml/sdtdatahash" xmlns:w16sdtfl="http://schemas.microsoft.com/office/word/2024/wordml/sdtformatlock" xmlns:w16se="http://schemas.microsoft.com/office/word/2015/wordml/symex" xmlns:wpg="http://schemas.microsoft.com/office/word/2010/wordprocessingGroup" xmlns:wpi="http://schemas.microsoft.com/office/word/2010/wordprocessingInk" xmlns:wne="http://schemas.microsoft.com/office/word/2006/wordml" xmlns:wps="http://schemas.microsoft.com/office/word/2010/wordprocessingShape" mc:Ignorable="w14 w15 w16se w16cid w16 w16cex w16sdtdh w16sdtfl w16du wp14">
+<w:glossaryDocument xmlns:wpc="http://schemas.microsoft.com/office/word/2010/wordprocessingCanvas" xmlns:cx="http://schemas.microsoft.com/office/drawing/2014/chartex" xmlns:cx1="http://schemas.microsoft.com/office/drawing/2015/9/8/chartex" xmlns:cx2="http://schemas.microsoft.com/office/drawing/2015/10/21/chartex" xmlns:cx3="http://schemas.microsoft.com/office/drawing/2016/5/9/chartex" xmlns:cx4="http://schemas.microsoft.com/office/drawing/2016/5/10/chartex" xmlns:cx5="http://schemas.microsoft.com/office/drawing/2016/5/11/chartex" xmlns:cx6="http://schemas.microsoft.com/office/drawing/2016/5/12/chartex" xmlns:cx7="http://schemas.microsoft.com/office/drawing/2016/5/13/chartex" xmlns:cx8="http://schemas.microsoft.com/office/drawing/2016/5/14/chartex" xmlns:mc="http://schemas.openxmlformats.org/markup-compatibility/2006" xmlns:m="http://schemas.openxmlformats.org/officeDocument/2006/math" xmlns:aink="http://schemas.microsoft.com/office/drawing/2016/ink" xmlns:am3d="http://schemas.microsoft.com/office/drawing/2017/model3d" xmlns:oel="http://schemas.microsoft.com/office/2019/extlst" xmlns:r="http://schemas.openxmlformats.org/officeDocument/2006/relationships" xmlns:wp14="http://schemas.microsoft.com/office/word/2010/wordprocessingDrawing" xmlns:wp="http://schemas.openxmlformats.org/drawingml/2006/wordprocessingDrawing" xmlns:wpg="http://schemas.microsoft.com/office/word/2010/wordprocessingGroup" xmlns:wpi="http://schemas.microsoft.com/office/word/2010/wordprocessingInk" xmlns:wps="http://schemas.microsoft.com/office/word/2010/wordprocessingShape" xmlns:o="urn:schemas-microsoft-com:office:office" xmlns:v="urn:schemas-microsoft-com:vml" xmlns:w10="urn:schemas-microsoft-com:office:word" xmlns:w="http://schemas.openxmlformats.org/wordprocessingml/2006/main" xmlns:w14="http://schemas.microsoft.com/office/word/2010/wordml" xmlns:w15="http://schemas.microsoft.com/office/word/2012/wordml" xmlns:w16cex="http://schemas.microsoft.com/office/word/2018/wordml/cex" xmlns:w16cid="http://schemas.microsoft.com/office/word/2016/wordml/cid" xmlns:w16="http://schemas.microsoft.com/office/word/2018/wordml" xmlns:w16sdtdh="http://schemas.microsoft.com/office/word/2020/wordml/sdtdatahash" xmlns:w16sdtfl="http://schemas.microsoft.com/office/word/2024/wordml/sdtformatlock" xmlns:w16se="http://schemas.microsoft.com/office/word/2015/wordml/symex" xmlns:w16du="http://schemas.microsoft.com/office/word/2023/wordml/word16du" xmlns:wne="http://schemas.microsoft.com/office/word/2006/wordml" mc:Ignorable="w14 w15 w16se w16cid w16 w16cex w16sdtdh w16sdtfl w16du wp14">
   <w:docParts>
     <w:docPart>
       <w:docPartPr>
@@ -7356,7 +8599,7 @@
 </file>
 
 <file path=word/glossary/fontTable.xml><?xml version="1.0" encoding="utf-8"?>
-<w:fonts xmlns:mc="http://schemas.openxmlformats.org/markup-compatibility/2006" xmlns:r="http://schemas.openxmlformats.org/officeDocument/2006/relationships" xmlns:w="http://schemas.openxmlformats.org/wordprocessingml/2006/main" xmlns:w14="http://schemas.microsoft.com/office/word/2010/wordml" xmlns:w15="http://schemas.microsoft.com/office/word/2012/wordml" xmlns:w16cex="http://schemas.microsoft.com/office/word/2018/wordml/cex" xmlns:w16cid="http://schemas.microsoft.com/office/word/2016/wordml/cid" xmlns:w16="http://schemas.microsoft.com/office/word/2018/wordml" xmlns:w16du="http://schemas.microsoft.com/office/word/2023/wordml/word16du" xmlns:w16sdtdh="http://schemas.microsoft.com/office/word/2020/wordml/sdtdatahash" xmlns:w16sdtfl="http://schemas.microsoft.com/office/word/2024/wordml/sdtformatlock" xmlns:w16se="http://schemas.microsoft.com/office/word/2015/wordml/symex" mc:Ignorable="w14 w15 w16se w16cid w16 w16cex w16sdtdh w16sdtfl w16du">
+<w:fonts xmlns:mc="http://schemas.openxmlformats.org/markup-compatibility/2006" xmlns:r="http://schemas.openxmlformats.org/officeDocument/2006/relationships" xmlns:w="http://schemas.openxmlformats.org/wordprocessingml/2006/main" xmlns:w14="http://schemas.microsoft.com/office/word/2010/wordml" xmlns:w15="http://schemas.microsoft.com/office/word/2012/wordml" xmlns:w16cex="http://schemas.microsoft.com/office/word/2018/wordml/cex" xmlns:w16cid="http://schemas.microsoft.com/office/word/2016/wordml/cid" xmlns:w16="http://schemas.microsoft.com/office/word/2018/wordml" xmlns:w16sdtdh="http://schemas.microsoft.com/office/word/2020/wordml/sdtdatahash" xmlns:w16sdtfl="http://schemas.microsoft.com/office/word/2024/wordml/sdtformatlock" xmlns:w16se="http://schemas.microsoft.com/office/word/2015/wordml/symex" xmlns:w16du="http://schemas.microsoft.com/office/word/2023/wordml/word16du" mc:Ignorable="w14 w15 w16se w16cid w16 w16cex w16sdtdh w16sdtfl w16du">
   <w:font w:name="Symbol">
     <w:panose1 w:val="05050102010706020507"/>
     <w:charset w:val="02"/>
@@ -7432,7 +8675,7 @@
 </file>
 
 <file path=word/glossary/settings.xml><?xml version="1.0" encoding="utf-8"?>
-<w:settings xmlns:mc="http://schemas.openxmlformats.org/markup-compatibility/2006" xmlns:o="urn:schemas-microsoft-com:office:office" xmlns:r="http://schemas.openxmlformats.org/officeDocument/2006/relationships" xmlns:m="http://schemas.openxmlformats.org/officeDocument/2006/math" xmlns:v="urn:schemas-microsoft-com:vml" xmlns:w10="urn:schemas-microsoft-com:office:word" xmlns:w="http://schemas.openxmlformats.org/wordprocessingml/2006/main" xmlns:w14="http://schemas.microsoft.com/office/word/2010/wordml" xmlns:w15="http://schemas.microsoft.com/office/word/2012/wordml" xmlns:w16cex="http://schemas.microsoft.com/office/word/2018/wordml/cex" xmlns:w16cid="http://schemas.microsoft.com/office/word/2016/wordml/cid" xmlns:w16="http://schemas.microsoft.com/office/word/2018/wordml" xmlns:w16du="http://schemas.microsoft.com/office/word/2023/wordml/word16du" xmlns:w16sdtdh="http://schemas.microsoft.com/office/word/2020/wordml/sdtdatahash" xmlns:w16sdtfl="http://schemas.microsoft.com/office/word/2024/wordml/sdtformatlock" xmlns:w16se="http://schemas.microsoft.com/office/word/2015/wordml/symex" xmlns:sl="http://schemas.openxmlformats.org/schemaLibrary/2006/main" mc:Ignorable="w14 w15 w16se w16cid w16 w16cex w16sdtdh w16sdtfl w16du">
+<w:settings xmlns:mc="http://schemas.openxmlformats.org/markup-compatibility/2006" xmlns:m="http://schemas.openxmlformats.org/officeDocument/2006/math" xmlns:r="http://schemas.openxmlformats.org/officeDocument/2006/relationships" xmlns:sl="http://schemas.openxmlformats.org/schemaLibrary/2006/main" xmlns:o="urn:schemas-microsoft-com:office:office" xmlns:v="urn:schemas-microsoft-com:vml" xmlns:w10="urn:schemas-microsoft-com:office:word" xmlns:w="http://schemas.openxmlformats.org/wordprocessingml/2006/main" xmlns:w14="http://schemas.microsoft.com/office/word/2010/wordml" xmlns:w15="http://schemas.microsoft.com/office/word/2012/wordml" xmlns:w16cex="http://schemas.microsoft.com/office/word/2018/wordml/cex" xmlns:w16cid="http://schemas.microsoft.com/office/word/2016/wordml/cid" xmlns:w16="http://schemas.microsoft.com/office/word/2018/wordml" xmlns:w16sdtdh="http://schemas.microsoft.com/office/word/2020/wordml/sdtdatahash" xmlns:w16sdtfl="http://schemas.microsoft.com/office/word/2024/wordml/sdtformatlock" xmlns:w16se="http://schemas.microsoft.com/office/word/2015/wordml/symex" xmlns:w16du="http://schemas.microsoft.com/office/word/2023/wordml/word16du" mc:Ignorable="w14 w15 w16se w16cid w16 w16cex w16sdtdh w16sdtfl w16du">
   <w:view w:val="normal"/>
   <w:defaultTabStop w:val="720"/>
   <w:characterSpacingControl w:val="doNotCompress"/>
@@ -7448,10 +8691,12 @@
   <w:rsids>
     <w:rsidRoot w:val="002E3481"/>
     <w:rsid w:val="000634E3"/>
+    <w:rsid w:val="001B51CC"/>
     <w:rsid w:val="00235B96"/>
     <w:rsid w:val="00266BAB"/>
     <w:rsid w:val="00277525"/>
     <w:rsid w:val="002E3481"/>
+    <w:rsid w:val="002F4553"/>
     <w:rsid w:val="00300C11"/>
     <w:rsid w:val="00376212"/>
     <w:rsid w:val="00396093"/>
@@ -7459,9 +8704,11 @@
     <w:rsid w:val="00480526"/>
     <w:rsid w:val="004845D4"/>
     <w:rsid w:val="005248D9"/>
+    <w:rsid w:val="005272C1"/>
     <w:rsid w:val="00597FD0"/>
     <w:rsid w:val="005A1D2B"/>
     <w:rsid w:val="00690E31"/>
+    <w:rsid w:val="006C1676"/>
     <w:rsid w:val="006D7AC7"/>
     <w:rsid w:val="007071F5"/>
     <w:rsid w:val="00773B85"/>
@@ -7469,13 +8716,17 @@
     <w:rsid w:val="007A3068"/>
     <w:rsid w:val="00826915"/>
     <w:rsid w:val="00843A26"/>
+    <w:rsid w:val="00856F3A"/>
+    <w:rsid w:val="008829DB"/>
     <w:rsid w:val="008A4BF2"/>
     <w:rsid w:val="008B3007"/>
+    <w:rsid w:val="00904018"/>
     <w:rsid w:val="0091242C"/>
     <w:rsid w:val="009E669E"/>
     <w:rsid w:val="00B74EBA"/>
     <w:rsid w:val="00C6551D"/>
     <w:rsid w:val="00C66BB0"/>
+    <w:rsid w:val="00D23DB1"/>
     <w:rsid w:val="00D44B8C"/>
     <w:rsid w:val="00D75F52"/>
     <w:rsid w:val="00D835DE"/>
@@ -7507,7 +8758,7 @@
 </file>
 
 <file path=word/glossary/styles.xml><?xml version="1.0" encoding="utf-8"?>
-<w:styles xmlns:mc="http://schemas.openxmlformats.org/markup-compatibility/2006" xmlns:r="http://schemas.openxmlformats.org/officeDocument/2006/relationships" xmlns:w="http://schemas.openxmlformats.org/wordprocessingml/2006/main" xmlns:w14="http://schemas.microsoft.com/office/word/2010/wordml" xmlns:w15="http://schemas.microsoft.com/office/word/2012/wordml" xmlns:w16cex="http://schemas.microsoft.com/office/word/2018/wordml/cex" xmlns:w16cid="http://schemas.microsoft.com/office/word/2016/wordml/cid" xmlns:w16="http://schemas.microsoft.com/office/word/2018/wordml" xmlns:w16du="http://schemas.microsoft.com/office/word/2023/wordml/word16du" xmlns:w16sdtdh="http://schemas.microsoft.com/office/word/2020/wordml/sdtdatahash" xmlns:w16sdtfl="http://schemas.microsoft.com/office/word/2024/wordml/sdtformatlock" xmlns:w16se="http://schemas.microsoft.com/office/word/2015/wordml/symex" mc:Ignorable="w14 w15 w16se w16cid w16 w16cex w16sdtdh w16sdtfl w16du">
+<w:styles xmlns:mc="http://schemas.openxmlformats.org/markup-compatibility/2006" xmlns:r="http://schemas.openxmlformats.org/officeDocument/2006/relationships" xmlns:w="http://schemas.openxmlformats.org/wordprocessingml/2006/main" xmlns:w14="http://schemas.microsoft.com/office/word/2010/wordml" xmlns:w15="http://schemas.microsoft.com/office/word/2012/wordml" xmlns:w16cex="http://schemas.microsoft.com/office/word/2018/wordml/cex" xmlns:w16cid="http://schemas.microsoft.com/office/word/2016/wordml/cid" xmlns:w16="http://schemas.microsoft.com/office/word/2018/wordml" xmlns:w16sdtdh="http://schemas.microsoft.com/office/word/2020/wordml/sdtdatahash" xmlns:w16sdtfl="http://schemas.microsoft.com/office/word/2024/wordml/sdtformatlock" xmlns:w16se="http://schemas.microsoft.com/office/word/2015/wordml/symex" xmlns:w16du="http://schemas.microsoft.com/office/word/2023/wordml/word16du" mc:Ignorable="w14 w15 w16se w16cid w16 w16cex w16sdtdh w16sdtfl w16du">
   <w:docDefaults>
     <w:rPrDefault>
       <w:rPr>
@@ -7942,7 +9193,7 @@
 </file>
 
 <file path=word/glossary/webSettings.xml><?xml version="1.0" encoding="utf-8"?>
-<w:webSettings xmlns:mc="http://schemas.openxmlformats.org/markup-compatibility/2006" xmlns:r="http://schemas.openxmlformats.org/officeDocument/2006/relationships" xmlns:w="http://schemas.openxmlformats.org/wordprocessingml/2006/main" xmlns:w14="http://schemas.microsoft.com/office/word/2010/wordml" xmlns:w15="http://schemas.microsoft.com/office/word/2012/wordml" xmlns:w16cex="http://schemas.microsoft.com/office/word/2018/wordml/cex" xmlns:w16cid="http://schemas.microsoft.com/office/word/2016/wordml/cid" xmlns:w16="http://schemas.microsoft.com/office/word/2018/wordml" xmlns:w16du="http://schemas.microsoft.com/office/word/2023/wordml/word16du" xmlns:w16sdtdh="http://schemas.microsoft.com/office/word/2020/wordml/sdtdatahash" xmlns:w16sdtfl="http://schemas.microsoft.com/office/word/2024/wordml/sdtformatlock" xmlns:w16se="http://schemas.microsoft.com/office/word/2015/wordml/symex" mc:Ignorable="w14 w15 w16se w16cid w16 w16cex w16sdtdh w16sdtfl w16du">
+<w:webSettings xmlns:mc="http://schemas.openxmlformats.org/markup-compatibility/2006" xmlns:r="http://schemas.openxmlformats.org/officeDocument/2006/relationships" xmlns:w="http://schemas.openxmlformats.org/wordprocessingml/2006/main" xmlns:w14="http://schemas.microsoft.com/office/word/2010/wordml" xmlns:w15="http://schemas.microsoft.com/office/word/2012/wordml" xmlns:w16cex="http://schemas.microsoft.com/office/word/2018/wordml/cex" xmlns:w16cid="http://schemas.microsoft.com/office/word/2016/wordml/cid" xmlns:w16="http://schemas.microsoft.com/office/word/2018/wordml" xmlns:w16sdtdh="http://schemas.microsoft.com/office/word/2020/wordml/sdtdatahash" xmlns:w16sdtfl="http://schemas.microsoft.com/office/word/2024/wordml/sdtformatlock" xmlns:w16se="http://schemas.microsoft.com/office/word/2015/wordml/symex" xmlns:w16du="http://schemas.microsoft.com/office/word/2023/wordml/word16du" mc:Ignorable="w14 w15 w16se w16cid w16 w16cex w16sdtdh w16sdtfl w16du">
   <w:optimizeForBrowser/>
   <w:allowPNG/>
 </w:webSettings>

</xml_diff>

<commit_message>
Updated atime script to capture run summary and also just work on files + documentation update
</commit_message>
<xml_diff>
--- a/doc/development/HPCDATAMGM-2088 - External Archive Auto-Tiering.docx
+++ b/doc/development/HPCDATAMGM-2088 - External Archive Auto-Tiering.docx
@@ -4330,6 +4330,44 @@
         <w:autoSpaceDN w:val="0"/>
         <w:adjustRightInd w:val="0"/>
         <w:spacing w:after="0" w:line="240" w:lineRule="auto"/>
+        <w:ind w:left="720"/>
+        <w:rPr>
+          <w:rFonts w:ascii="Courier New" w:hAnsi="Courier New" w:cs="Courier New"/>
+          <w:color w:val="13939F"/>
+          <w:kern w:val="0"/>
+          <w:sz w:val="24"/>
+          <w:szCs w:val="24"/>
+        </w:rPr>
+      </w:pPr>
+    </w:p>
+    <w:p>
+      <w:pPr>
+        <w:ind w:left="720"/>
+      </w:pPr>
+      <w:r>
+        <w:t>A Python virtual environment needs to be created on the server running the script. The code includes a script that creates this environment – setup_venv.sh (it needs to be run once)</w:t>
+      </w:r>
+    </w:p>
+    <w:p>
+      <w:pPr>
+        <w:tabs>
+          <w:tab w:val="left" w:pos="560"/>
+          <w:tab w:val="left" w:pos="1120"/>
+          <w:tab w:val="left" w:pos="1680"/>
+          <w:tab w:val="left" w:pos="2240"/>
+          <w:tab w:val="left" w:pos="2800"/>
+          <w:tab w:val="left" w:pos="3360"/>
+          <w:tab w:val="left" w:pos="3920"/>
+          <w:tab w:val="left" w:pos="4480"/>
+          <w:tab w:val="left" w:pos="5040"/>
+          <w:tab w:val="left" w:pos="5600"/>
+          <w:tab w:val="left" w:pos="6160"/>
+          <w:tab w:val="left" w:pos="6720"/>
+        </w:tabs>
+        <w:autoSpaceDE w:val="0"/>
+        <w:autoSpaceDN w:val="0"/>
+        <w:adjustRightInd w:val="0"/>
+        <w:spacing w:after="0" w:line="240" w:lineRule="auto"/>
         <w:rPr>
           <w:rFonts w:ascii="Courier New" w:hAnsi="Courier New" w:cs="Courier New"/>
           <w:color w:val="13939F"/>
@@ -5515,6 +5553,7 @@
       </w:pPr>
       <w:bookmarkStart w:id="17" w:name="_Toc220160296"/>
       <w:r>
+        <w:lastRenderedPageBreak/>
         <w:t>User Interface</w:t>
       </w:r>
       <w:r>
@@ -5576,7 +5615,6 @@
       </w:pPr>
       <w:bookmarkStart w:id="22" w:name="_Toc220160301"/>
       <w:r>
-        <w:lastRenderedPageBreak/>
         <w:t>HPC_DATA_MANAGEMENT_CONFIGURATION</w:t>
       </w:r>
       <w:bookmarkEnd w:id="22"/>
@@ -6066,7 +6104,7 @@
             </wp:anchor>
           </w:drawing>
         </mc:Choice>
-        <mc:Fallback xmlns:a="http://schemas.openxmlformats.org/drawingml/2006/main" xmlns:arto="http://schemas.microsoft.com/office/word/2006/arto">
+        <mc:Fallback xmlns:arto="http://schemas.microsoft.com/office/word/2006/arto" xmlns:a="http://schemas.openxmlformats.org/drawingml/2006/main">
           <w:pict>
             <v:rect id="Rectangle 72" style="position:absolute;margin-left:0;margin-top:0;width:580.8pt;height:752.4pt;z-index:251661312;visibility:visible;mso-wrap-style:square;mso-width-percent:950;mso-height-percent:950;mso-wrap-distance-left:9pt;mso-wrap-distance-top:0;mso-wrap-distance-right:9pt;mso-wrap-distance-bottom:0;mso-position-horizontal:center;mso-position-horizontal-relative:page;mso-position-vertical:center;mso-position-vertical-relative:page;mso-width-percent:950;mso-height-percent:950;mso-width-relative:page;mso-height-relative:page;v-text-anchor:middle" o:spid="_x0000_s1026" filled="f" strokecolor="#938953 [1614]" strokeweight="1.25pt" w14:anchorId="5C3517D5" o:gfxdata="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">
               <w10:wrap anchorx="page" anchory="page"/>
@@ -8633,7 +8671,7 @@
     <w:charset w:val="00"/>
     <w:family w:val="roman"/>
     <w:pitch w:val="variable"/>
-    <w:sig w:usb0="E00002FF" w:usb1="400004FF" w:usb2="00000000" w:usb3="00000000" w:csb0="0000019F" w:csb1="00000000"/>
+    <w:sig w:usb0="E00006FF" w:usb1="420024FF" w:usb2="02000000" w:usb3="00000000" w:csb0="0000019F" w:csb1="00000000"/>
   </w:font>
   <w:font w:name="Calibri">
     <w:panose1 w:val="020F0502020204030204"/>
@@ -8647,7 +8685,7 @@
     <w:charset w:val="00"/>
     <w:family w:val="swiss"/>
     <w:pitch w:val="variable"/>
-    <w:sig w:usb0="E0002AFF" w:usb1="C0007843" w:usb2="00000009" w:usb3="00000000" w:csb0="000001FF" w:csb1="00000000"/>
+    <w:sig w:usb0="E0002EFF" w:usb1="C000785B" w:usb2="00000009" w:usb3="00000000" w:csb0="000001FF" w:csb1="00000000"/>
   </w:font>
   <w:font w:name="Courier-Bold">
     <w:altName w:val="Courier New"/>
@@ -8703,6 +8741,7 @@
     <w:rsid w:val="003E3252"/>
     <w:rsid w:val="00480526"/>
     <w:rsid w:val="004845D4"/>
+    <w:rsid w:val="00502E1C"/>
     <w:rsid w:val="005248D9"/>
     <w:rsid w:val="005272C1"/>
     <w:rsid w:val="00597FD0"/>
@@ -8726,6 +8765,7 @@
     <w:rsid w:val="00B74EBA"/>
     <w:rsid w:val="00C6551D"/>
     <w:rsid w:val="00C66BB0"/>
+    <w:rsid w:val="00C84D7F"/>
     <w:rsid w:val="00D23DB1"/>
     <w:rsid w:val="00D44B8C"/>
     <w:rsid w:val="00D75F52"/>

</xml_diff>